<commit_message>
Implementacion de roles, cifrado y politica de seguridad
</commit_message>
<xml_diff>
--- a/Cambios.docx
+++ b/Cambios.docx
@@ -31,7 +31,6 @@
           <w:color w:val="000000"/>
           <w:sz w:val="22"/>
           <w:szCs w:val="22"/>
-          <w:lang w:val="undefined" w:bidi="undefined"/>
         </w:rPr>
       </w:r>
       <w:r>
@@ -54,7 +53,6 @@
           <w:color w:val="000000"/>
           <w:sz w:val="22"/>
           <w:szCs w:val="22"/>
-          <w:lang w:val="undefined"/>
         </w:rPr>
         <w:t xml:space="preserve">e desarrolló el script maestro OrdenDeCreacion.sql para estructurar y documentar el despliegue de la base de datos desde cero. Al requerir el uso del Modo SQLCMD, este archivo automatiza la ejecución secuencial de los scripts individuales </w:t>
       </w:r>
@@ -66,7 +64,6 @@
           <w:color w:val="000000"/>
           <w:sz w:val="22"/>
           <w:szCs w:val="22"/>
-          <w:lang w:val="undefined"/>
         </w:rPr>
         <w:t xml:space="preserve">respetando la jerarquía de las dependencias </w:t>
       </w:r>
@@ -113,7 +110,6 @@
           <w:color w:val="000000"/>
           <w:sz w:val="22"/>
           <w:szCs w:val="22"/>
-          <w:lang w:val="undefined"/>
         </w:rPr>
         <w:t xml:space="preserve"> errores de referencias cruzadas.</w:t>
       </w:r>
@@ -125,7 +121,6 @@
           <w:color w:val="000000"/>
           <w:sz w:val="22"/>
           <w:szCs w:val="22"/>
-          <w:lang w:bidi="undefined"/>
         </w:rPr>
       </w:r>
       <w:r>
@@ -136,6 +131,7 @@
           <w:color w:val="000000"/>
           <w:sz w:val="22"/>
           <w:szCs w:val="22"/>
+          <w14:ligatures w14:val="none"/>
         </w:rPr>
       </w:r>
     </w:p>
@@ -238,7 +234,17 @@
           <w:szCs w:val="22"/>
         </w:rPr>
       </w:r>
-      <w:r/>
+      <w:r>
+        <w:rPr>
+          <w:rFonts w:ascii="Calibri" w:hAnsi="Calibri" w:eastAsia="Calibri" w:cs="Calibri"/>
+          <w:b w:val="0"/>
+          <w:bCs w:val="0"/>
+          <w:color w:val="000000"/>
+          <w:sz w:val="22"/>
+          <w:szCs w:val="22"/>
+          <w14:ligatures w14:val="none"/>
+        </w:rPr>
+      </w:r>
     </w:p>
     <w:p>
       <w:pPr>
@@ -281,15 +287,6 @@
           <w:szCs w:val="22"/>
         </w:rPr>
         <w:t xml:space="preserve">Se agregó el campo HoraInicio a la clave primaria, quedando PRIMARY KEY(Actividad,</w:t>
-      </w:r>
-      <w:r>
-        <w:rPr>
-          <w:rFonts w:ascii="Calibri" w:hAnsi="Calibri" w:cs="Calibri"/>
-          <w:b w:val="0"/>
-          <w:bCs w:val="0"/>
-          <w:sz w:val="22"/>
-          <w:szCs w:val="22"/>
-        </w:rPr>
       </w:r>
       <w:r>
         <w:rPr>
@@ -396,14 +393,14 @@
       </w:r>
       <w:r>
         <w:rPr>
-          <w:rFonts w:ascii="Calibri" w:hAnsi="Calibri" w:cs="Calibri"/>
+          <w:rFonts w:ascii="Calibri" w:hAnsi="Calibri" w:eastAsia="Calibri" w:cs="Calibri"/>
           <w:b w:val="0"/>
           <w:bCs w:val="0"/>
+          <w:color w:val="000000"/>
           <w:sz w:val="22"/>
           <w:szCs w:val="22"/>
         </w:rPr>
       </w:r>
-      <w:r/>
       <w:r>
         <w:rPr>
           <w:rFonts w:ascii="Calibri" w:hAnsi="Calibri" w:eastAsia="Calibri" w:cs="Calibri"/>
@@ -412,6 +409,7 @@
           <w:color w:val="000000"/>
           <w:sz w:val="22"/>
           <w:szCs w:val="22"/>
+          <w:highlight w:val="none"/>
         </w:rPr>
       </w:r>
     </w:p>
@@ -458,6 +456,15 @@
       <w:r>
         <w:rPr>
           <w:rFonts w:ascii="Calibri" w:hAnsi="Calibri" w:eastAsia="Calibri" w:cs="Calibri"/>
+          <w:b w:val="0"/>
+          <w:bCs w:val="0"/>
+          <w:sz w:val="22"/>
+          <w:szCs w:val="22"/>
+        </w:rPr>
+      </w:r>
+      <w:r>
+        <w:rPr>
+          <w:rFonts w:ascii="Calibri" w:hAnsi="Calibri" w:cs="Calibri"/>
           <w:b w:val="0"/>
           <w:bCs w:val="0"/>
           <w:sz w:val="22"/>
@@ -548,44 +555,6 @@
           <w:bCs w:val="0"/>
           <w:sz w:val="22"/>
           <w:szCs w:val="22"/>
-        </w:rPr>
-      </w:r>
-      <w:r>
-        <w:rPr>
-          <w:rFonts w:ascii="Calibri" w:hAnsi="Calibri" w:cs="Calibri"/>
-          <w:b w:val="0"/>
-          <w:bCs w:val="0"/>
-          <w:sz w:val="22"/>
-          <w:szCs w:val="22"/>
-        </w:rPr>
-      </w:r>
-      <w:r>
-        <w:rPr>
-          <w:rFonts w:ascii="Calibri" w:hAnsi="Calibri" w:eastAsia="Calibri" w:cs="Calibri"/>
-          <w:b w:val="0"/>
-          <w:bCs w:val="0"/>
-          <w:sz w:val="22"/>
-          <w:szCs w:val="22"/>
-          <w:highlight w:val="none"/>
-        </w:rPr>
-      </w:r>
-      <w:r>
-        <w:rPr>
-          <w:rFonts w:ascii="Calibri" w:hAnsi="Calibri" w:eastAsia="Calibri" w:cs="Calibri"/>
-          <w:b w:val="0"/>
-          <w:bCs w:val="0"/>
-          <w:sz w:val="22"/>
-          <w:szCs w:val="22"/>
-          <w:highlight w:val="none"/>
-        </w:rPr>
-      </w:r>
-      <w:r>
-        <w:rPr>
-          <w:rFonts w:ascii="Calibri" w:hAnsi="Calibri" w:eastAsia="Calibri" w:cs="Calibri"/>
-          <w:b w:val="0"/>
-          <w:bCs w:val="0"/>
-          <w:sz w:val="22"/>
-          <w:szCs w:val="22"/>
           <w:highlight w:val="none"/>
         </w:rPr>
       </w:r>
@@ -673,28 +642,6 @@
           <w:highlight w:val="none"/>
           <w:lang w:val="es-AR"/>
         </w:rPr>
-      </w:r>
-      <w:r>
-        <w:rPr>
-          <w:rFonts w:ascii="Calibri" w:hAnsi="Calibri" w:eastAsia="Calibri" w:cs="Calibri"/>
-          <w:b w:val="0"/>
-          <w:bCs w:val="0"/>
-          <w:sz w:val="22"/>
-          <w:szCs w:val="22"/>
-          <w:highlight w:val="none"/>
-          <w:lang w:val="es-AR"/>
-        </w:rPr>
-      </w:r>
-      <w:r>
-        <w:rPr>
-          <w:rFonts w:ascii="Calibri" w:hAnsi="Calibri" w:eastAsia="Calibri" w:cs="Calibri"/>
-          <w:b w:val="0"/>
-          <w:bCs w:val="0"/>
-          <w:sz w:val="22"/>
-          <w:szCs w:val="22"/>
-          <w:highlight w:val="none"/>
-          <w:lang w:val="es-AR"/>
-        </w:rPr>
         <w:t xml:space="preserve">desasignarEspecialidad, </w:t>
       </w:r>
       <w:r>
@@ -707,95 +654,7 @@
           <w:highlight w:val="none"/>
           <w:lang w:val="es-AR"/>
         </w:rPr>
-      </w:r>
-      <w:r>
-        <w:rPr>
-          <w:rFonts w:ascii="Calibri" w:hAnsi="Calibri" w:eastAsia="Calibri" w:cs="Calibri"/>
-          <w:b w:val="0"/>
-          <w:bCs w:val="0"/>
-          <w:sz w:val="22"/>
-          <w:szCs w:val="22"/>
-          <w:highlight w:val="none"/>
-          <w:lang w:val="es-AR"/>
-        </w:rPr>
-      </w:r>
-      <w:r>
-        <w:rPr>
-          <w:rFonts w:ascii="Calibri" w:hAnsi="Calibri" w:eastAsia="Calibri" w:cs="Calibri"/>
-          <w:b w:val="0"/>
-          <w:bCs w:val="0"/>
-          <w:sz w:val="22"/>
-          <w:szCs w:val="22"/>
-          <w:highlight w:val="none"/>
-          <w:lang w:val="es-AR"/>
-        </w:rPr>
-      </w:r>
-      <w:r>
-        <w:rPr>
-          <w:rFonts w:ascii="Calibri" w:hAnsi="Calibri" w:eastAsia="Calibri" w:cs="Calibri"/>
-          <w:b w:val="0"/>
-          <w:bCs w:val="0"/>
-          <w:sz w:val="22"/>
-          <w:szCs w:val="22"/>
-          <w:highlight w:val="none"/>
-          <w:lang w:val="es-AR"/>
-        </w:rPr>
-      </w:r>
-      <w:r>
-        <w:rPr>
-          <w:rFonts w:ascii="Calibri" w:hAnsi="Calibri" w:eastAsia="Calibri" w:cs="Calibri"/>
-          <w:b w:val="0"/>
-          <w:bCs w:val="0"/>
-          <w:sz w:val="22"/>
-          <w:szCs w:val="22"/>
-          <w:highlight w:val="none"/>
-          <w:lang w:val="es-AR"/>
-        </w:rPr>
         <w:t xml:space="preserve">desasignarEspecialidades y </w:t>
-      </w:r>
-      <w:r>
-        <w:rPr>
-          <w:rFonts w:ascii="Calibri" w:hAnsi="Calibri" w:eastAsia="Calibri" w:cs="Calibri"/>
-          <w:b w:val="0"/>
-          <w:bCs w:val="0"/>
-          <w:sz w:val="22"/>
-          <w:szCs w:val="22"/>
-          <w:highlight w:val="none"/>
-          <w:lang w:val="es-AR"/>
-        </w:rPr>
-      </w:r>
-      <w:r>
-        <w:rPr>
-          <w:rFonts w:ascii="Calibri" w:hAnsi="Calibri" w:eastAsia="Calibri" w:cs="Calibri"/>
-          <w:b w:val="0"/>
-          <w:bCs w:val="0"/>
-          <w:sz w:val="22"/>
-          <w:szCs w:val="22"/>
-          <w:highlight w:val="none"/>
-          <w:lang w:val="es-AR"/>
-        </w:rPr>
-      </w:r>
-      <w:r>
-        <w:rPr>
-          <w:rFonts w:ascii="Calibri" w:hAnsi="Calibri" w:eastAsia="Calibri" w:cs="Calibri"/>
-          <w:b w:val="0"/>
-          <w:bCs w:val="0"/>
-          <w:sz w:val="22"/>
-          <w:szCs w:val="22"/>
-          <w:highlight w:val="none"/>
-          <w:lang w:val="es-AR"/>
-        </w:rPr>
-      </w:r>
-      <w:r>
-        <w:rPr>
-          <w:rFonts w:ascii="Calibri" w:hAnsi="Calibri" w:eastAsia="Calibri" w:cs="Calibri"/>
-          <w:b w:val="0"/>
-          <w:bCs w:val="0"/>
-          <w:sz w:val="22"/>
-          <w:szCs w:val="22"/>
-          <w:highlight w:val="none"/>
-          <w:lang w:val="es-AR"/>
-        </w:rPr>
       </w:r>
       <w:r>
         <w:rPr>
@@ -822,35 +681,7 @@
       </w:r>
       <w:r>
         <w:rPr>
-          <w:rFonts w:ascii="Calibri" w:hAnsi="Calibri" w:eastAsia="Calibri" w:cs="Calibri"/>
-          <w:b w:val="0"/>
-          <w:bCs w:val="0"/>
-          <w:sz w:val="22"/>
-          <w:szCs w:val="22"/>
           <w:highlight w:val="none"/>
-          <w:lang w:val="es-AR"/>
-        </w:rPr>
-      </w:r>
-      <w:r>
-        <w:rPr>
-          <w:rFonts w:ascii="Calibri" w:hAnsi="Calibri" w:eastAsia="Calibri" w:cs="Calibri"/>
-          <w:b w:val="0"/>
-          <w:bCs w:val="0"/>
-          <w:sz w:val="22"/>
-          <w:szCs w:val="22"/>
-          <w:highlight w:val="none"/>
-        </w:rPr>
-      </w:r>
-      <w:r/>
-      <w:r>
-        <w:rPr>
-          <w:rFonts w:ascii="Calibri" w:hAnsi="Calibri" w:eastAsia="Calibri" w:cs="Calibri"/>
-          <w:b w:val="0"/>
-          <w:bCs w:val="0"/>
-          <w:sz w:val="22"/>
-          <w:szCs w:val="22"/>
-          <w:highlight w:val="none"/>
-          <w:lang w:val="es-AR"/>
         </w:rPr>
       </w:r>
     </w:p>
@@ -1068,6 +899,12 @@
           <w:lang w:val="es-AR"/>
         </w:rPr>
       </w:r>
+      <w:r>
+        <w:rPr>
+          <w:highlight w:val="none"/>
+          <w:lang w:val="es-AR" w:bidi="es-AR"/>
+        </w:rPr>
+      </w:r>
     </w:p>
     <w:p>
       <w:pPr>
@@ -1105,14 +942,19 @@
       </w:r>
       <w:r>
         <w:rPr>
+          <w:rFonts w:ascii="Calibri" w:hAnsi="Calibri" w:eastAsia="Calibri" w:cs="Calibri"/>
+          <w:b w:val="0"/>
+          <w:bCs w:val="0"/>
+          <w:sz w:val="22"/>
+          <w:szCs w:val="22"/>
           <w:highlight w:val="none"/>
-          <w:lang w:val="es-AR" w:bidi="es-AR"/>
+          <w:lang w:val="es-AR"/>
         </w:rPr>
       </w:r>
     </w:p>
     <w:p>
       <w:pPr>
-        <w:pStyle w:val="141"/>
+        <w:pStyle w:val="833"/>
         <w:pBdr>
           <w:top w:val="none" w:color="000000" w:sz="4" w:space="0"/>
           <w:left w:val="none" w:color="000000" w:sz="4" w:space="0"/>
@@ -1143,6 +985,15 @@
       <w:r>
         <w:rPr>
           <w:rFonts w:ascii="Calibri" w:hAnsi="Calibri" w:eastAsia="Calibri" w:cs="Calibri"/>
+          <w:b/>
+          <w:bCs/>
+          <w:sz w:val="24"/>
+          <w:szCs w:val="24"/>
+        </w:rPr>
+      </w:r>
+      <w:r>
+        <w:rPr>
+          <w:rFonts w:ascii="Calibri" w:hAnsi="Calibri" w:cs="Calibri"/>
           <w:b/>
           <w:bCs/>
           <w:sz w:val="24"/>
@@ -1211,10 +1062,19 @@
           <w:szCs w:val="22"/>
         </w:rPr>
       </w:r>
+      <w:r>
+        <w:rPr>
+          <w:rFonts w:ascii="Calibri" w:hAnsi="Calibri" w:cs="Calibri"/>
+          <w:b w:val="0"/>
+          <w:bCs w:val="0"/>
+          <w:sz w:val="22"/>
+          <w:szCs w:val="22"/>
+        </w:rPr>
+      </w:r>
     </w:p>
     <w:p>
       <w:pPr>
-        <w:pStyle w:val="668"/>
+        <w:pStyle w:val="894"/>
         <w:numPr>
           <w:ilvl w:val="0"/>
           <w:numId w:val="2"/>
@@ -1375,53 +1235,11 @@
       </w:r>
       <w:r>
         <w:rPr>
-          <w:rFonts w:ascii="Calibri" w:hAnsi="Calibri" w:eastAsia="Calibri" w:cs="Calibri"/>
-          <w:b w:val="0"/>
-          <w:bCs w:val="0"/>
-          <w:sz w:val="22"/>
-          <w:szCs w:val="22"/>
-        </w:rPr>
-      </w:r>
-      <w:r>
-        <w:rPr>
           <w:rFonts w:ascii="Calibri" w:hAnsi="Calibri" w:cs="Calibri"/>
           <w:b w:val="0"/>
           <w:bCs w:val="0"/>
           <w:sz w:val="22"/>
           <w:szCs w:val="22"/>
-        </w:rPr>
-      </w:r>
-      <w:r>
-        <w:rPr>
-          <w:rFonts w:ascii="Calibri" w:hAnsi="Calibri" w:eastAsia="Calibri" w:cs="Calibri"/>
-          <w:b w:val="0"/>
-          <w:bCs w:val="0"/>
-          <w:color w:val="000000"/>
-          <w:sz w:val="22"/>
-          <w:szCs w:val="22"/>
-          <w:highlight w:val="none"/>
-        </w:rPr>
-      </w:r>
-      <w:r>
-        <w:rPr>
-          <w:rFonts w:ascii="Calibri" w:hAnsi="Calibri" w:eastAsia="Calibri" w:cs="Calibri"/>
-          <w:b w:val="0"/>
-          <w:bCs w:val="0"/>
-          <w:color w:val="000000"/>
-          <w:sz w:val="22"/>
-          <w:szCs w:val="22"/>
-          <w:highlight w:val="none"/>
-        </w:rPr>
-      </w:r>
-      <w:r>
-        <w:rPr>
-          <w:rFonts w:ascii="Calibri" w:hAnsi="Calibri" w:eastAsia="Calibri" w:cs="Calibri"/>
-          <w:b w:val="0"/>
-          <w:bCs w:val="0"/>
-          <w:color w:val="000000"/>
-          <w:sz w:val="22"/>
-          <w:szCs w:val="22"/>
-          <w:highlight w:val="none"/>
         </w:rPr>
       </w:r>
       <w:r>
@@ -1474,10 +1292,21 @@
           <w:szCs w:val="22"/>
         </w:rPr>
       </w:r>
+      <w:r>
+        <w:rPr>
+          <w:rFonts w:ascii="Calibri" w:hAnsi="Calibri" w:eastAsia="Calibri" w:cs="Calibri"/>
+          <w:b/>
+          <w:bCs/>
+          <w:color w:val="000000"/>
+          <w:sz w:val="22"/>
+          <w:szCs w:val="22"/>
+          <w:highlight w:val="none"/>
+        </w:rPr>
+      </w:r>
     </w:p>
     <w:p>
       <w:pPr>
-        <w:pStyle w:val="668"/>
+        <w:pStyle w:val="894"/>
         <w:numPr>
           <w:ilvl w:val="0"/>
           <w:numId w:val="2"/>
@@ -1636,7 +1465,7 @@
       </w:r>
       <w:r>
         <w:rPr>
-          <w:rFonts w:ascii="Calibri" w:hAnsi="Calibri" w:eastAsia="Calibri" w:cs="Calibri"/>
+          <w:rFonts w:ascii="Calibri" w:hAnsi="Calibri" w:cs="Calibri"/>
           <w:b w:val="0"/>
           <w:bCs w:val="0"/>
           <w:sz w:val="22"/>
@@ -1652,6 +1481,181 @@
           <w:szCs w:val="22"/>
         </w:rPr>
       </w:r>
+    </w:p>
+    <w:p>
+      <w:pPr>
+        <w:pBdr/>
+        <w:shd w:val="nil" w:color="000000"/>
+        <w:spacing/>
+        <w:ind/>
+        <w:rPr>
+          <w:rFonts w:ascii="Calibri" w:hAnsi="Calibri" w:cs="Calibri"/>
+          <w:b w:val="0"/>
+          <w:bCs w:val="0"/>
+          <w:sz w:val="22"/>
+          <w:szCs w:val="22"/>
+        </w:rPr>
+      </w:pPr>
+      <w:r>
+        <w:rPr>
+          <w:rFonts w:ascii="Calibri" w:hAnsi="Calibri" w:cs="Calibri"/>
+          <w:b w:val="0"/>
+          <w:bCs w:val="0"/>
+          <w:sz w:val="22"/>
+          <w:szCs w:val="22"/>
+        </w:rPr>
+      </w:r>
+      <w:r>
+        <w:rPr>
+          <w:rFonts w:ascii="Calibri" w:hAnsi="Calibri" w:cs="Calibri"/>
+          <w:b w:val="0"/>
+          <w:bCs w:val="0"/>
+          <w:sz w:val="22"/>
+          <w:szCs w:val="22"/>
+        </w:rPr>
+      </w:r>
+      <w:r>
+        <w:rPr>
+          <w:rFonts w:ascii="Calibri" w:hAnsi="Calibri" w:cs="Calibri"/>
+          <w:b w:val="0"/>
+          <w:bCs w:val="0"/>
+          <w:sz w:val="22"/>
+          <w:szCs w:val="22"/>
+        </w:rPr>
+      </w:r>
+    </w:p>
+    <w:p>
+      <w:pPr>
+        <w:pBdr/>
+        <w:shd w:val="nil"/>
+        <w:spacing/>
+        <w:ind/>
+        <w:rPr>
+          <w:rFonts w:ascii="Calibri" w:hAnsi="Calibri" w:cs="Calibri"/>
+          <w:b w:val="0"/>
+          <w:bCs w:val="0"/>
+          <w:sz w:val="22"/>
+          <w:szCs w:val="22"/>
+          <w:lang w:val="es-AR"/>
+        </w:rPr>
+      </w:pPr>
+      <w:r>
+        <w:rPr>
+          <w:rFonts w:ascii="Calibri" w:hAnsi="Calibri" w:cs="Calibri"/>
+          <w:b w:val="0"/>
+          <w:bCs w:val="0"/>
+          <w:sz w:val="22"/>
+          <w:szCs w:val="22"/>
+          <w:lang w:val="es-AR"/>
+        </w:rPr>
+        <w:t xml:space="preserve">Modificacion 22/06/2026: </w:t>
+      </w:r>
+      <w:r>
+        <w:rPr>
+          <w:rFonts w:ascii="Calibri" w:hAnsi="Calibri" w:cs="Calibri"/>
+          <w:b w:val="0"/>
+          <w:bCs w:val="0"/>
+          <w:sz w:val="22"/>
+          <w:szCs w:val="22"/>
+        </w:rPr>
+      </w:r>
+    </w:p>
+    <w:p>
+      <w:pPr>
+        <w:pBdr/>
+        <w:shd w:val="nil" w:color="000000"/>
+        <w:spacing/>
+        <w:ind w:firstLine="0"/>
+        <w:rPr>
+          <w:rFonts w:ascii="Calibri" w:hAnsi="Calibri" w:cs="Calibri"/>
+          <w:b w:val="0"/>
+          <w:bCs w:val="0"/>
+          <w:sz w:val="22"/>
+          <w:szCs w:val="22"/>
+        </w:rPr>
+      </w:pPr>
+      <w:r>
+        <w:rPr>
+          <w:rFonts w:ascii="Calibri" w:hAnsi="Calibri" w:cs="Calibri"/>
+          <w:b w:val="0"/>
+          <w:bCs w:val="0"/>
+          <w:sz w:val="22"/>
+          <w:szCs w:val="22"/>
+          <w:lang w:val="es-AR"/>
+        </w:rPr>
+        <w:t xml:space="preserve">Implementacion del cifrado, roles y politica de seguridad. Imlementacion de </w:t>
+      </w:r>
+      <w:r>
+        <w:rPr>
+          <w:rFonts w:ascii="Cascadia Mono" w:hAnsi="Cascadia Mono" w:eastAsia="Cascadia Mono" w:cs="Cascadia Mono"/>
+          <w:color w:val="0000ff"/>
+          <w:sz w:val="18"/>
+        </w:rPr>
+        <w:t xml:space="preserve">constraint</w:t>
+      </w:r>
+      <w:r>
+        <w:rPr>
+          <w:rFonts w:ascii="Cascadia Mono" w:hAnsi="Cascadia Mono" w:eastAsia="Cascadia Mono" w:cs="Cascadia Mono"/>
+          <w:color w:val="000000"/>
+          <w:sz w:val="18"/>
+        </w:rPr>
+        <w:t xml:space="preserve"> UQ_Persona_DNI</w:t>
+      </w:r>
+      <w:r>
+        <w:rPr>
+          <w:rFonts w:ascii="Calibri" w:hAnsi="Calibri" w:cs="Calibri"/>
+          <w:b w:val="0"/>
+          <w:bCs w:val="0"/>
+          <w:sz w:val="22"/>
+          <w:szCs w:val="22"/>
+          <w:lang w:val="es-AR"/>
+        </w:rPr>
+        <w:t xml:space="preserve"> en tabla persona para que los </w:t>
+      </w:r>
+      <w:r>
+        <w:rPr>
+          <w:rFonts w:ascii="Calibri" w:hAnsi="Calibri" w:cs="Calibri"/>
+          <w:b w:val="0"/>
+          <w:bCs w:val="0"/>
+          <w:sz w:val="22"/>
+          <w:szCs w:val="22"/>
+          <w:lang w:val="es-AR"/>
+        </w:rPr>
+        <w:t xml:space="preserve">scripts de migración funcionen correctamente</w:t>
+      </w:r>
+      <w:r>
+        <w:rPr>
+          <w:rFonts w:ascii="Calibri" w:hAnsi="Calibri" w:cs="Calibri"/>
+          <w:b w:val="0"/>
+          <w:bCs w:val="0"/>
+          <w:sz w:val="22"/>
+          <w:szCs w:val="22"/>
+          <w:lang w:val="es-AR"/>
+        </w:rPr>
+        <w:t xml:space="preserve">, sin esto SQL Server genera uno aleatorio cada que se corre el create y </w:t>
+      </w:r>
+      <w:r>
+        <w:rPr>
+          <w:rFonts w:ascii="Calibri" w:hAnsi="Calibri" w:cs="Calibri"/>
+          <w:b w:val="0"/>
+          <w:bCs w:val="0"/>
+          <w:sz w:val="22"/>
+          <w:szCs w:val="22"/>
+          <w:lang w:val="es-AR"/>
+        </w:rPr>
+        <w:t xml:space="preserve">el script de cifrado fallaria al intentar buscar una restricción que ya no se llama igual.</w:t>
+      </w:r>
+      <w:r>
+        <w:rPr>
+          <w:rFonts w:ascii="Calibri" w:hAnsi="Calibri" w:cs="Calibri"/>
+          <w:b w:val="0"/>
+          <w:bCs w:val="0"/>
+          <w:sz w:val="22"/>
+          <w:szCs w:val="22"/>
+          <w:lang w:val="es-AR"/>
+        </w:rPr>
+      </w:r>
+      <w:r/>
     </w:p>
     <w:p>
       <w:pPr>
@@ -1685,7 +1689,6 @@
         <w:ind/>
         <w:rPr/>
       </w:pPr>
-      <w:r/>
       <w:r>
         <w:separator/>
       </w:r>
@@ -1700,7 +1703,6 @@
         <w:ind/>
         <w:rPr/>
       </w:pPr>
-      <w:r/>
       <w:r>
         <w:continuationSeparator/>
       </w:r>
@@ -1720,7 +1722,6 @@
         <w:ind/>
         <w:rPr/>
       </w:pPr>
-      <w:r/>
       <w:r>
         <w:separator/>
       </w:r>
@@ -1735,7 +1736,6 @@
         <w:ind/>
         <w:rPr/>
       </w:pPr>
-      <w:r/>
       <w:r>
         <w:continuationSeparator/>
       </w:r>
@@ -2208,9 +2208,9 @@
     <w:lsdException w:name="Bibliography" w:uiPriority="37"/>
     <w:lsdException w:name="TOC Heading" w:uiPriority="39" w:qFormat="1"/>
   </w:latentStyles>
-  <w:style w:type="table" w:styleId="12">
+  <w:style w:type="table" w:styleId="705">
     <w:name w:val="Table Grid"/>
-    <w:basedOn w:val="665"/>
+    <w:basedOn w:val="891"/>
     <w:uiPriority w:val="59"/>
     <w:pPr>
       <w:pBdr/>
@@ -2407,9 +2407,9 @@
       </w:tcPr>
     </w:tblStylePr>
   </w:style>
-  <w:style w:type="table" w:styleId="13">
+  <w:style w:type="table" w:styleId="706">
     <w:name w:val="Table Grid Light"/>
-    <w:basedOn w:val="665"/>
+    <w:basedOn w:val="891"/>
     <w:uiPriority w:val="59"/>
     <w:pPr>
       <w:pBdr/>
@@ -2606,9 +2606,9 @@
       </w:tcPr>
     </w:tblStylePr>
   </w:style>
-  <w:style w:type="table" w:styleId="14">
+  <w:style w:type="table" w:styleId="707">
     <w:name w:val="Plain Table 1"/>
-    <w:basedOn w:val="665"/>
+    <w:basedOn w:val="891"/>
     <w:uiPriority w:val="59"/>
     <w:pPr>
       <w:pBdr/>
@@ -2831,9 +2831,9 @@
       </w:tcPr>
     </w:tblStylePr>
   </w:style>
-  <w:style w:type="table" w:styleId="15">
+  <w:style w:type="table" w:styleId="708">
     <w:name w:val="Plain Table 2"/>
-    <w:basedOn w:val="665"/>
+    <w:basedOn w:val="891"/>
     <w:uiPriority w:val="59"/>
     <w:pPr>
       <w:pBdr/>
@@ -3064,9 +3064,9 @@
       </w:tcPr>
     </w:tblStylePr>
   </w:style>
-  <w:style w:type="table" w:styleId="16">
+  <w:style w:type="table" w:styleId="709">
     <w:name w:val="Plain Table 3"/>
-    <w:basedOn w:val="665"/>
+    <w:basedOn w:val="891"/>
     <w:uiPriority w:val="99"/>
     <w:pPr>
       <w:pBdr/>
@@ -3294,9 +3294,9 @@
       </w:tcPr>
     </w:tblStylePr>
   </w:style>
-  <w:style w:type="table" w:styleId="17">
+  <w:style w:type="table" w:styleId="710">
     <w:name w:val="Plain Table 4"/>
-    <w:basedOn w:val="665"/>
+    <w:basedOn w:val="891"/>
     <w:uiPriority w:val="99"/>
     <w:pPr>
       <w:pBdr/>
@@ -3510,9 +3510,9 @@
       </w:tcPr>
     </w:tblStylePr>
   </w:style>
-  <w:style w:type="table" w:styleId="18">
+  <w:style w:type="table" w:styleId="711">
     <w:name w:val="Plain Table 5"/>
-    <w:basedOn w:val="665"/>
+    <w:basedOn w:val="891"/>
     <w:uiPriority w:val="99"/>
     <w:pPr>
       <w:pBdr/>
@@ -3743,9 +3743,9 @@
       </w:tcPr>
     </w:tblStylePr>
   </w:style>
-  <w:style w:type="table" w:styleId="19">
+  <w:style w:type="table" w:styleId="712">
     <w:name w:val="Grid Table 1 Light"/>
-    <w:basedOn w:val="665"/>
+    <w:basedOn w:val="891"/>
     <w:uiPriority w:val="99"/>
     <w:pPr>
       <w:pBdr/>
@@ -3966,9 +3966,9 @@
       </w:tcPr>
     </w:tblStylePr>
   </w:style>
-  <w:style w:type="table" w:styleId="20">
+  <w:style w:type="table" w:styleId="713">
     <w:name w:val="Grid Table 1 Light - Accent 1"/>
-    <w:basedOn w:val="665"/>
+    <w:basedOn w:val="891"/>
     <w:uiPriority w:val="99"/>
     <w:pPr>
       <w:pBdr/>
@@ -4189,9 +4189,9 @@
       </w:tcPr>
     </w:tblStylePr>
   </w:style>
-  <w:style w:type="table" w:styleId="21">
+  <w:style w:type="table" w:styleId="714">
     <w:name w:val="Grid Table 1 Light - Accent 2"/>
-    <w:basedOn w:val="665"/>
+    <w:basedOn w:val="891"/>
     <w:uiPriority w:val="99"/>
     <w:pPr>
       <w:pBdr/>
@@ -4412,9 +4412,9 @@
       </w:tcPr>
     </w:tblStylePr>
   </w:style>
-  <w:style w:type="table" w:styleId="22">
+  <w:style w:type="table" w:styleId="715">
     <w:name w:val="Grid Table 1 Light - Accent 3"/>
-    <w:basedOn w:val="665"/>
+    <w:basedOn w:val="891"/>
     <w:uiPriority w:val="99"/>
     <w:pPr>
       <w:pBdr/>
@@ -4635,9 +4635,9 @@
       </w:tcPr>
     </w:tblStylePr>
   </w:style>
-  <w:style w:type="table" w:styleId="23">
+  <w:style w:type="table" w:styleId="716">
     <w:name w:val="Grid Table 1 Light - Accent 4"/>
-    <w:basedOn w:val="665"/>
+    <w:basedOn w:val="891"/>
     <w:uiPriority w:val="99"/>
     <w:pPr>
       <w:pBdr/>
@@ -4858,9 +4858,9 @@
       </w:tcPr>
     </w:tblStylePr>
   </w:style>
-  <w:style w:type="table" w:styleId="24">
+  <w:style w:type="table" w:styleId="717">
     <w:name w:val="Grid Table 1 Light - Accent 5"/>
-    <w:basedOn w:val="665"/>
+    <w:basedOn w:val="891"/>
     <w:uiPriority w:val="99"/>
     <w:pPr>
       <w:pBdr/>
@@ -5081,9 +5081,9 @@
       </w:tcPr>
     </w:tblStylePr>
   </w:style>
-  <w:style w:type="table" w:styleId="25">
+  <w:style w:type="table" w:styleId="718">
     <w:name w:val="Grid Table 1 Light - Accent 6"/>
-    <w:basedOn w:val="665"/>
+    <w:basedOn w:val="891"/>
     <w:uiPriority w:val="99"/>
     <w:pPr>
       <w:pBdr/>
@@ -5304,9 +5304,9 @@
       </w:tcPr>
     </w:tblStylePr>
   </w:style>
-  <w:style w:type="table" w:styleId="26">
+  <w:style w:type="table" w:styleId="719">
     <w:name w:val="Grid Table 2"/>
-    <w:basedOn w:val="665"/>
+    <w:basedOn w:val="891"/>
     <w:uiPriority w:val="99"/>
     <w:pPr>
       <w:pBdr/>
@@ -5536,9 +5536,9 @@
       </w:tcPr>
     </w:tblStylePr>
   </w:style>
-  <w:style w:type="table" w:styleId="27">
+  <w:style w:type="table" w:styleId="720">
     <w:name w:val="Grid Table 2 - Accent 1"/>
-    <w:basedOn w:val="665"/>
+    <w:basedOn w:val="891"/>
     <w:uiPriority w:val="99"/>
     <w:pPr>
       <w:pBdr/>
@@ -5768,9 +5768,9 @@
       </w:tcPr>
     </w:tblStylePr>
   </w:style>
-  <w:style w:type="table" w:styleId="28">
+  <w:style w:type="table" w:styleId="721">
     <w:name w:val="Grid Table 2 - Accent 2"/>
-    <w:basedOn w:val="665"/>
+    <w:basedOn w:val="891"/>
     <w:uiPriority w:val="99"/>
     <w:pPr>
       <w:pBdr/>
@@ -6000,9 +6000,9 @@
       </w:tcPr>
     </w:tblStylePr>
   </w:style>
-  <w:style w:type="table" w:styleId="29">
+  <w:style w:type="table" w:styleId="722">
     <w:name w:val="Grid Table 2 - Accent 3"/>
-    <w:basedOn w:val="665"/>
+    <w:basedOn w:val="891"/>
     <w:uiPriority w:val="99"/>
     <w:pPr>
       <w:pBdr/>
@@ -6232,9 +6232,9 @@
       </w:tcPr>
     </w:tblStylePr>
   </w:style>
-  <w:style w:type="table" w:styleId="30">
+  <w:style w:type="table" w:styleId="723">
     <w:name w:val="Grid Table 2 - Accent 4"/>
-    <w:basedOn w:val="665"/>
+    <w:basedOn w:val="891"/>
     <w:uiPriority w:val="99"/>
     <w:pPr>
       <w:pBdr/>
@@ -6464,9 +6464,9 @@
       </w:tcPr>
     </w:tblStylePr>
   </w:style>
-  <w:style w:type="table" w:styleId="31">
+  <w:style w:type="table" w:styleId="724">
     <w:name w:val="Grid Table 2 - Accent 5"/>
-    <w:basedOn w:val="665"/>
+    <w:basedOn w:val="891"/>
     <w:uiPriority w:val="99"/>
     <w:pPr>
       <w:pBdr/>
@@ -6696,9 +6696,9 @@
       </w:tcPr>
     </w:tblStylePr>
   </w:style>
-  <w:style w:type="table" w:styleId="32">
+  <w:style w:type="table" w:styleId="725">
     <w:name w:val="Grid Table 2 - Accent 6"/>
-    <w:basedOn w:val="665"/>
+    <w:basedOn w:val="891"/>
     <w:uiPriority w:val="99"/>
     <w:pPr>
       <w:pBdr/>
@@ -6928,9 +6928,9 @@
       </w:tcPr>
     </w:tblStylePr>
   </w:style>
-  <w:style w:type="table" w:styleId="33">
+  <w:style w:type="table" w:styleId="726">
     <w:name w:val="Grid Table 3"/>
-    <w:basedOn w:val="665"/>
+    <w:basedOn w:val="891"/>
     <w:uiPriority w:val="99"/>
     <w:pPr>
       <w:pBdr/>
@@ -7029,29 +7029,6 @@
         <w:tblBorders/>
       </w:tblPr>
       <w:tcPr>
-        <w:shd w:color="ffffff"/>
-        <w:tcBorders>
-          <w:top w:val="none" w:color="000000" w:sz="4" w:space="0"/>
-          <w:left w:val="none" w:color="000000" w:sz="4" w:space="0"/>
-          <w:bottom w:val="none" w:color="000000" w:sz="4" w:space="0"/>
-          <w:right w:val="none" w:color="000000" w:sz="4" w:space="0"/>
-        </w:tcBorders>
-      </w:tcPr>
-    </w:tblStylePr>
-    <w:tblStylePr w:type="firstRow">
-      <w:rPr>
-        <w:b/>
-        <w:color w:val="404040"/>
-      </w:rPr>
-      <w:pPr>
-        <w:pBdr/>
-        <w:spacing/>
-        <w:ind/>
-      </w:pPr>
-      <w:tblPr>
-        <w:tblBorders/>
-      </w:tblPr>
-      <w:tcPr>
         <w:shd w:val="clear" w:color="ffffff"/>
         <w:tcBorders>
           <w:top w:val="none" w:color="000000" w:sz="4" w:space="0"/>
@@ -7061,30 +7038,7 @@
         </w:tcBorders>
       </w:tcPr>
     </w:tblStylePr>
-    <w:tblStylePr w:type="lastCol">
-      <w:rPr>
-        <w:i/>
-        <w:color w:val="404040"/>
-      </w:rPr>
-      <w:pPr>
-        <w:pBdr/>
-        <w:spacing/>
-        <w:ind/>
-      </w:pPr>
-      <w:tblPr>
-        <w:tblBorders/>
-      </w:tblPr>
-      <w:tcPr>
-        <w:shd w:color="ffffff"/>
-        <w:tcBorders>
-          <w:top w:val="none" w:color="000000" w:sz="4" w:space="0"/>
-          <w:left w:val="none" w:color="000000" w:sz="4" w:space="0"/>
-          <w:bottom w:val="none" w:color="000000" w:sz="4" w:space="0"/>
-          <w:right w:val="none" w:color="000000" w:sz="4" w:space="0"/>
-        </w:tcBorders>
-      </w:tcPr>
-    </w:tblStylePr>
-    <w:tblStylePr w:type="lastRow">
+    <w:tblStylePr w:type="firstRow">
       <w:rPr>
         <w:b/>
         <w:color w:val="404040"/>
@@ -7107,6 +7061,52 @@
         </w:tcBorders>
       </w:tcPr>
     </w:tblStylePr>
+    <w:tblStylePr w:type="lastCol">
+      <w:rPr>
+        <w:i/>
+        <w:color w:val="404040"/>
+      </w:rPr>
+      <w:pPr>
+        <w:pBdr/>
+        <w:spacing/>
+        <w:ind/>
+      </w:pPr>
+      <w:tblPr>
+        <w:tblBorders/>
+      </w:tblPr>
+      <w:tcPr>
+        <w:shd w:val="clear" w:color="ffffff"/>
+        <w:tcBorders>
+          <w:top w:val="none" w:color="000000" w:sz="4" w:space="0"/>
+          <w:left w:val="none" w:color="000000" w:sz="4" w:space="0"/>
+          <w:bottom w:val="none" w:color="000000" w:sz="4" w:space="0"/>
+          <w:right w:val="none" w:color="000000" w:sz="4" w:space="0"/>
+        </w:tcBorders>
+      </w:tcPr>
+    </w:tblStylePr>
+    <w:tblStylePr w:type="lastRow">
+      <w:rPr>
+        <w:b/>
+        <w:color w:val="404040"/>
+      </w:rPr>
+      <w:pPr>
+        <w:pBdr/>
+        <w:spacing/>
+        <w:ind/>
+      </w:pPr>
+      <w:tblPr>
+        <w:tblBorders/>
+      </w:tblPr>
+      <w:tcPr>
+        <w:shd w:val="clear" w:color="ffffff"/>
+        <w:tcBorders>
+          <w:top w:val="none" w:color="000000" w:sz="4" w:space="0"/>
+          <w:left w:val="none" w:color="000000" w:sz="4" w:space="0"/>
+          <w:bottom w:val="none" w:color="000000" w:sz="4" w:space="0"/>
+          <w:right w:val="none" w:color="000000" w:sz="4" w:space="0"/>
+        </w:tcBorders>
+      </w:tcPr>
+    </w:tblStylePr>
     <w:tblStylePr w:type="nwCell">
       <w:pPr>
         <w:pBdr/>
@@ -7173,9 +7173,9 @@
       </w:tcPr>
     </w:tblStylePr>
   </w:style>
-  <w:style w:type="table" w:styleId="34">
+  <w:style w:type="table" w:styleId="727">
     <w:name w:val="Grid Table 3 - Accent 1"/>
-    <w:basedOn w:val="665"/>
+    <w:basedOn w:val="891"/>
     <w:uiPriority w:val="99"/>
     <w:pPr>
       <w:pBdr/>
@@ -7274,29 +7274,6 @@
         <w:tblBorders/>
       </w:tblPr>
       <w:tcPr>
-        <w:shd w:color="ffffff"/>
-        <w:tcBorders>
-          <w:top w:val="none" w:color="000000" w:sz="4" w:space="0"/>
-          <w:left w:val="none" w:color="000000" w:sz="4" w:space="0"/>
-          <w:bottom w:val="none" w:color="000000" w:sz="4" w:space="0"/>
-          <w:right w:val="none" w:color="000000" w:sz="4" w:space="0"/>
-        </w:tcBorders>
-      </w:tcPr>
-    </w:tblStylePr>
-    <w:tblStylePr w:type="firstRow">
-      <w:rPr>
-        <w:b/>
-        <w:color w:val="404040"/>
-      </w:rPr>
-      <w:pPr>
-        <w:pBdr/>
-        <w:spacing/>
-        <w:ind/>
-      </w:pPr>
-      <w:tblPr>
-        <w:tblBorders/>
-      </w:tblPr>
-      <w:tcPr>
         <w:shd w:val="clear" w:color="ffffff"/>
         <w:tcBorders>
           <w:top w:val="none" w:color="000000" w:sz="4" w:space="0"/>
@@ -7306,30 +7283,7 @@
         </w:tcBorders>
       </w:tcPr>
     </w:tblStylePr>
-    <w:tblStylePr w:type="lastCol">
-      <w:rPr>
-        <w:i/>
-        <w:color w:val="404040"/>
-      </w:rPr>
-      <w:pPr>
-        <w:pBdr/>
-        <w:spacing/>
-        <w:ind/>
-      </w:pPr>
-      <w:tblPr>
-        <w:tblBorders/>
-      </w:tblPr>
-      <w:tcPr>
-        <w:shd w:color="ffffff"/>
-        <w:tcBorders>
-          <w:top w:val="none" w:color="000000" w:sz="4" w:space="0"/>
-          <w:left w:val="none" w:color="000000" w:sz="4" w:space="0"/>
-          <w:bottom w:val="none" w:color="000000" w:sz="4" w:space="0"/>
-          <w:right w:val="none" w:color="000000" w:sz="4" w:space="0"/>
-        </w:tcBorders>
-      </w:tcPr>
-    </w:tblStylePr>
-    <w:tblStylePr w:type="lastRow">
+    <w:tblStylePr w:type="firstRow">
       <w:rPr>
         <w:b/>
         <w:color w:val="404040"/>
@@ -7352,6 +7306,52 @@
         </w:tcBorders>
       </w:tcPr>
     </w:tblStylePr>
+    <w:tblStylePr w:type="lastCol">
+      <w:rPr>
+        <w:i/>
+        <w:color w:val="404040"/>
+      </w:rPr>
+      <w:pPr>
+        <w:pBdr/>
+        <w:spacing/>
+        <w:ind/>
+      </w:pPr>
+      <w:tblPr>
+        <w:tblBorders/>
+      </w:tblPr>
+      <w:tcPr>
+        <w:shd w:val="clear" w:color="ffffff"/>
+        <w:tcBorders>
+          <w:top w:val="none" w:color="000000" w:sz="4" w:space="0"/>
+          <w:left w:val="none" w:color="000000" w:sz="4" w:space="0"/>
+          <w:bottom w:val="none" w:color="000000" w:sz="4" w:space="0"/>
+          <w:right w:val="none" w:color="000000" w:sz="4" w:space="0"/>
+        </w:tcBorders>
+      </w:tcPr>
+    </w:tblStylePr>
+    <w:tblStylePr w:type="lastRow">
+      <w:rPr>
+        <w:b/>
+        <w:color w:val="404040"/>
+      </w:rPr>
+      <w:pPr>
+        <w:pBdr/>
+        <w:spacing/>
+        <w:ind/>
+      </w:pPr>
+      <w:tblPr>
+        <w:tblBorders/>
+      </w:tblPr>
+      <w:tcPr>
+        <w:shd w:val="clear" w:color="ffffff"/>
+        <w:tcBorders>
+          <w:top w:val="none" w:color="000000" w:sz="4" w:space="0"/>
+          <w:left w:val="none" w:color="000000" w:sz="4" w:space="0"/>
+          <w:bottom w:val="none" w:color="000000" w:sz="4" w:space="0"/>
+          <w:right w:val="none" w:color="000000" w:sz="4" w:space="0"/>
+        </w:tcBorders>
+      </w:tcPr>
+    </w:tblStylePr>
     <w:tblStylePr w:type="nwCell">
       <w:pPr>
         <w:pBdr/>
@@ -7418,9 +7418,9 @@
       </w:tcPr>
     </w:tblStylePr>
   </w:style>
-  <w:style w:type="table" w:styleId="35">
+  <w:style w:type="table" w:styleId="728">
     <w:name w:val="Grid Table 3 - Accent 2"/>
-    <w:basedOn w:val="665"/>
+    <w:basedOn w:val="891"/>
     <w:uiPriority w:val="99"/>
     <w:pPr>
       <w:pBdr/>
@@ -7519,29 +7519,6 @@
         <w:tblBorders/>
       </w:tblPr>
       <w:tcPr>
-        <w:shd w:color="ffffff"/>
-        <w:tcBorders>
-          <w:top w:val="none" w:color="000000" w:sz="4" w:space="0"/>
-          <w:left w:val="none" w:color="000000" w:sz="4" w:space="0"/>
-          <w:bottom w:val="none" w:color="000000" w:sz="4" w:space="0"/>
-          <w:right w:val="none" w:color="000000" w:sz="4" w:space="0"/>
-        </w:tcBorders>
-      </w:tcPr>
-    </w:tblStylePr>
-    <w:tblStylePr w:type="firstRow">
-      <w:rPr>
-        <w:b/>
-        <w:color w:val="404040"/>
-      </w:rPr>
-      <w:pPr>
-        <w:pBdr/>
-        <w:spacing/>
-        <w:ind/>
-      </w:pPr>
-      <w:tblPr>
-        <w:tblBorders/>
-      </w:tblPr>
-      <w:tcPr>
         <w:shd w:val="clear" w:color="ffffff"/>
         <w:tcBorders>
           <w:top w:val="none" w:color="000000" w:sz="4" w:space="0"/>
@@ -7551,30 +7528,7 @@
         </w:tcBorders>
       </w:tcPr>
     </w:tblStylePr>
-    <w:tblStylePr w:type="lastCol">
-      <w:rPr>
-        <w:i/>
-        <w:color w:val="404040"/>
-      </w:rPr>
-      <w:pPr>
-        <w:pBdr/>
-        <w:spacing/>
-        <w:ind/>
-      </w:pPr>
-      <w:tblPr>
-        <w:tblBorders/>
-      </w:tblPr>
-      <w:tcPr>
-        <w:shd w:color="ffffff"/>
-        <w:tcBorders>
-          <w:top w:val="none" w:color="000000" w:sz="4" w:space="0"/>
-          <w:left w:val="none" w:color="000000" w:sz="4" w:space="0"/>
-          <w:bottom w:val="none" w:color="000000" w:sz="4" w:space="0"/>
-          <w:right w:val="none" w:color="000000" w:sz="4" w:space="0"/>
-        </w:tcBorders>
-      </w:tcPr>
-    </w:tblStylePr>
-    <w:tblStylePr w:type="lastRow">
+    <w:tblStylePr w:type="firstRow">
       <w:rPr>
         <w:b/>
         <w:color w:val="404040"/>
@@ -7597,6 +7551,52 @@
         </w:tcBorders>
       </w:tcPr>
     </w:tblStylePr>
+    <w:tblStylePr w:type="lastCol">
+      <w:rPr>
+        <w:i/>
+        <w:color w:val="404040"/>
+      </w:rPr>
+      <w:pPr>
+        <w:pBdr/>
+        <w:spacing/>
+        <w:ind/>
+      </w:pPr>
+      <w:tblPr>
+        <w:tblBorders/>
+      </w:tblPr>
+      <w:tcPr>
+        <w:shd w:val="clear" w:color="ffffff"/>
+        <w:tcBorders>
+          <w:top w:val="none" w:color="000000" w:sz="4" w:space="0"/>
+          <w:left w:val="none" w:color="000000" w:sz="4" w:space="0"/>
+          <w:bottom w:val="none" w:color="000000" w:sz="4" w:space="0"/>
+          <w:right w:val="none" w:color="000000" w:sz="4" w:space="0"/>
+        </w:tcBorders>
+      </w:tcPr>
+    </w:tblStylePr>
+    <w:tblStylePr w:type="lastRow">
+      <w:rPr>
+        <w:b/>
+        <w:color w:val="404040"/>
+      </w:rPr>
+      <w:pPr>
+        <w:pBdr/>
+        <w:spacing/>
+        <w:ind/>
+      </w:pPr>
+      <w:tblPr>
+        <w:tblBorders/>
+      </w:tblPr>
+      <w:tcPr>
+        <w:shd w:val="clear" w:color="ffffff"/>
+        <w:tcBorders>
+          <w:top w:val="none" w:color="000000" w:sz="4" w:space="0"/>
+          <w:left w:val="none" w:color="000000" w:sz="4" w:space="0"/>
+          <w:bottom w:val="none" w:color="000000" w:sz="4" w:space="0"/>
+          <w:right w:val="none" w:color="000000" w:sz="4" w:space="0"/>
+        </w:tcBorders>
+      </w:tcPr>
+    </w:tblStylePr>
     <w:tblStylePr w:type="nwCell">
       <w:pPr>
         <w:pBdr/>
@@ -7663,9 +7663,9 @@
       </w:tcPr>
     </w:tblStylePr>
   </w:style>
-  <w:style w:type="table" w:styleId="36">
+  <w:style w:type="table" w:styleId="729">
     <w:name w:val="Grid Table 3 - Accent 3"/>
-    <w:basedOn w:val="665"/>
+    <w:basedOn w:val="891"/>
     <w:uiPriority w:val="99"/>
     <w:pPr>
       <w:pBdr/>
@@ -7764,29 +7764,6 @@
         <w:tblBorders/>
       </w:tblPr>
       <w:tcPr>
-        <w:shd w:color="ffffff"/>
-        <w:tcBorders>
-          <w:top w:val="none" w:color="000000" w:sz="4" w:space="0"/>
-          <w:left w:val="none" w:color="000000" w:sz="4" w:space="0"/>
-          <w:bottom w:val="none" w:color="000000" w:sz="4" w:space="0"/>
-          <w:right w:val="none" w:color="000000" w:sz="4" w:space="0"/>
-        </w:tcBorders>
-      </w:tcPr>
-    </w:tblStylePr>
-    <w:tblStylePr w:type="firstRow">
-      <w:rPr>
-        <w:b/>
-        <w:color w:val="404040"/>
-      </w:rPr>
-      <w:pPr>
-        <w:pBdr/>
-        <w:spacing/>
-        <w:ind/>
-      </w:pPr>
-      <w:tblPr>
-        <w:tblBorders/>
-      </w:tblPr>
-      <w:tcPr>
         <w:shd w:val="clear" w:color="ffffff"/>
         <w:tcBorders>
           <w:top w:val="none" w:color="000000" w:sz="4" w:space="0"/>
@@ -7796,30 +7773,7 @@
         </w:tcBorders>
       </w:tcPr>
     </w:tblStylePr>
-    <w:tblStylePr w:type="lastCol">
-      <w:rPr>
-        <w:i/>
-        <w:color w:val="404040"/>
-      </w:rPr>
-      <w:pPr>
-        <w:pBdr/>
-        <w:spacing/>
-        <w:ind/>
-      </w:pPr>
-      <w:tblPr>
-        <w:tblBorders/>
-      </w:tblPr>
-      <w:tcPr>
-        <w:shd w:color="ffffff"/>
-        <w:tcBorders>
-          <w:top w:val="none" w:color="000000" w:sz="4" w:space="0"/>
-          <w:left w:val="none" w:color="000000" w:sz="4" w:space="0"/>
-          <w:bottom w:val="none" w:color="000000" w:sz="4" w:space="0"/>
-          <w:right w:val="none" w:color="000000" w:sz="4" w:space="0"/>
-        </w:tcBorders>
-      </w:tcPr>
-    </w:tblStylePr>
-    <w:tblStylePr w:type="lastRow">
+    <w:tblStylePr w:type="firstRow">
       <w:rPr>
         <w:b/>
         <w:color w:val="404040"/>
@@ -7842,6 +7796,52 @@
         </w:tcBorders>
       </w:tcPr>
     </w:tblStylePr>
+    <w:tblStylePr w:type="lastCol">
+      <w:rPr>
+        <w:i/>
+        <w:color w:val="404040"/>
+      </w:rPr>
+      <w:pPr>
+        <w:pBdr/>
+        <w:spacing/>
+        <w:ind/>
+      </w:pPr>
+      <w:tblPr>
+        <w:tblBorders/>
+      </w:tblPr>
+      <w:tcPr>
+        <w:shd w:val="clear" w:color="ffffff"/>
+        <w:tcBorders>
+          <w:top w:val="none" w:color="000000" w:sz="4" w:space="0"/>
+          <w:left w:val="none" w:color="000000" w:sz="4" w:space="0"/>
+          <w:bottom w:val="none" w:color="000000" w:sz="4" w:space="0"/>
+          <w:right w:val="none" w:color="000000" w:sz="4" w:space="0"/>
+        </w:tcBorders>
+      </w:tcPr>
+    </w:tblStylePr>
+    <w:tblStylePr w:type="lastRow">
+      <w:rPr>
+        <w:b/>
+        <w:color w:val="404040"/>
+      </w:rPr>
+      <w:pPr>
+        <w:pBdr/>
+        <w:spacing/>
+        <w:ind/>
+      </w:pPr>
+      <w:tblPr>
+        <w:tblBorders/>
+      </w:tblPr>
+      <w:tcPr>
+        <w:shd w:val="clear" w:color="ffffff"/>
+        <w:tcBorders>
+          <w:top w:val="none" w:color="000000" w:sz="4" w:space="0"/>
+          <w:left w:val="none" w:color="000000" w:sz="4" w:space="0"/>
+          <w:bottom w:val="none" w:color="000000" w:sz="4" w:space="0"/>
+          <w:right w:val="none" w:color="000000" w:sz="4" w:space="0"/>
+        </w:tcBorders>
+      </w:tcPr>
+    </w:tblStylePr>
     <w:tblStylePr w:type="nwCell">
       <w:pPr>
         <w:pBdr/>
@@ -7908,9 +7908,9 @@
       </w:tcPr>
     </w:tblStylePr>
   </w:style>
-  <w:style w:type="table" w:styleId="37">
+  <w:style w:type="table" w:styleId="730">
     <w:name w:val="Grid Table 3 - Accent 4"/>
-    <w:basedOn w:val="665"/>
+    <w:basedOn w:val="891"/>
     <w:uiPriority w:val="99"/>
     <w:pPr>
       <w:pBdr/>
@@ -8009,29 +8009,6 @@
         <w:tblBorders/>
       </w:tblPr>
       <w:tcPr>
-        <w:shd w:color="ffffff"/>
-        <w:tcBorders>
-          <w:top w:val="none" w:color="000000" w:sz="4" w:space="0"/>
-          <w:left w:val="none" w:color="000000" w:sz="4" w:space="0"/>
-          <w:bottom w:val="none" w:color="000000" w:sz="4" w:space="0"/>
-          <w:right w:val="none" w:color="000000" w:sz="4" w:space="0"/>
-        </w:tcBorders>
-      </w:tcPr>
-    </w:tblStylePr>
-    <w:tblStylePr w:type="firstRow">
-      <w:rPr>
-        <w:b/>
-        <w:color w:val="404040"/>
-      </w:rPr>
-      <w:pPr>
-        <w:pBdr/>
-        <w:spacing/>
-        <w:ind/>
-      </w:pPr>
-      <w:tblPr>
-        <w:tblBorders/>
-      </w:tblPr>
-      <w:tcPr>
         <w:shd w:val="clear" w:color="ffffff"/>
         <w:tcBorders>
           <w:top w:val="none" w:color="000000" w:sz="4" w:space="0"/>
@@ -8041,30 +8018,7 @@
         </w:tcBorders>
       </w:tcPr>
     </w:tblStylePr>
-    <w:tblStylePr w:type="lastCol">
-      <w:rPr>
-        <w:i/>
-        <w:color w:val="404040"/>
-      </w:rPr>
-      <w:pPr>
-        <w:pBdr/>
-        <w:spacing/>
-        <w:ind/>
-      </w:pPr>
-      <w:tblPr>
-        <w:tblBorders/>
-      </w:tblPr>
-      <w:tcPr>
-        <w:shd w:color="ffffff"/>
-        <w:tcBorders>
-          <w:top w:val="none" w:color="000000" w:sz="4" w:space="0"/>
-          <w:left w:val="none" w:color="000000" w:sz="4" w:space="0"/>
-          <w:bottom w:val="none" w:color="000000" w:sz="4" w:space="0"/>
-          <w:right w:val="none" w:color="000000" w:sz="4" w:space="0"/>
-        </w:tcBorders>
-      </w:tcPr>
-    </w:tblStylePr>
-    <w:tblStylePr w:type="lastRow">
+    <w:tblStylePr w:type="firstRow">
       <w:rPr>
         <w:b/>
         <w:color w:val="404040"/>
@@ -8087,6 +8041,52 @@
         </w:tcBorders>
       </w:tcPr>
     </w:tblStylePr>
+    <w:tblStylePr w:type="lastCol">
+      <w:rPr>
+        <w:i/>
+        <w:color w:val="404040"/>
+      </w:rPr>
+      <w:pPr>
+        <w:pBdr/>
+        <w:spacing/>
+        <w:ind/>
+      </w:pPr>
+      <w:tblPr>
+        <w:tblBorders/>
+      </w:tblPr>
+      <w:tcPr>
+        <w:shd w:val="clear" w:color="ffffff"/>
+        <w:tcBorders>
+          <w:top w:val="none" w:color="000000" w:sz="4" w:space="0"/>
+          <w:left w:val="none" w:color="000000" w:sz="4" w:space="0"/>
+          <w:bottom w:val="none" w:color="000000" w:sz="4" w:space="0"/>
+          <w:right w:val="none" w:color="000000" w:sz="4" w:space="0"/>
+        </w:tcBorders>
+      </w:tcPr>
+    </w:tblStylePr>
+    <w:tblStylePr w:type="lastRow">
+      <w:rPr>
+        <w:b/>
+        <w:color w:val="404040"/>
+      </w:rPr>
+      <w:pPr>
+        <w:pBdr/>
+        <w:spacing/>
+        <w:ind/>
+      </w:pPr>
+      <w:tblPr>
+        <w:tblBorders/>
+      </w:tblPr>
+      <w:tcPr>
+        <w:shd w:val="clear" w:color="ffffff"/>
+        <w:tcBorders>
+          <w:top w:val="none" w:color="000000" w:sz="4" w:space="0"/>
+          <w:left w:val="none" w:color="000000" w:sz="4" w:space="0"/>
+          <w:bottom w:val="none" w:color="000000" w:sz="4" w:space="0"/>
+          <w:right w:val="none" w:color="000000" w:sz="4" w:space="0"/>
+        </w:tcBorders>
+      </w:tcPr>
+    </w:tblStylePr>
     <w:tblStylePr w:type="nwCell">
       <w:pPr>
         <w:pBdr/>
@@ -8153,9 +8153,9 @@
       </w:tcPr>
     </w:tblStylePr>
   </w:style>
-  <w:style w:type="table" w:styleId="38">
+  <w:style w:type="table" w:styleId="731">
     <w:name w:val="Grid Table 3 - Accent 5"/>
-    <w:basedOn w:val="665"/>
+    <w:basedOn w:val="891"/>
     <w:uiPriority w:val="99"/>
     <w:pPr>
       <w:pBdr/>
@@ -8254,29 +8254,6 @@
         <w:tblBorders/>
       </w:tblPr>
       <w:tcPr>
-        <w:shd w:color="ffffff"/>
-        <w:tcBorders>
-          <w:top w:val="none" w:color="000000" w:sz="4" w:space="0"/>
-          <w:left w:val="none" w:color="000000" w:sz="4" w:space="0"/>
-          <w:bottom w:val="none" w:color="000000" w:sz="4" w:space="0"/>
-          <w:right w:val="none" w:color="000000" w:sz="4" w:space="0"/>
-        </w:tcBorders>
-      </w:tcPr>
-    </w:tblStylePr>
-    <w:tblStylePr w:type="firstRow">
-      <w:rPr>
-        <w:b/>
-        <w:color w:val="404040"/>
-      </w:rPr>
-      <w:pPr>
-        <w:pBdr/>
-        <w:spacing/>
-        <w:ind/>
-      </w:pPr>
-      <w:tblPr>
-        <w:tblBorders/>
-      </w:tblPr>
-      <w:tcPr>
         <w:shd w:val="clear" w:color="ffffff"/>
         <w:tcBorders>
           <w:top w:val="none" w:color="000000" w:sz="4" w:space="0"/>
@@ -8286,30 +8263,7 @@
         </w:tcBorders>
       </w:tcPr>
     </w:tblStylePr>
-    <w:tblStylePr w:type="lastCol">
-      <w:rPr>
-        <w:i/>
-        <w:color w:val="404040"/>
-      </w:rPr>
-      <w:pPr>
-        <w:pBdr/>
-        <w:spacing/>
-        <w:ind/>
-      </w:pPr>
-      <w:tblPr>
-        <w:tblBorders/>
-      </w:tblPr>
-      <w:tcPr>
-        <w:shd w:color="ffffff"/>
-        <w:tcBorders>
-          <w:top w:val="none" w:color="000000" w:sz="4" w:space="0"/>
-          <w:left w:val="none" w:color="000000" w:sz="4" w:space="0"/>
-          <w:bottom w:val="none" w:color="000000" w:sz="4" w:space="0"/>
-          <w:right w:val="none" w:color="000000" w:sz="4" w:space="0"/>
-        </w:tcBorders>
-      </w:tcPr>
-    </w:tblStylePr>
-    <w:tblStylePr w:type="lastRow">
+    <w:tblStylePr w:type="firstRow">
       <w:rPr>
         <w:b/>
         <w:color w:val="404040"/>
@@ -8332,6 +8286,52 @@
         </w:tcBorders>
       </w:tcPr>
     </w:tblStylePr>
+    <w:tblStylePr w:type="lastCol">
+      <w:rPr>
+        <w:i/>
+        <w:color w:val="404040"/>
+      </w:rPr>
+      <w:pPr>
+        <w:pBdr/>
+        <w:spacing/>
+        <w:ind/>
+      </w:pPr>
+      <w:tblPr>
+        <w:tblBorders/>
+      </w:tblPr>
+      <w:tcPr>
+        <w:shd w:val="clear" w:color="ffffff"/>
+        <w:tcBorders>
+          <w:top w:val="none" w:color="000000" w:sz="4" w:space="0"/>
+          <w:left w:val="none" w:color="000000" w:sz="4" w:space="0"/>
+          <w:bottom w:val="none" w:color="000000" w:sz="4" w:space="0"/>
+          <w:right w:val="none" w:color="000000" w:sz="4" w:space="0"/>
+        </w:tcBorders>
+      </w:tcPr>
+    </w:tblStylePr>
+    <w:tblStylePr w:type="lastRow">
+      <w:rPr>
+        <w:b/>
+        <w:color w:val="404040"/>
+      </w:rPr>
+      <w:pPr>
+        <w:pBdr/>
+        <w:spacing/>
+        <w:ind/>
+      </w:pPr>
+      <w:tblPr>
+        <w:tblBorders/>
+      </w:tblPr>
+      <w:tcPr>
+        <w:shd w:val="clear" w:color="ffffff"/>
+        <w:tcBorders>
+          <w:top w:val="none" w:color="000000" w:sz="4" w:space="0"/>
+          <w:left w:val="none" w:color="000000" w:sz="4" w:space="0"/>
+          <w:bottom w:val="none" w:color="000000" w:sz="4" w:space="0"/>
+          <w:right w:val="none" w:color="000000" w:sz="4" w:space="0"/>
+        </w:tcBorders>
+      </w:tcPr>
+    </w:tblStylePr>
     <w:tblStylePr w:type="nwCell">
       <w:pPr>
         <w:pBdr/>
@@ -8398,9 +8398,9 @@
       </w:tcPr>
     </w:tblStylePr>
   </w:style>
-  <w:style w:type="table" w:styleId="39">
+  <w:style w:type="table" w:styleId="732">
     <w:name w:val="Grid Table 3 - Accent 6"/>
-    <w:basedOn w:val="665"/>
+    <w:basedOn w:val="891"/>
     <w:uiPriority w:val="99"/>
     <w:pPr>
       <w:pBdr/>
@@ -8499,29 +8499,6 @@
         <w:tblBorders/>
       </w:tblPr>
       <w:tcPr>
-        <w:shd w:color="ffffff"/>
-        <w:tcBorders>
-          <w:top w:val="none" w:color="000000" w:sz="4" w:space="0"/>
-          <w:left w:val="none" w:color="000000" w:sz="4" w:space="0"/>
-          <w:bottom w:val="none" w:color="000000" w:sz="4" w:space="0"/>
-          <w:right w:val="none" w:color="000000" w:sz="4" w:space="0"/>
-        </w:tcBorders>
-      </w:tcPr>
-    </w:tblStylePr>
-    <w:tblStylePr w:type="firstRow">
-      <w:rPr>
-        <w:b/>
-        <w:color w:val="404040"/>
-      </w:rPr>
-      <w:pPr>
-        <w:pBdr/>
-        <w:spacing/>
-        <w:ind/>
-      </w:pPr>
-      <w:tblPr>
-        <w:tblBorders/>
-      </w:tblPr>
-      <w:tcPr>
         <w:shd w:val="clear" w:color="ffffff"/>
         <w:tcBorders>
           <w:top w:val="none" w:color="000000" w:sz="4" w:space="0"/>
@@ -8531,30 +8508,7 @@
         </w:tcBorders>
       </w:tcPr>
     </w:tblStylePr>
-    <w:tblStylePr w:type="lastCol">
-      <w:rPr>
-        <w:i/>
-        <w:color w:val="404040"/>
-      </w:rPr>
-      <w:pPr>
-        <w:pBdr/>
-        <w:spacing/>
-        <w:ind/>
-      </w:pPr>
-      <w:tblPr>
-        <w:tblBorders/>
-      </w:tblPr>
-      <w:tcPr>
-        <w:shd w:color="ffffff"/>
-        <w:tcBorders>
-          <w:top w:val="none" w:color="000000" w:sz="4" w:space="0"/>
-          <w:left w:val="none" w:color="000000" w:sz="4" w:space="0"/>
-          <w:bottom w:val="none" w:color="000000" w:sz="4" w:space="0"/>
-          <w:right w:val="none" w:color="000000" w:sz="4" w:space="0"/>
-        </w:tcBorders>
-      </w:tcPr>
-    </w:tblStylePr>
-    <w:tblStylePr w:type="lastRow">
+    <w:tblStylePr w:type="firstRow">
       <w:rPr>
         <w:b/>
         <w:color w:val="404040"/>
@@ -8577,6 +8531,52 @@
         </w:tcBorders>
       </w:tcPr>
     </w:tblStylePr>
+    <w:tblStylePr w:type="lastCol">
+      <w:rPr>
+        <w:i/>
+        <w:color w:val="404040"/>
+      </w:rPr>
+      <w:pPr>
+        <w:pBdr/>
+        <w:spacing/>
+        <w:ind/>
+      </w:pPr>
+      <w:tblPr>
+        <w:tblBorders/>
+      </w:tblPr>
+      <w:tcPr>
+        <w:shd w:val="clear" w:color="ffffff"/>
+        <w:tcBorders>
+          <w:top w:val="none" w:color="000000" w:sz="4" w:space="0"/>
+          <w:left w:val="none" w:color="000000" w:sz="4" w:space="0"/>
+          <w:bottom w:val="none" w:color="000000" w:sz="4" w:space="0"/>
+          <w:right w:val="none" w:color="000000" w:sz="4" w:space="0"/>
+        </w:tcBorders>
+      </w:tcPr>
+    </w:tblStylePr>
+    <w:tblStylePr w:type="lastRow">
+      <w:rPr>
+        <w:b/>
+        <w:color w:val="404040"/>
+      </w:rPr>
+      <w:pPr>
+        <w:pBdr/>
+        <w:spacing/>
+        <w:ind/>
+      </w:pPr>
+      <w:tblPr>
+        <w:tblBorders/>
+      </w:tblPr>
+      <w:tcPr>
+        <w:shd w:val="clear" w:color="ffffff"/>
+        <w:tcBorders>
+          <w:top w:val="none" w:color="000000" w:sz="4" w:space="0"/>
+          <w:left w:val="none" w:color="000000" w:sz="4" w:space="0"/>
+          <w:bottom w:val="none" w:color="000000" w:sz="4" w:space="0"/>
+          <w:right w:val="none" w:color="000000" w:sz="4" w:space="0"/>
+        </w:tcBorders>
+      </w:tcPr>
+    </w:tblStylePr>
     <w:tblStylePr w:type="nwCell">
       <w:pPr>
         <w:pBdr/>
@@ -8643,9 +8643,9 @@
       </w:tcPr>
     </w:tblStylePr>
   </w:style>
-  <w:style w:type="table" w:styleId="40">
+  <w:style w:type="table" w:styleId="733">
     <w:name w:val="Grid Table 4"/>
-    <w:basedOn w:val="665"/>
+    <w:basedOn w:val="891"/>
     <w:uiPriority w:val="59"/>
     <w:pPr>
       <w:pBdr/>
@@ -8876,9 +8876,9 @@
       </w:tcPr>
     </w:tblStylePr>
   </w:style>
-  <w:style w:type="table" w:styleId="41">
+  <w:style w:type="table" w:styleId="734">
     <w:name w:val="Grid Table 4 - Accent 1"/>
-    <w:basedOn w:val="665"/>
+    <w:basedOn w:val="891"/>
     <w:uiPriority w:val="59"/>
     <w:pPr>
       <w:pBdr/>
@@ -9109,9 +9109,9 @@
       </w:tcPr>
     </w:tblStylePr>
   </w:style>
-  <w:style w:type="table" w:styleId="42">
+  <w:style w:type="table" w:styleId="735">
     <w:name w:val="Grid Table 4 - Accent 2"/>
-    <w:basedOn w:val="665"/>
+    <w:basedOn w:val="891"/>
     <w:uiPriority w:val="59"/>
     <w:pPr>
       <w:pBdr/>
@@ -9342,9 +9342,9 @@
       </w:tcPr>
     </w:tblStylePr>
   </w:style>
-  <w:style w:type="table" w:styleId="43">
+  <w:style w:type="table" w:styleId="736">
     <w:name w:val="Grid Table 4 - Accent 3"/>
-    <w:basedOn w:val="665"/>
+    <w:basedOn w:val="891"/>
     <w:uiPriority w:val="59"/>
     <w:pPr>
       <w:pBdr/>
@@ -9575,9 +9575,9 @@
       </w:tcPr>
     </w:tblStylePr>
   </w:style>
-  <w:style w:type="table" w:styleId="44">
+  <w:style w:type="table" w:styleId="737">
     <w:name w:val="Grid Table 4 - Accent 4"/>
-    <w:basedOn w:val="665"/>
+    <w:basedOn w:val="891"/>
     <w:uiPriority w:val="59"/>
     <w:pPr>
       <w:pBdr/>
@@ -9808,9 +9808,9 @@
       </w:tcPr>
     </w:tblStylePr>
   </w:style>
-  <w:style w:type="table" w:styleId="45">
+  <w:style w:type="table" w:styleId="738">
     <w:name w:val="Grid Table 4 - Accent 5"/>
-    <w:basedOn w:val="665"/>
+    <w:basedOn w:val="891"/>
     <w:uiPriority w:val="59"/>
     <w:pPr>
       <w:pBdr/>
@@ -10041,9 +10041,9 @@
       </w:tcPr>
     </w:tblStylePr>
   </w:style>
-  <w:style w:type="table" w:styleId="46">
+  <w:style w:type="table" w:styleId="739">
     <w:name w:val="Grid Table 4 - Accent 6"/>
-    <w:basedOn w:val="665"/>
+    <w:basedOn w:val="891"/>
     <w:uiPriority w:val="59"/>
     <w:pPr>
       <w:pBdr/>
@@ -10274,9 +10274,9 @@
       </w:tcPr>
     </w:tblStylePr>
   </w:style>
-  <w:style w:type="table" w:styleId="47">
+  <w:style w:type="table" w:styleId="740">
     <w:name w:val="Grid Table 5 Dark"/>
-    <w:basedOn w:val="665"/>
+    <w:basedOn w:val="891"/>
     <w:uiPriority w:val="99"/>
     <w:pPr>
       <w:pBdr/>
@@ -10502,9 +10502,9 @@
       </w:tcPr>
     </w:tblStylePr>
   </w:style>
-  <w:style w:type="table" w:styleId="48">
+  <w:style w:type="table" w:styleId="741">
     <w:name w:val="Grid Table 5 Dark- Accent 1"/>
-    <w:basedOn w:val="665"/>
+    <w:basedOn w:val="891"/>
     <w:uiPriority w:val="99"/>
     <w:pPr>
       <w:pBdr/>
@@ -10730,9 +10730,9 @@
       </w:tcPr>
     </w:tblStylePr>
   </w:style>
-  <w:style w:type="table" w:styleId="49">
+  <w:style w:type="table" w:styleId="742">
     <w:name w:val="Grid Table 5 Dark - Accent 2"/>
-    <w:basedOn w:val="665"/>
+    <w:basedOn w:val="891"/>
     <w:uiPriority w:val="99"/>
     <w:pPr>
       <w:pBdr/>
@@ -10958,9 +10958,9 @@
       </w:tcPr>
     </w:tblStylePr>
   </w:style>
-  <w:style w:type="table" w:styleId="50">
+  <w:style w:type="table" w:styleId="743">
     <w:name w:val="Grid Table 5 Dark - Accent 3"/>
-    <w:basedOn w:val="665"/>
+    <w:basedOn w:val="891"/>
     <w:uiPriority w:val="99"/>
     <w:pPr>
       <w:pBdr/>
@@ -11186,9 +11186,9 @@
       </w:tcPr>
     </w:tblStylePr>
   </w:style>
-  <w:style w:type="table" w:styleId="51">
+  <w:style w:type="table" w:styleId="744">
     <w:name w:val="Grid Table 5 Dark- Accent 4"/>
-    <w:basedOn w:val="665"/>
+    <w:basedOn w:val="891"/>
     <w:uiPriority w:val="99"/>
     <w:pPr>
       <w:pBdr/>
@@ -11414,9 +11414,9 @@
       </w:tcPr>
     </w:tblStylePr>
   </w:style>
-  <w:style w:type="table" w:styleId="52">
+  <w:style w:type="table" w:styleId="745">
     <w:name w:val="Grid Table 5 Dark - Accent 5"/>
-    <w:basedOn w:val="665"/>
+    <w:basedOn w:val="891"/>
     <w:uiPriority w:val="99"/>
     <w:pPr>
       <w:pBdr/>
@@ -11642,9 +11642,9 @@
       </w:tcPr>
     </w:tblStylePr>
   </w:style>
-  <w:style w:type="table" w:styleId="53">
+  <w:style w:type="table" w:styleId="746">
     <w:name w:val="Grid Table 5 Dark - Accent 6"/>
-    <w:basedOn w:val="665"/>
+    <w:basedOn w:val="891"/>
     <w:uiPriority w:val="99"/>
     <w:pPr>
       <w:pBdr/>
@@ -11870,9 +11870,9 @@
       </w:tcPr>
     </w:tblStylePr>
   </w:style>
-  <w:style w:type="table" w:styleId="54">
+  <w:style w:type="table" w:styleId="747">
     <w:name w:val="Grid Table 6 Colorful"/>
-    <w:basedOn w:val="665"/>
+    <w:basedOn w:val="891"/>
     <w:uiPriority w:val="99"/>
     <w:pPr>
       <w:pBdr/>
@@ -12100,9 +12100,9 @@
       </w:tcPr>
     </w:tblStylePr>
   </w:style>
-  <w:style w:type="table" w:styleId="55">
+  <w:style w:type="table" w:styleId="748">
     <w:name w:val="Grid Table 6 Colorful - Accent 1"/>
-    <w:basedOn w:val="665"/>
+    <w:basedOn w:val="891"/>
     <w:uiPriority w:val="99"/>
     <w:pPr>
       <w:pBdr/>
@@ -12330,9 +12330,9 @@
       </w:tcPr>
     </w:tblStylePr>
   </w:style>
-  <w:style w:type="table" w:styleId="56">
+  <w:style w:type="table" w:styleId="749">
     <w:name w:val="Grid Table 6 Colorful - Accent 2"/>
-    <w:basedOn w:val="665"/>
+    <w:basedOn w:val="891"/>
     <w:uiPriority w:val="99"/>
     <w:pPr>
       <w:pBdr/>
@@ -12560,9 +12560,9 @@
       </w:tcPr>
     </w:tblStylePr>
   </w:style>
-  <w:style w:type="table" w:styleId="57">
+  <w:style w:type="table" w:styleId="750">
     <w:name w:val="Grid Table 6 Colorful - Accent 3"/>
-    <w:basedOn w:val="665"/>
+    <w:basedOn w:val="891"/>
     <w:uiPriority w:val="99"/>
     <w:pPr>
       <w:pBdr/>
@@ -12790,9 +12790,9 @@
       </w:tcPr>
     </w:tblStylePr>
   </w:style>
-  <w:style w:type="table" w:styleId="58">
+  <w:style w:type="table" w:styleId="751">
     <w:name w:val="Grid Table 6 Colorful - Accent 4"/>
-    <w:basedOn w:val="665"/>
+    <w:basedOn w:val="891"/>
     <w:uiPriority w:val="99"/>
     <w:pPr>
       <w:pBdr/>
@@ -13020,9 +13020,9 @@
       </w:tcPr>
     </w:tblStylePr>
   </w:style>
-  <w:style w:type="table" w:styleId="59">
+  <w:style w:type="table" w:styleId="752">
     <w:name w:val="Grid Table 6 Colorful - Accent 5"/>
-    <w:basedOn w:val="665"/>
+    <w:basedOn w:val="891"/>
     <w:uiPriority w:val="99"/>
     <w:pPr>
       <w:pBdr/>
@@ -13250,9 +13250,9 @@
       </w:tcPr>
     </w:tblStylePr>
   </w:style>
-  <w:style w:type="table" w:styleId="60">
+  <w:style w:type="table" w:styleId="753">
     <w:name w:val="Grid Table 6 Colorful - Accent 6"/>
-    <w:basedOn w:val="665"/>
+    <w:basedOn w:val="891"/>
     <w:uiPriority w:val="99"/>
     <w:pPr>
       <w:pBdr/>
@@ -13480,9 +13480,9 @@
       </w:tcPr>
     </w:tblStylePr>
   </w:style>
-  <w:style w:type="table" w:styleId="61">
+  <w:style w:type="table" w:styleId="754">
     <w:name w:val="Grid Table 7 Colorful"/>
-    <w:basedOn w:val="665"/>
+    <w:basedOn w:val="891"/>
     <w:uiPriority w:val="99"/>
     <w:pPr>
       <w:pBdr/>
@@ -13584,11 +13584,11 @@
         <w:tblBorders/>
       </w:tblPr>
       <w:tcPr>
-        <w:shd w:color="ffffff"/>
+        <w:shd w:val="clear" w:color="ffffff"/>
         <w:tcBorders>
-          <w:top w:val="none"/>
-          <w:left w:val="none"/>
-          <w:bottom w:val="none"/>
+          <w:top w:val="none" w:color="000000" w:sz="4" w:space="0"/>
+          <w:left w:val="none" w:color="000000" w:sz="4" w:space="0"/>
+          <w:bottom w:val="none" w:color="000000" w:sz="4" w:space="0"/>
           <w:right w:val="single" w:color="000000" w:themeColor="text1" w:themeTint="80" w:sz="4" w:space="0"/>
         </w:tcBorders>
       </w:tcPr>
@@ -13611,10 +13611,10 @@
       <w:tcPr>
         <w:shd w:val="clear" w:color="ffffff" w:themeColor="light1" w:fill="ffffff" w:themeFill="light1"/>
         <w:tcBorders>
-          <w:top w:val="none"/>
-          <w:left w:val="none"/>
+          <w:top w:val="none" w:color="000000" w:sz="4" w:space="0"/>
+          <w:left w:val="none" w:color="000000" w:sz="4" w:space="0"/>
           <w:bottom w:val="single" w:color="000000" w:themeColor="text1" w:themeTint="80" w:sz="4" w:space="0"/>
-          <w:right w:val="none"/>
+          <w:right w:val="none" w:color="000000" w:sz="4" w:space="0"/>
         </w:tcBorders>
       </w:tcPr>
     </w:tblStylePr>
@@ -13634,12 +13634,12 @@
         <w:tblBorders/>
       </w:tblPr>
       <w:tcPr>
-        <w:shd w:color="ffffff"/>
+        <w:shd w:val="clear" w:color="ffffff"/>
         <w:tcBorders>
-          <w:top w:val="none"/>
+          <w:top w:val="none" w:color="000000" w:sz="4" w:space="0"/>
           <w:left w:val="single" w:color="000000" w:themeColor="text1" w:themeTint="80" w:sz="4" w:space="0"/>
-          <w:bottom w:val="none"/>
-          <w:right w:val="none"/>
+          <w:bottom w:val="none" w:color="000000" w:sz="4" w:space="0"/>
+          <w:right w:val="none" w:color="000000" w:sz="4" w:space="0"/>
         </w:tcBorders>
       </w:tcPr>
     </w:tblStylePr>
@@ -13662,9 +13662,9 @@
         <w:shd w:val="clear" w:color="ffffff" w:themeColor="light1" w:fill="ffffff" w:themeFill="light1"/>
         <w:tcBorders>
           <w:top w:val="single" w:color="000000" w:themeColor="text1" w:themeTint="80" w:sz="4" w:space="0"/>
-          <w:left w:val="none"/>
-          <w:bottom w:val="none"/>
-          <w:right w:val="none"/>
+          <w:left w:val="none" w:color="000000" w:sz="4" w:space="0"/>
+          <w:bottom w:val="none" w:color="000000" w:sz="4" w:space="0"/>
+          <w:right w:val="none" w:color="000000" w:sz="4" w:space="0"/>
         </w:tcBorders>
       </w:tcPr>
     </w:tblStylePr>
@@ -13734,9 +13734,9 @@
       </w:tcPr>
     </w:tblStylePr>
   </w:style>
-  <w:style w:type="table" w:styleId="62">
+  <w:style w:type="table" w:styleId="755">
     <w:name w:val="Grid Table 7 Colorful - Accent 1"/>
-    <w:basedOn w:val="665"/>
+    <w:basedOn w:val="891"/>
     <w:uiPriority w:val="99"/>
     <w:pPr>
       <w:pBdr/>
@@ -13838,11 +13838,11 @@
         <w:tblBorders/>
       </w:tblPr>
       <w:tcPr>
-        <w:shd w:color="ffffff"/>
+        <w:shd w:val="clear" w:color="ffffff"/>
         <w:tcBorders>
-          <w:top w:val="none"/>
-          <w:left w:val="none"/>
-          <w:bottom w:val="none"/>
+          <w:top w:val="none" w:color="000000" w:sz="4" w:space="0"/>
+          <w:left w:val="none" w:color="000000" w:sz="4" w:space="0"/>
+          <w:bottom w:val="none" w:color="000000" w:sz="4" w:space="0"/>
           <w:right w:val="single" w:color="000000" w:themeColor="accent1" w:themeTint="80" w:sz="4" w:space="0"/>
         </w:tcBorders>
       </w:tcPr>
@@ -13865,10 +13865,10 @@
       <w:tcPr>
         <w:shd w:val="clear" w:color="ffffff" w:themeColor="light1" w:fill="ffffff" w:themeFill="light1"/>
         <w:tcBorders>
-          <w:top w:val="none"/>
-          <w:left w:val="none"/>
+          <w:top w:val="none" w:color="000000" w:sz="4" w:space="0"/>
+          <w:left w:val="none" w:color="000000" w:sz="4" w:space="0"/>
           <w:bottom w:val="single" w:color="000000" w:themeColor="accent1" w:themeTint="80" w:sz="4" w:space="0"/>
-          <w:right w:val="none"/>
+          <w:right w:val="none" w:color="000000" w:sz="4" w:space="0"/>
         </w:tcBorders>
       </w:tcPr>
     </w:tblStylePr>
@@ -13888,12 +13888,12 @@
         <w:tblBorders/>
       </w:tblPr>
       <w:tcPr>
-        <w:shd w:color="ffffff"/>
+        <w:shd w:val="clear" w:color="ffffff"/>
         <w:tcBorders>
-          <w:top w:val="none"/>
+          <w:top w:val="none" w:color="000000" w:sz="4" w:space="0"/>
           <w:left w:val="single" w:color="000000" w:themeColor="accent1" w:themeTint="80" w:sz="4" w:space="0"/>
-          <w:bottom w:val="none"/>
-          <w:right w:val="none"/>
+          <w:bottom w:val="none" w:color="000000" w:sz="4" w:space="0"/>
+          <w:right w:val="none" w:color="000000" w:sz="4" w:space="0"/>
         </w:tcBorders>
       </w:tcPr>
     </w:tblStylePr>
@@ -13916,9 +13916,9 @@
         <w:shd w:val="clear" w:color="ffffff" w:themeColor="light1" w:fill="ffffff" w:themeFill="light1"/>
         <w:tcBorders>
           <w:top w:val="single" w:color="000000" w:themeColor="accent1" w:themeTint="80" w:sz="4" w:space="0"/>
-          <w:left w:val="none"/>
-          <w:bottom w:val="none"/>
-          <w:right w:val="none"/>
+          <w:left w:val="none" w:color="000000" w:sz="4" w:space="0"/>
+          <w:bottom w:val="none" w:color="000000" w:sz="4" w:space="0"/>
+          <w:right w:val="none" w:color="000000" w:sz="4" w:space="0"/>
         </w:tcBorders>
       </w:tcPr>
     </w:tblStylePr>
@@ -13988,9 +13988,9 @@
       </w:tcPr>
     </w:tblStylePr>
   </w:style>
-  <w:style w:type="table" w:styleId="63">
+  <w:style w:type="table" w:styleId="756">
     <w:name w:val="Grid Table 7 Colorful - Accent 2"/>
-    <w:basedOn w:val="665"/>
+    <w:basedOn w:val="891"/>
     <w:uiPriority w:val="99"/>
     <w:pPr>
       <w:pBdr/>
@@ -14092,11 +14092,11 @@
         <w:tblBorders/>
       </w:tblPr>
       <w:tcPr>
-        <w:shd w:color="ffffff"/>
+        <w:shd w:val="clear" w:color="ffffff"/>
         <w:tcBorders>
-          <w:top w:val="none"/>
-          <w:left w:val="none"/>
-          <w:bottom w:val="none"/>
+          <w:top w:val="none" w:color="000000" w:sz="4" w:space="0"/>
+          <w:left w:val="none" w:color="000000" w:sz="4" w:space="0"/>
+          <w:bottom w:val="none" w:color="000000" w:sz="4" w:space="0"/>
           <w:right w:val="single" w:color="000000" w:themeColor="accent2" w:themeTint="97" w:sz="4" w:space="0"/>
         </w:tcBorders>
       </w:tcPr>
@@ -14119,10 +14119,10 @@
       <w:tcPr>
         <w:shd w:val="clear" w:color="ffffff" w:themeColor="light1" w:fill="ffffff" w:themeFill="light1"/>
         <w:tcBorders>
-          <w:top w:val="none"/>
-          <w:left w:val="none"/>
+          <w:top w:val="none" w:color="000000" w:sz="4" w:space="0"/>
+          <w:left w:val="none" w:color="000000" w:sz="4" w:space="0"/>
           <w:bottom w:val="single" w:color="000000" w:themeColor="accent2" w:themeTint="97" w:sz="4" w:space="0"/>
-          <w:right w:val="none"/>
+          <w:right w:val="none" w:color="000000" w:sz="4" w:space="0"/>
         </w:tcBorders>
       </w:tcPr>
     </w:tblStylePr>
@@ -14142,12 +14142,12 @@
         <w:tblBorders/>
       </w:tblPr>
       <w:tcPr>
-        <w:shd w:color="ffffff"/>
+        <w:shd w:val="clear" w:color="ffffff"/>
         <w:tcBorders>
-          <w:top w:val="none"/>
+          <w:top w:val="none" w:color="000000" w:sz="4" w:space="0"/>
           <w:left w:val="single" w:color="000000" w:themeColor="accent2" w:themeTint="97" w:sz="4" w:space="0"/>
-          <w:bottom w:val="none"/>
-          <w:right w:val="none"/>
+          <w:bottom w:val="none" w:color="000000" w:sz="4" w:space="0"/>
+          <w:right w:val="none" w:color="000000" w:sz="4" w:space="0"/>
         </w:tcBorders>
       </w:tcPr>
     </w:tblStylePr>
@@ -14170,9 +14170,9 @@
         <w:shd w:val="clear" w:color="ffffff" w:themeColor="light1" w:fill="ffffff" w:themeFill="light1"/>
         <w:tcBorders>
           <w:top w:val="single" w:color="000000" w:themeColor="accent2" w:themeTint="97" w:sz="4" w:space="0"/>
-          <w:left w:val="none"/>
-          <w:bottom w:val="none"/>
-          <w:right w:val="none"/>
+          <w:left w:val="none" w:color="000000" w:sz="4" w:space="0"/>
+          <w:bottom w:val="none" w:color="000000" w:sz="4" w:space="0"/>
+          <w:right w:val="none" w:color="000000" w:sz="4" w:space="0"/>
         </w:tcBorders>
       </w:tcPr>
     </w:tblStylePr>
@@ -14242,9 +14242,9 @@
       </w:tcPr>
     </w:tblStylePr>
   </w:style>
-  <w:style w:type="table" w:styleId="64">
+  <w:style w:type="table" w:styleId="757">
     <w:name w:val="Grid Table 7 Colorful - Accent 3"/>
-    <w:basedOn w:val="665"/>
+    <w:basedOn w:val="891"/>
     <w:uiPriority w:val="99"/>
     <w:pPr>
       <w:pBdr/>
@@ -14346,11 +14346,11 @@
         <w:tblBorders/>
       </w:tblPr>
       <w:tcPr>
-        <w:shd w:color="ffffff"/>
+        <w:shd w:val="clear" w:color="ffffff"/>
         <w:tcBorders>
-          <w:top w:val="none"/>
-          <w:left w:val="none"/>
-          <w:bottom w:val="none"/>
+          <w:top w:val="none" w:color="000000" w:sz="4" w:space="0"/>
+          <w:left w:val="none" w:color="000000" w:sz="4" w:space="0"/>
+          <w:bottom w:val="none" w:color="000000" w:sz="4" w:space="0"/>
           <w:right w:val="single" w:color="000000" w:themeColor="accent3" w:themeTint="FE" w:sz="4" w:space="0"/>
         </w:tcBorders>
       </w:tcPr>
@@ -14373,10 +14373,10 @@
       <w:tcPr>
         <w:shd w:val="clear" w:color="ffffff" w:themeColor="light1" w:fill="ffffff" w:themeFill="light1"/>
         <w:tcBorders>
-          <w:top w:val="none"/>
-          <w:left w:val="none"/>
+          <w:top w:val="none" w:color="000000" w:sz="4" w:space="0"/>
+          <w:left w:val="none" w:color="000000" w:sz="4" w:space="0"/>
           <w:bottom w:val="single" w:color="000000" w:themeColor="accent3" w:themeTint="FE" w:sz="4" w:space="0"/>
-          <w:right w:val="none"/>
+          <w:right w:val="none" w:color="000000" w:sz="4" w:space="0"/>
         </w:tcBorders>
       </w:tcPr>
     </w:tblStylePr>
@@ -14396,12 +14396,12 @@
         <w:tblBorders/>
       </w:tblPr>
       <w:tcPr>
-        <w:shd w:color="ffffff"/>
+        <w:shd w:val="clear" w:color="ffffff"/>
         <w:tcBorders>
-          <w:top w:val="none"/>
+          <w:top w:val="none" w:color="000000" w:sz="4" w:space="0"/>
           <w:left w:val="single" w:color="000000" w:themeColor="accent3" w:themeTint="FE" w:sz="4" w:space="0"/>
-          <w:bottom w:val="none"/>
-          <w:right w:val="none"/>
+          <w:bottom w:val="none" w:color="000000" w:sz="4" w:space="0"/>
+          <w:right w:val="none" w:color="000000" w:sz="4" w:space="0"/>
         </w:tcBorders>
       </w:tcPr>
     </w:tblStylePr>
@@ -14424,9 +14424,9 @@
         <w:shd w:val="clear" w:color="ffffff" w:themeColor="light1" w:fill="ffffff" w:themeFill="light1"/>
         <w:tcBorders>
           <w:top w:val="single" w:color="000000" w:themeColor="accent3" w:themeTint="FE" w:sz="4" w:space="0"/>
-          <w:left w:val="none"/>
-          <w:bottom w:val="none"/>
-          <w:right w:val="none"/>
+          <w:left w:val="none" w:color="000000" w:sz="4" w:space="0"/>
+          <w:bottom w:val="none" w:color="000000" w:sz="4" w:space="0"/>
+          <w:right w:val="none" w:color="000000" w:sz="4" w:space="0"/>
         </w:tcBorders>
       </w:tcPr>
     </w:tblStylePr>
@@ -14496,9 +14496,9 @@
       </w:tcPr>
     </w:tblStylePr>
   </w:style>
-  <w:style w:type="table" w:styleId="65">
+  <w:style w:type="table" w:styleId="758">
     <w:name w:val="Grid Table 7 Colorful - Accent 4"/>
-    <w:basedOn w:val="665"/>
+    <w:basedOn w:val="891"/>
     <w:uiPriority w:val="99"/>
     <w:pPr>
       <w:pBdr/>
@@ -14600,11 +14600,11 @@
         <w:tblBorders/>
       </w:tblPr>
       <w:tcPr>
-        <w:shd w:color="ffffff"/>
+        <w:shd w:val="clear" w:color="ffffff"/>
         <w:tcBorders>
-          <w:top w:val="none"/>
-          <w:left w:val="none"/>
-          <w:bottom w:val="none"/>
+          <w:top w:val="none" w:color="000000" w:sz="4" w:space="0"/>
+          <w:left w:val="none" w:color="000000" w:sz="4" w:space="0"/>
+          <w:bottom w:val="none" w:color="000000" w:sz="4" w:space="0"/>
           <w:right w:val="single" w:color="000000" w:themeColor="accent4" w:themeTint="9A" w:sz="4" w:space="0"/>
         </w:tcBorders>
       </w:tcPr>
@@ -14627,10 +14627,10 @@
       <w:tcPr>
         <w:shd w:val="clear" w:color="ffffff" w:themeColor="light1" w:fill="ffffff" w:themeFill="light1"/>
         <w:tcBorders>
-          <w:top w:val="none"/>
-          <w:left w:val="none"/>
+          <w:top w:val="none" w:color="000000" w:sz="4" w:space="0"/>
+          <w:left w:val="none" w:color="000000" w:sz="4" w:space="0"/>
           <w:bottom w:val="single" w:color="000000" w:themeColor="accent4" w:themeTint="9A" w:sz="4" w:space="0"/>
-          <w:right w:val="none"/>
+          <w:right w:val="none" w:color="000000" w:sz="4" w:space="0"/>
         </w:tcBorders>
       </w:tcPr>
     </w:tblStylePr>
@@ -14650,12 +14650,12 @@
         <w:tblBorders/>
       </w:tblPr>
       <w:tcPr>
-        <w:shd w:color="ffffff"/>
+        <w:shd w:val="clear" w:color="ffffff"/>
         <w:tcBorders>
-          <w:top w:val="none"/>
+          <w:top w:val="none" w:color="000000" w:sz="4" w:space="0"/>
           <w:left w:val="single" w:color="000000" w:themeColor="accent4" w:themeTint="9A" w:sz="4" w:space="0"/>
-          <w:bottom w:val="none"/>
-          <w:right w:val="none"/>
+          <w:bottom w:val="none" w:color="000000" w:sz="4" w:space="0"/>
+          <w:right w:val="none" w:color="000000" w:sz="4" w:space="0"/>
         </w:tcBorders>
       </w:tcPr>
     </w:tblStylePr>
@@ -14678,9 +14678,9 @@
         <w:shd w:val="clear" w:color="ffffff" w:themeColor="light1" w:fill="ffffff" w:themeFill="light1"/>
         <w:tcBorders>
           <w:top w:val="single" w:color="000000" w:themeColor="accent4" w:themeTint="9A" w:sz="4" w:space="0"/>
-          <w:left w:val="none"/>
-          <w:bottom w:val="none"/>
-          <w:right w:val="none"/>
+          <w:left w:val="none" w:color="000000" w:sz="4" w:space="0"/>
+          <w:bottom w:val="none" w:color="000000" w:sz="4" w:space="0"/>
+          <w:right w:val="none" w:color="000000" w:sz="4" w:space="0"/>
         </w:tcBorders>
       </w:tcPr>
     </w:tblStylePr>
@@ -14750,9 +14750,9 @@
       </w:tcPr>
     </w:tblStylePr>
   </w:style>
-  <w:style w:type="table" w:styleId="66">
+  <w:style w:type="table" w:styleId="759">
     <w:name w:val="Grid Table 7 Colorful - Accent 5"/>
-    <w:basedOn w:val="665"/>
+    <w:basedOn w:val="891"/>
     <w:uiPriority w:val="99"/>
     <w:pPr>
       <w:pBdr/>
@@ -14854,11 +14854,11 @@
         <w:tblBorders/>
       </w:tblPr>
       <w:tcPr>
-        <w:shd w:color="ffffff"/>
+        <w:shd w:val="clear" w:color="ffffff"/>
         <w:tcBorders>
-          <w:top w:val="none"/>
-          <w:left w:val="none"/>
-          <w:bottom w:val="none"/>
+          <w:top w:val="none" w:color="000000" w:sz="4" w:space="0"/>
+          <w:left w:val="none" w:color="000000" w:sz="4" w:space="0"/>
+          <w:bottom w:val="none" w:color="000000" w:sz="4" w:space="0"/>
           <w:right w:val="single" w:color="000000" w:themeColor="accent5" w:themeTint="90" w:sz="4" w:space="0"/>
         </w:tcBorders>
       </w:tcPr>
@@ -14881,10 +14881,10 @@
       <w:tcPr>
         <w:shd w:val="clear" w:color="ffffff" w:themeColor="light1" w:fill="ffffff" w:themeFill="light1"/>
         <w:tcBorders>
-          <w:top w:val="none"/>
-          <w:left w:val="none"/>
+          <w:top w:val="none" w:color="000000" w:sz="4" w:space="0"/>
+          <w:left w:val="none" w:color="000000" w:sz="4" w:space="0"/>
           <w:bottom w:val="single" w:color="000000" w:themeColor="accent5" w:themeTint="90" w:sz="4" w:space="0"/>
-          <w:right w:val="none"/>
+          <w:right w:val="none" w:color="000000" w:sz="4" w:space="0"/>
         </w:tcBorders>
       </w:tcPr>
     </w:tblStylePr>
@@ -14904,12 +14904,12 @@
         <w:tblBorders/>
       </w:tblPr>
       <w:tcPr>
-        <w:shd w:color="ffffff"/>
+        <w:shd w:val="clear" w:color="ffffff"/>
         <w:tcBorders>
-          <w:top w:val="none"/>
+          <w:top w:val="none" w:color="000000" w:sz="4" w:space="0"/>
           <w:left w:val="single" w:color="000000" w:themeColor="accent5" w:themeTint="90" w:sz="4" w:space="0"/>
-          <w:bottom w:val="none"/>
-          <w:right w:val="none"/>
+          <w:bottom w:val="none" w:color="000000" w:sz="4" w:space="0"/>
+          <w:right w:val="none" w:color="000000" w:sz="4" w:space="0"/>
         </w:tcBorders>
       </w:tcPr>
     </w:tblStylePr>
@@ -14932,9 +14932,9 @@
         <w:shd w:val="clear" w:color="ffffff" w:themeColor="light1" w:fill="ffffff" w:themeFill="light1"/>
         <w:tcBorders>
           <w:top w:val="single" w:color="000000" w:themeColor="accent5" w:themeTint="90" w:sz="4" w:space="0"/>
-          <w:left w:val="none"/>
-          <w:bottom w:val="none"/>
-          <w:right w:val="none"/>
+          <w:left w:val="none" w:color="000000" w:sz="4" w:space="0"/>
+          <w:bottom w:val="none" w:color="000000" w:sz="4" w:space="0"/>
+          <w:right w:val="none" w:color="000000" w:sz="4" w:space="0"/>
         </w:tcBorders>
       </w:tcPr>
     </w:tblStylePr>
@@ -15004,9 +15004,9 @@
       </w:tcPr>
     </w:tblStylePr>
   </w:style>
-  <w:style w:type="table" w:styleId="67">
+  <w:style w:type="table" w:styleId="760">
     <w:name w:val="Grid Table 7 Colorful - Accent 6"/>
-    <w:basedOn w:val="665"/>
+    <w:basedOn w:val="891"/>
     <w:uiPriority w:val="99"/>
     <w:pPr>
       <w:pBdr/>
@@ -15108,11 +15108,11 @@
         <w:tblBorders/>
       </w:tblPr>
       <w:tcPr>
-        <w:shd w:color="ffffff"/>
+        <w:shd w:val="clear" w:color="ffffff"/>
         <w:tcBorders>
-          <w:top w:val="none"/>
-          <w:left w:val="none"/>
-          <w:bottom w:val="none"/>
+          <w:top w:val="none" w:color="000000" w:sz="4" w:space="0"/>
+          <w:left w:val="none" w:color="000000" w:sz="4" w:space="0"/>
+          <w:bottom w:val="none" w:color="000000" w:sz="4" w:space="0"/>
           <w:right w:val="single" w:color="000000" w:themeColor="accent6" w:themeTint="90" w:sz="4" w:space="0"/>
         </w:tcBorders>
       </w:tcPr>
@@ -15135,10 +15135,10 @@
       <w:tcPr>
         <w:shd w:val="clear" w:color="ffffff" w:themeColor="light1" w:fill="ffffff" w:themeFill="light1"/>
         <w:tcBorders>
-          <w:top w:val="none"/>
-          <w:left w:val="none"/>
+          <w:top w:val="none" w:color="000000" w:sz="4" w:space="0"/>
+          <w:left w:val="none" w:color="000000" w:sz="4" w:space="0"/>
           <w:bottom w:val="single" w:color="000000" w:themeColor="accent6" w:themeTint="90" w:sz="4" w:space="0"/>
-          <w:right w:val="none"/>
+          <w:right w:val="none" w:color="000000" w:sz="4" w:space="0"/>
         </w:tcBorders>
       </w:tcPr>
     </w:tblStylePr>
@@ -15158,12 +15158,12 @@
         <w:tblBorders/>
       </w:tblPr>
       <w:tcPr>
-        <w:shd w:color="ffffff"/>
+        <w:shd w:val="clear" w:color="ffffff"/>
         <w:tcBorders>
-          <w:top w:val="none"/>
+          <w:top w:val="none" w:color="000000" w:sz="4" w:space="0"/>
           <w:left w:val="single" w:color="000000" w:themeColor="accent6" w:themeTint="90" w:sz="4" w:space="0"/>
-          <w:bottom w:val="none"/>
-          <w:right w:val="none"/>
+          <w:bottom w:val="none" w:color="000000" w:sz="4" w:space="0"/>
+          <w:right w:val="none" w:color="000000" w:sz="4" w:space="0"/>
         </w:tcBorders>
       </w:tcPr>
     </w:tblStylePr>
@@ -15186,9 +15186,9 @@
         <w:shd w:val="clear" w:color="ffffff" w:themeColor="light1" w:fill="ffffff" w:themeFill="light1"/>
         <w:tcBorders>
           <w:top w:val="single" w:color="000000" w:themeColor="accent6" w:themeTint="90" w:sz="4" w:space="0"/>
-          <w:left w:val="none"/>
-          <w:bottom w:val="none"/>
-          <w:right w:val="none"/>
+          <w:left w:val="none" w:color="000000" w:sz="4" w:space="0"/>
+          <w:bottom w:val="none" w:color="000000" w:sz="4" w:space="0"/>
+          <w:right w:val="none" w:color="000000" w:sz="4" w:space="0"/>
         </w:tcBorders>
       </w:tcPr>
     </w:tblStylePr>
@@ -15258,9 +15258,9 @@
       </w:tcPr>
     </w:tblStylePr>
   </w:style>
-  <w:style w:type="table" w:styleId="68">
+  <w:style w:type="table" w:styleId="761">
     <w:name w:val="List Table 1 Light"/>
-    <w:basedOn w:val="665"/>
+    <w:basedOn w:val="891"/>
     <w:uiPriority w:val="99"/>
     <w:pPr>
       <w:pBdr/>
@@ -15474,9 +15474,9 @@
       </w:tcPr>
     </w:tblStylePr>
   </w:style>
-  <w:style w:type="table" w:styleId="69">
+  <w:style w:type="table" w:styleId="762">
     <w:name w:val="List Table 1 Light - Accent 1"/>
-    <w:basedOn w:val="665"/>
+    <w:basedOn w:val="891"/>
     <w:uiPriority w:val="99"/>
     <w:pPr>
       <w:pBdr/>
@@ -15690,9 +15690,9 @@
       </w:tcPr>
     </w:tblStylePr>
   </w:style>
-  <w:style w:type="table" w:styleId="70">
+  <w:style w:type="table" w:styleId="763">
     <w:name w:val="List Table 1 Light - Accent 2"/>
-    <w:basedOn w:val="665"/>
+    <w:basedOn w:val="891"/>
     <w:uiPriority w:val="99"/>
     <w:pPr>
       <w:pBdr/>
@@ -15906,9 +15906,9 @@
       </w:tcPr>
     </w:tblStylePr>
   </w:style>
-  <w:style w:type="table" w:styleId="71">
+  <w:style w:type="table" w:styleId="764">
     <w:name w:val="List Table 1 Light - Accent 3"/>
-    <w:basedOn w:val="665"/>
+    <w:basedOn w:val="891"/>
     <w:uiPriority w:val="99"/>
     <w:pPr>
       <w:pBdr/>
@@ -16122,9 +16122,9 @@
       </w:tcPr>
     </w:tblStylePr>
   </w:style>
-  <w:style w:type="table" w:styleId="72">
+  <w:style w:type="table" w:styleId="765">
     <w:name w:val="List Table 1 Light - Accent 4"/>
-    <w:basedOn w:val="665"/>
+    <w:basedOn w:val="891"/>
     <w:uiPriority w:val="99"/>
     <w:pPr>
       <w:pBdr/>
@@ -16338,9 +16338,9 @@
       </w:tcPr>
     </w:tblStylePr>
   </w:style>
-  <w:style w:type="table" w:styleId="73">
+  <w:style w:type="table" w:styleId="766">
     <w:name w:val="List Table 1 Light - Accent 5"/>
-    <w:basedOn w:val="665"/>
+    <w:basedOn w:val="891"/>
     <w:uiPriority w:val="99"/>
     <w:pPr>
       <w:pBdr/>
@@ -16554,9 +16554,9 @@
       </w:tcPr>
     </w:tblStylePr>
   </w:style>
-  <w:style w:type="table" w:styleId="74">
+  <w:style w:type="table" w:styleId="767">
     <w:name w:val="List Table 1 Light - Accent 6"/>
-    <w:basedOn w:val="665"/>
+    <w:basedOn w:val="891"/>
     <w:uiPriority w:val="99"/>
     <w:pPr>
       <w:pBdr/>
@@ -16770,9 +16770,9 @@
       </w:tcPr>
     </w:tblStylePr>
   </w:style>
-  <w:style w:type="table" w:styleId="75">
+  <w:style w:type="table" w:styleId="768">
     <w:name w:val="List Table 2"/>
-    <w:basedOn w:val="665"/>
+    <w:basedOn w:val="891"/>
     <w:uiPriority w:val="99"/>
     <w:pPr>
       <w:pBdr/>
@@ -17008,9 +17008,9 @@
       </w:tcPr>
     </w:tblStylePr>
   </w:style>
-  <w:style w:type="table" w:styleId="76">
+  <w:style w:type="table" w:styleId="769">
     <w:name w:val="List Table 2 - Accent 1"/>
-    <w:basedOn w:val="665"/>
+    <w:basedOn w:val="891"/>
     <w:uiPriority w:val="99"/>
     <w:pPr>
       <w:pBdr/>
@@ -17246,9 +17246,9 @@
       </w:tcPr>
     </w:tblStylePr>
   </w:style>
-  <w:style w:type="table" w:styleId="77">
+  <w:style w:type="table" w:styleId="770">
     <w:name w:val="List Table 2 - Accent 2"/>
-    <w:basedOn w:val="665"/>
+    <w:basedOn w:val="891"/>
     <w:uiPriority w:val="99"/>
     <w:pPr>
       <w:pBdr/>
@@ -17484,9 +17484,9 @@
       </w:tcPr>
     </w:tblStylePr>
   </w:style>
-  <w:style w:type="table" w:styleId="78">
+  <w:style w:type="table" w:styleId="771">
     <w:name w:val="List Table 2 - Accent 3"/>
-    <w:basedOn w:val="665"/>
+    <w:basedOn w:val="891"/>
     <w:uiPriority w:val="99"/>
     <w:pPr>
       <w:pBdr/>
@@ -17722,9 +17722,9 @@
       </w:tcPr>
     </w:tblStylePr>
   </w:style>
-  <w:style w:type="table" w:styleId="79">
+  <w:style w:type="table" w:styleId="772">
     <w:name w:val="List Table 2 - Accent 4"/>
-    <w:basedOn w:val="665"/>
+    <w:basedOn w:val="891"/>
     <w:uiPriority w:val="99"/>
     <w:pPr>
       <w:pBdr/>
@@ -17960,9 +17960,9 @@
       </w:tcPr>
     </w:tblStylePr>
   </w:style>
-  <w:style w:type="table" w:styleId="80">
+  <w:style w:type="table" w:styleId="773">
     <w:name w:val="List Table 2 - Accent 5"/>
-    <w:basedOn w:val="665"/>
+    <w:basedOn w:val="891"/>
     <w:uiPriority w:val="99"/>
     <w:pPr>
       <w:pBdr/>
@@ -18198,9 +18198,9 @@
       </w:tcPr>
     </w:tblStylePr>
   </w:style>
-  <w:style w:type="table" w:styleId="81">
+  <w:style w:type="table" w:styleId="774">
     <w:name w:val="List Table 2 - Accent 6"/>
-    <w:basedOn w:val="665"/>
+    <w:basedOn w:val="891"/>
     <w:uiPriority w:val="99"/>
     <w:pPr>
       <w:pBdr/>
@@ -18436,9 +18436,9 @@
       </w:tcPr>
     </w:tblStylePr>
   </w:style>
-  <w:style w:type="table" w:styleId="82">
+  <w:style w:type="table" w:styleId="775">
     <w:name w:val="List Table 3"/>
-    <w:basedOn w:val="665"/>
+    <w:basedOn w:val="891"/>
     <w:uiPriority w:val="99"/>
     <w:pPr>
       <w:pBdr/>
@@ -18664,9 +18664,9 @@
       </w:tcPr>
     </w:tblStylePr>
   </w:style>
-  <w:style w:type="table" w:styleId="83">
+  <w:style w:type="table" w:styleId="776">
     <w:name w:val="List Table 3 - Accent 1"/>
-    <w:basedOn w:val="665"/>
+    <w:basedOn w:val="891"/>
     <w:uiPriority w:val="99"/>
     <w:pPr>
       <w:pBdr/>
@@ -18892,9 +18892,9 @@
       </w:tcPr>
     </w:tblStylePr>
   </w:style>
-  <w:style w:type="table" w:styleId="84">
+  <w:style w:type="table" w:styleId="777">
     <w:name w:val="List Table 3 - Accent 2"/>
-    <w:basedOn w:val="665"/>
+    <w:basedOn w:val="891"/>
     <w:uiPriority w:val="99"/>
     <w:pPr>
       <w:pBdr/>
@@ -19120,9 +19120,9 @@
       </w:tcPr>
     </w:tblStylePr>
   </w:style>
-  <w:style w:type="table" w:styleId="85">
+  <w:style w:type="table" w:styleId="778">
     <w:name w:val="List Table 3 - Accent 3"/>
-    <w:basedOn w:val="665"/>
+    <w:basedOn w:val="891"/>
     <w:uiPriority w:val="99"/>
     <w:pPr>
       <w:pBdr/>
@@ -19348,9 +19348,9 @@
       </w:tcPr>
     </w:tblStylePr>
   </w:style>
-  <w:style w:type="table" w:styleId="86">
+  <w:style w:type="table" w:styleId="779">
     <w:name w:val="List Table 3 - Accent 4"/>
-    <w:basedOn w:val="665"/>
+    <w:basedOn w:val="891"/>
     <w:uiPriority w:val="99"/>
     <w:pPr>
       <w:pBdr/>
@@ -19576,9 +19576,9 @@
       </w:tcPr>
     </w:tblStylePr>
   </w:style>
-  <w:style w:type="table" w:styleId="87">
+  <w:style w:type="table" w:styleId="780">
     <w:name w:val="List Table 3 - Accent 5"/>
-    <w:basedOn w:val="665"/>
+    <w:basedOn w:val="891"/>
     <w:uiPriority w:val="99"/>
     <w:pPr>
       <w:pBdr/>
@@ -19804,9 +19804,9 @@
       </w:tcPr>
     </w:tblStylePr>
   </w:style>
-  <w:style w:type="table" w:styleId="88">
+  <w:style w:type="table" w:styleId="781">
     <w:name w:val="List Table 3 - Accent 6"/>
-    <w:basedOn w:val="665"/>
+    <w:basedOn w:val="891"/>
     <w:uiPriority w:val="99"/>
     <w:pPr>
       <w:pBdr/>
@@ -20032,9 +20032,9 @@
       </w:tcPr>
     </w:tblStylePr>
   </w:style>
-  <w:style w:type="table" w:styleId="89">
+  <w:style w:type="table" w:styleId="782">
     <w:name w:val="List Table 4"/>
-    <w:basedOn w:val="665"/>
+    <w:basedOn w:val="891"/>
     <w:uiPriority w:val="99"/>
     <w:pPr>
       <w:pBdr/>
@@ -20257,9 +20257,9 @@
       </w:tcPr>
     </w:tblStylePr>
   </w:style>
-  <w:style w:type="table" w:styleId="90">
+  <w:style w:type="table" w:styleId="783">
     <w:name w:val="List Table 4 - Accent 1"/>
-    <w:basedOn w:val="665"/>
+    <w:basedOn w:val="891"/>
     <w:uiPriority w:val="99"/>
     <w:pPr>
       <w:pBdr/>
@@ -20482,9 +20482,9 @@
       </w:tcPr>
     </w:tblStylePr>
   </w:style>
-  <w:style w:type="table" w:styleId="91">
+  <w:style w:type="table" w:styleId="784">
     <w:name w:val="List Table 4 - Accent 2"/>
-    <w:basedOn w:val="665"/>
+    <w:basedOn w:val="891"/>
     <w:uiPriority w:val="99"/>
     <w:pPr>
       <w:pBdr/>
@@ -20707,9 +20707,9 @@
       </w:tcPr>
     </w:tblStylePr>
   </w:style>
-  <w:style w:type="table" w:styleId="92">
+  <w:style w:type="table" w:styleId="785">
     <w:name w:val="List Table 4 - Accent 3"/>
-    <w:basedOn w:val="665"/>
+    <w:basedOn w:val="891"/>
     <w:uiPriority w:val="99"/>
     <w:pPr>
       <w:pBdr/>
@@ -20932,9 +20932,9 @@
       </w:tcPr>
     </w:tblStylePr>
   </w:style>
-  <w:style w:type="table" w:styleId="93">
+  <w:style w:type="table" w:styleId="786">
     <w:name w:val="List Table 4 - Accent 4"/>
-    <w:basedOn w:val="665"/>
+    <w:basedOn w:val="891"/>
     <w:uiPriority w:val="99"/>
     <w:pPr>
       <w:pBdr/>
@@ -21157,9 +21157,9 @@
       </w:tcPr>
     </w:tblStylePr>
   </w:style>
-  <w:style w:type="table" w:styleId="94">
+  <w:style w:type="table" w:styleId="787">
     <w:name w:val="List Table 4 - Accent 5"/>
-    <w:basedOn w:val="665"/>
+    <w:basedOn w:val="891"/>
     <w:uiPriority w:val="99"/>
     <w:pPr>
       <w:pBdr/>
@@ -21382,9 +21382,9 @@
       </w:tcPr>
     </w:tblStylePr>
   </w:style>
-  <w:style w:type="table" w:styleId="95">
+  <w:style w:type="table" w:styleId="788">
     <w:name w:val="List Table 4 - Accent 6"/>
-    <w:basedOn w:val="665"/>
+    <w:basedOn w:val="891"/>
     <w:uiPriority w:val="99"/>
     <w:pPr>
       <w:pBdr/>
@@ -21607,9 +21607,9 @@
       </w:tcPr>
     </w:tblStylePr>
   </w:style>
-  <w:style w:type="table" w:styleId="96">
+  <w:style w:type="table" w:styleId="789">
     <w:name w:val="List Table 5 Dark"/>
-    <w:basedOn w:val="665"/>
+    <w:basedOn w:val="891"/>
     <w:uiPriority w:val="99"/>
     <w:pPr>
       <w:pBdr/>
@@ -21849,9 +21849,9 @@
       </w:tcPr>
     </w:tblStylePr>
   </w:style>
-  <w:style w:type="table" w:styleId="97">
+  <w:style w:type="table" w:styleId="790">
     <w:name w:val="List Table 5 Dark - Accent 1"/>
-    <w:basedOn w:val="665"/>
+    <w:basedOn w:val="891"/>
     <w:uiPriority w:val="99"/>
     <w:pPr>
       <w:pBdr/>
@@ -22091,9 +22091,9 @@
       </w:tcPr>
     </w:tblStylePr>
   </w:style>
-  <w:style w:type="table" w:styleId="98">
+  <w:style w:type="table" w:styleId="791">
     <w:name w:val="List Table 5 Dark - Accent 2"/>
-    <w:basedOn w:val="665"/>
+    <w:basedOn w:val="891"/>
     <w:uiPriority w:val="99"/>
     <w:pPr>
       <w:pBdr/>
@@ -22333,9 +22333,9 @@
       </w:tcPr>
     </w:tblStylePr>
   </w:style>
-  <w:style w:type="table" w:styleId="99">
+  <w:style w:type="table" w:styleId="792">
     <w:name w:val="List Table 5 Dark - Accent 3"/>
-    <w:basedOn w:val="665"/>
+    <w:basedOn w:val="891"/>
     <w:uiPriority w:val="99"/>
     <w:pPr>
       <w:pBdr/>
@@ -22575,9 +22575,9 @@
       </w:tcPr>
     </w:tblStylePr>
   </w:style>
-  <w:style w:type="table" w:styleId="100">
+  <w:style w:type="table" w:styleId="793">
     <w:name w:val="List Table 5 Dark - Accent 4"/>
-    <w:basedOn w:val="665"/>
+    <w:basedOn w:val="891"/>
     <w:uiPriority w:val="99"/>
     <w:pPr>
       <w:pBdr/>
@@ -22817,9 +22817,9 @@
       </w:tcPr>
     </w:tblStylePr>
   </w:style>
-  <w:style w:type="table" w:styleId="101">
+  <w:style w:type="table" w:styleId="794">
     <w:name w:val="List Table 5 Dark - Accent 5"/>
-    <w:basedOn w:val="665"/>
+    <w:basedOn w:val="891"/>
     <w:uiPriority w:val="99"/>
     <w:pPr>
       <w:pBdr/>
@@ -23059,9 +23059,9 @@
       </w:tcPr>
     </w:tblStylePr>
   </w:style>
-  <w:style w:type="table" w:styleId="102">
+  <w:style w:type="table" w:styleId="795">
     <w:name w:val="List Table 5 Dark - Accent 6"/>
-    <w:basedOn w:val="665"/>
+    <w:basedOn w:val="891"/>
     <w:uiPriority w:val="99"/>
     <w:pPr>
       <w:pBdr/>
@@ -23301,9 +23301,9 @@
       </w:tcPr>
     </w:tblStylePr>
   </w:style>
-  <w:style w:type="table" w:styleId="103">
+  <w:style w:type="table" w:styleId="796">
     <w:name w:val="List Table 6 Colorful"/>
-    <w:basedOn w:val="665"/>
+    <w:basedOn w:val="891"/>
     <w:uiPriority w:val="99"/>
     <w:pPr>
       <w:pBdr/>
@@ -23524,9 +23524,9 @@
       </w:tcPr>
     </w:tblStylePr>
   </w:style>
-  <w:style w:type="table" w:styleId="104">
+  <w:style w:type="table" w:styleId="797">
     <w:name w:val="List Table 6 Colorful - Accent 1"/>
-    <w:basedOn w:val="665"/>
+    <w:basedOn w:val="891"/>
     <w:uiPriority w:val="99"/>
     <w:pPr>
       <w:pBdr/>
@@ -23747,9 +23747,9 @@
       </w:tcPr>
     </w:tblStylePr>
   </w:style>
-  <w:style w:type="table" w:styleId="105">
+  <w:style w:type="table" w:styleId="798">
     <w:name w:val="List Table 6 Colorful - Accent 2"/>
-    <w:basedOn w:val="665"/>
+    <w:basedOn w:val="891"/>
     <w:uiPriority w:val="99"/>
     <w:pPr>
       <w:pBdr/>
@@ -23970,9 +23970,9 @@
       </w:tcPr>
     </w:tblStylePr>
   </w:style>
-  <w:style w:type="table" w:styleId="106">
+  <w:style w:type="table" w:styleId="799">
     <w:name w:val="List Table 6 Colorful - Accent 3"/>
-    <w:basedOn w:val="665"/>
+    <w:basedOn w:val="891"/>
     <w:uiPriority w:val="99"/>
     <w:pPr>
       <w:pBdr/>
@@ -24193,9 +24193,9 @@
       </w:tcPr>
     </w:tblStylePr>
   </w:style>
-  <w:style w:type="table" w:styleId="107">
+  <w:style w:type="table" w:styleId="800">
     <w:name w:val="List Table 6 Colorful - Accent 4"/>
-    <w:basedOn w:val="665"/>
+    <w:basedOn w:val="891"/>
     <w:uiPriority w:val="99"/>
     <w:pPr>
       <w:pBdr/>
@@ -24416,9 +24416,9 @@
       </w:tcPr>
     </w:tblStylePr>
   </w:style>
-  <w:style w:type="table" w:styleId="108">
+  <w:style w:type="table" w:styleId="801">
     <w:name w:val="List Table 6 Colorful - Accent 5"/>
-    <w:basedOn w:val="665"/>
+    <w:basedOn w:val="891"/>
     <w:uiPriority w:val="99"/>
     <w:pPr>
       <w:pBdr/>
@@ -24639,9 +24639,9 @@
       </w:tcPr>
     </w:tblStylePr>
   </w:style>
-  <w:style w:type="table" w:styleId="109">
+  <w:style w:type="table" w:styleId="802">
     <w:name w:val="List Table 6 Colorful - Accent 6"/>
-    <w:basedOn w:val="665"/>
+    <w:basedOn w:val="891"/>
     <w:uiPriority w:val="99"/>
     <w:pPr>
       <w:pBdr/>
@@ -24862,9 +24862,9 @@
       </w:tcPr>
     </w:tblStylePr>
   </w:style>
-  <w:style w:type="table" w:styleId="110">
+  <w:style w:type="table" w:styleId="803">
     <w:name w:val="List Table 7 Colorful"/>
-    <w:basedOn w:val="665"/>
+    <w:basedOn w:val="891"/>
     <w:uiPriority w:val="99"/>
     <w:pPr>
       <w:pBdr/>
@@ -24963,11 +24963,11 @@
         <w:tblBorders/>
       </w:tblPr>
       <w:tcPr>
-        <w:shd w:color="ffffff"/>
+        <w:shd w:val="clear" w:color="ffffff"/>
         <w:tcBorders>
-          <w:top w:val="none"/>
-          <w:left w:val="none"/>
-          <w:bottom w:val="none"/>
+          <w:top w:val="none" w:color="000000" w:sz="4" w:space="0"/>
+          <w:left w:val="none" w:color="000000" w:sz="4" w:space="0"/>
+          <w:bottom w:val="none" w:color="000000" w:sz="4" w:space="0"/>
           <w:right w:val="single" w:color="000000" w:themeColor="text1" w:themeTint="80" w:sz="4" w:space="0"/>
         </w:tcBorders>
       </w:tcPr>
@@ -24990,10 +24990,10 @@
       <w:tcPr>
         <w:shd w:val="clear" w:color="ffffff" w:themeColor="light1" w:fill="ffffff" w:themeFill="light1"/>
         <w:tcBorders>
-          <w:top w:val="none"/>
-          <w:left w:val="none"/>
+          <w:top w:val="none" w:color="000000" w:sz="4" w:space="0"/>
+          <w:left w:val="none" w:color="000000" w:sz="4" w:space="0"/>
           <w:bottom w:val="single" w:color="000000" w:themeColor="text1" w:themeTint="80" w:sz="4" w:space="0"/>
-          <w:right w:val="none"/>
+          <w:right w:val="none" w:color="000000" w:sz="4" w:space="0"/>
         </w:tcBorders>
       </w:tcPr>
     </w:tblStylePr>
@@ -25013,12 +25013,12 @@
         <w:tblBorders/>
       </w:tblPr>
       <w:tcPr>
-        <w:shd w:color="ffffff"/>
+        <w:shd w:val="clear" w:color="ffffff"/>
         <w:tcBorders>
-          <w:top w:val="none"/>
+          <w:top w:val="none" w:color="000000" w:sz="4" w:space="0"/>
           <w:left w:val="single" w:color="000000" w:themeColor="text1" w:themeTint="80" w:sz="4" w:space="0"/>
-          <w:bottom w:val="none"/>
-          <w:right w:val="none"/>
+          <w:bottom w:val="none" w:color="000000" w:sz="4" w:space="0"/>
+          <w:right w:val="none" w:color="000000" w:sz="4" w:space="0"/>
         </w:tcBorders>
       </w:tcPr>
     </w:tblStylePr>
@@ -25041,9 +25041,9 @@
         <w:shd w:val="clear" w:color="ffffff" w:themeColor="light1" w:fill="ffffff" w:themeFill="light1"/>
         <w:tcBorders>
           <w:top w:val="single" w:color="000000" w:themeColor="text1" w:themeTint="80" w:sz="4" w:space="0"/>
-          <w:left w:val="none"/>
-          <w:bottom w:val="none"/>
-          <w:right w:val="none"/>
+          <w:left w:val="none" w:color="000000" w:sz="4" w:space="0"/>
+          <w:bottom w:val="none" w:color="000000" w:sz="4" w:space="0"/>
+          <w:right w:val="none" w:color="000000" w:sz="4" w:space="0"/>
         </w:tcBorders>
       </w:tcPr>
     </w:tblStylePr>
@@ -25118,9 +25118,9 @@
       </w:tcPr>
     </w:tblStylePr>
   </w:style>
-  <w:style w:type="table" w:styleId="111">
+  <w:style w:type="table" w:styleId="804">
     <w:name w:val="List Table 7 Colorful - Accent 1"/>
-    <w:basedOn w:val="665"/>
+    <w:basedOn w:val="891"/>
     <w:uiPriority w:val="99"/>
     <w:pPr>
       <w:pBdr/>
@@ -25219,11 +25219,11 @@
         <w:tblBorders/>
       </w:tblPr>
       <w:tcPr>
-        <w:shd w:color="ffffff"/>
+        <w:shd w:val="clear" w:color="ffffff"/>
         <w:tcBorders>
-          <w:top w:val="none"/>
-          <w:left w:val="none"/>
-          <w:bottom w:val="none"/>
+          <w:top w:val="none" w:color="000000" w:sz="4" w:space="0"/>
+          <w:left w:val="none" w:color="000000" w:sz="4" w:space="0"/>
+          <w:bottom w:val="none" w:color="000000" w:sz="4" w:space="0"/>
           <w:right w:val="single" w:color="000000" w:themeColor="accent1" w:sz="4" w:space="0"/>
         </w:tcBorders>
       </w:tcPr>
@@ -25246,10 +25246,10 @@
       <w:tcPr>
         <w:shd w:val="clear" w:color="ffffff" w:themeColor="light1" w:fill="ffffff" w:themeFill="light1"/>
         <w:tcBorders>
-          <w:top w:val="none"/>
-          <w:left w:val="none"/>
+          <w:top w:val="none" w:color="000000" w:sz="4" w:space="0"/>
+          <w:left w:val="none" w:color="000000" w:sz="4" w:space="0"/>
           <w:bottom w:val="single" w:color="000000" w:themeColor="accent1" w:sz="4" w:space="0"/>
-          <w:right w:val="none"/>
+          <w:right w:val="none" w:color="000000" w:sz="4" w:space="0"/>
         </w:tcBorders>
       </w:tcPr>
     </w:tblStylePr>
@@ -25269,12 +25269,12 @@
         <w:tblBorders/>
       </w:tblPr>
       <w:tcPr>
-        <w:shd w:color="ffffff"/>
+        <w:shd w:val="clear" w:color="ffffff"/>
         <w:tcBorders>
-          <w:top w:val="none"/>
+          <w:top w:val="none" w:color="000000" w:sz="4" w:space="0"/>
           <w:left w:val="single" w:color="000000" w:themeColor="accent1" w:sz="4" w:space="0"/>
-          <w:bottom w:val="none"/>
-          <w:right w:val="none"/>
+          <w:bottom w:val="none" w:color="000000" w:sz="4" w:space="0"/>
+          <w:right w:val="none" w:color="000000" w:sz="4" w:space="0"/>
         </w:tcBorders>
       </w:tcPr>
     </w:tblStylePr>
@@ -25297,9 +25297,9 @@
         <w:shd w:val="clear" w:color="ffffff" w:themeColor="light1" w:fill="ffffff" w:themeFill="light1"/>
         <w:tcBorders>
           <w:top w:val="single" w:color="000000" w:themeColor="accent1" w:sz="4" w:space="0"/>
-          <w:left w:val="none"/>
-          <w:bottom w:val="none"/>
-          <w:right w:val="none"/>
+          <w:left w:val="none" w:color="000000" w:sz="4" w:space="0"/>
+          <w:bottom w:val="none" w:color="000000" w:sz="4" w:space="0"/>
+          <w:right w:val="none" w:color="000000" w:sz="4" w:space="0"/>
         </w:tcBorders>
       </w:tcPr>
     </w:tblStylePr>
@@ -25374,9 +25374,9 @@
       </w:tcPr>
     </w:tblStylePr>
   </w:style>
-  <w:style w:type="table" w:styleId="112">
+  <w:style w:type="table" w:styleId="805">
     <w:name w:val="List Table 7 Colorful - Accent 2"/>
-    <w:basedOn w:val="665"/>
+    <w:basedOn w:val="891"/>
     <w:uiPriority w:val="99"/>
     <w:pPr>
       <w:pBdr/>
@@ -25475,11 +25475,11 @@
         <w:tblBorders/>
       </w:tblPr>
       <w:tcPr>
-        <w:shd w:color="ffffff"/>
+        <w:shd w:val="clear" w:color="ffffff"/>
         <w:tcBorders>
-          <w:top w:val="none"/>
-          <w:left w:val="none"/>
-          <w:bottom w:val="none"/>
+          <w:top w:val="none" w:color="000000" w:sz="4" w:space="0"/>
+          <w:left w:val="none" w:color="000000" w:sz="4" w:space="0"/>
+          <w:bottom w:val="none" w:color="000000" w:sz="4" w:space="0"/>
           <w:right w:val="single" w:color="000000" w:themeColor="accent2" w:themeTint="97" w:sz="4" w:space="0"/>
         </w:tcBorders>
       </w:tcPr>
@@ -25502,10 +25502,10 @@
       <w:tcPr>
         <w:shd w:val="clear" w:color="ffffff" w:themeColor="light1" w:fill="ffffff" w:themeFill="light1"/>
         <w:tcBorders>
-          <w:top w:val="none"/>
-          <w:left w:val="none"/>
+          <w:top w:val="none" w:color="000000" w:sz="4" w:space="0"/>
+          <w:left w:val="none" w:color="000000" w:sz="4" w:space="0"/>
           <w:bottom w:val="single" w:color="000000" w:themeColor="accent2" w:themeTint="97" w:sz="4" w:space="0"/>
-          <w:right w:val="none"/>
+          <w:right w:val="none" w:color="000000" w:sz="4" w:space="0"/>
         </w:tcBorders>
       </w:tcPr>
     </w:tblStylePr>
@@ -25525,12 +25525,12 @@
         <w:tblBorders/>
       </w:tblPr>
       <w:tcPr>
-        <w:shd w:color="ffffff"/>
+        <w:shd w:val="clear" w:color="ffffff"/>
         <w:tcBorders>
-          <w:top w:val="none"/>
+          <w:top w:val="none" w:color="000000" w:sz="4" w:space="0"/>
           <w:left w:val="single" w:color="000000" w:themeColor="accent2" w:themeTint="97" w:sz="4" w:space="0"/>
-          <w:bottom w:val="none"/>
-          <w:right w:val="none"/>
+          <w:bottom w:val="none" w:color="000000" w:sz="4" w:space="0"/>
+          <w:right w:val="none" w:color="000000" w:sz="4" w:space="0"/>
         </w:tcBorders>
       </w:tcPr>
     </w:tblStylePr>
@@ -25553,9 +25553,9 @@
         <w:shd w:val="clear" w:color="ffffff" w:themeColor="light1" w:fill="ffffff" w:themeFill="light1"/>
         <w:tcBorders>
           <w:top w:val="single" w:color="000000" w:themeColor="accent2" w:themeTint="97" w:sz="4" w:space="0"/>
-          <w:left w:val="none"/>
-          <w:bottom w:val="none"/>
-          <w:right w:val="none"/>
+          <w:left w:val="none" w:color="000000" w:sz="4" w:space="0"/>
+          <w:bottom w:val="none" w:color="000000" w:sz="4" w:space="0"/>
+          <w:right w:val="none" w:color="000000" w:sz="4" w:space="0"/>
         </w:tcBorders>
       </w:tcPr>
     </w:tblStylePr>
@@ -25630,9 +25630,9 @@
       </w:tcPr>
     </w:tblStylePr>
   </w:style>
-  <w:style w:type="table" w:styleId="113">
+  <w:style w:type="table" w:styleId="806">
     <w:name w:val="List Table 7 Colorful - Accent 3"/>
-    <w:basedOn w:val="665"/>
+    <w:basedOn w:val="891"/>
     <w:uiPriority w:val="99"/>
     <w:pPr>
       <w:pBdr/>
@@ -25731,11 +25731,11 @@
         <w:tblBorders/>
       </w:tblPr>
       <w:tcPr>
-        <w:shd w:color="ffffff"/>
+        <w:shd w:val="clear" w:color="ffffff"/>
         <w:tcBorders>
-          <w:top w:val="none"/>
-          <w:left w:val="none"/>
-          <w:bottom w:val="none"/>
+          <w:top w:val="none" w:color="000000" w:sz="4" w:space="0"/>
+          <w:left w:val="none" w:color="000000" w:sz="4" w:space="0"/>
+          <w:bottom w:val="none" w:color="000000" w:sz="4" w:space="0"/>
           <w:right w:val="single" w:color="000000" w:themeColor="accent3" w:themeTint="98" w:sz="4" w:space="0"/>
         </w:tcBorders>
       </w:tcPr>
@@ -25758,10 +25758,10 @@
       <w:tcPr>
         <w:shd w:val="clear" w:color="ffffff" w:themeColor="light1" w:fill="ffffff" w:themeFill="light1"/>
         <w:tcBorders>
-          <w:top w:val="none"/>
-          <w:left w:val="none"/>
+          <w:top w:val="none" w:color="000000" w:sz="4" w:space="0"/>
+          <w:left w:val="none" w:color="000000" w:sz="4" w:space="0"/>
           <w:bottom w:val="single" w:color="000000" w:themeColor="accent3" w:themeTint="98" w:sz="4" w:space="0"/>
-          <w:right w:val="none"/>
+          <w:right w:val="none" w:color="000000" w:sz="4" w:space="0"/>
         </w:tcBorders>
       </w:tcPr>
     </w:tblStylePr>
@@ -25781,12 +25781,12 @@
         <w:tblBorders/>
       </w:tblPr>
       <w:tcPr>
-        <w:shd w:color="ffffff"/>
+        <w:shd w:val="clear" w:color="ffffff"/>
         <w:tcBorders>
-          <w:top w:val="none"/>
+          <w:top w:val="none" w:color="000000" w:sz="4" w:space="0"/>
           <w:left w:val="single" w:color="000000" w:themeColor="accent3" w:themeTint="98" w:sz="4" w:space="0"/>
-          <w:bottom w:val="none"/>
-          <w:right w:val="none"/>
+          <w:bottom w:val="none" w:color="000000" w:sz="4" w:space="0"/>
+          <w:right w:val="none" w:color="000000" w:sz="4" w:space="0"/>
         </w:tcBorders>
       </w:tcPr>
     </w:tblStylePr>
@@ -25809,9 +25809,9 @@
         <w:shd w:val="clear" w:color="ffffff" w:themeColor="light1" w:fill="ffffff" w:themeFill="light1"/>
         <w:tcBorders>
           <w:top w:val="single" w:color="000000" w:themeColor="accent3" w:themeTint="98" w:sz="4" w:space="0"/>
-          <w:left w:val="none"/>
-          <w:bottom w:val="none"/>
-          <w:right w:val="none"/>
+          <w:left w:val="none" w:color="000000" w:sz="4" w:space="0"/>
+          <w:bottom w:val="none" w:color="000000" w:sz="4" w:space="0"/>
+          <w:right w:val="none" w:color="000000" w:sz="4" w:space="0"/>
         </w:tcBorders>
       </w:tcPr>
     </w:tblStylePr>
@@ -25886,9 +25886,9 @@
       </w:tcPr>
     </w:tblStylePr>
   </w:style>
-  <w:style w:type="table" w:styleId="114">
+  <w:style w:type="table" w:styleId="807">
     <w:name w:val="List Table 7 Colorful - Accent 4"/>
-    <w:basedOn w:val="665"/>
+    <w:basedOn w:val="891"/>
     <w:uiPriority w:val="99"/>
     <w:pPr>
       <w:pBdr/>
@@ -25987,11 +25987,11 @@
         <w:tblBorders/>
       </w:tblPr>
       <w:tcPr>
-        <w:shd w:color="ffffff"/>
+        <w:shd w:val="clear" w:color="ffffff"/>
         <w:tcBorders>
-          <w:top w:val="none"/>
-          <w:left w:val="none"/>
-          <w:bottom w:val="none"/>
+          <w:top w:val="none" w:color="000000" w:sz="4" w:space="0"/>
+          <w:left w:val="none" w:color="000000" w:sz="4" w:space="0"/>
+          <w:bottom w:val="none" w:color="000000" w:sz="4" w:space="0"/>
           <w:right w:val="single" w:color="000000" w:themeColor="accent4" w:themeTint="9A" w:sz="4" w:space="0"/>
         </w:tcBorders>
       </w:tcPr>
@@ -26014,10 +26014,10 @@
       <w:tcPr>
         <w:shd w:val="clear" w:color="ffffff" w:themeColor="light1" w:fill="ffffff" w:themeFill="light1"/>
         <w:tcBorders>
-          <w:top w:val="none"/>
-          <w:left w:val="none"/>
+          <w:top w:val="none" w:color="000000" w:sz="4" w:space="0"/>
+          <w:left w:val="none" w:color="000000" w:sz="4" w:space="0"/>
           <w:bottom w:val="single" w:color="000000" w:themeColor="accent4" w:themeTint="9A" w:sz="4" w:space="0"/>
-          <w:right w:val="none"/>
+          <w:right w:val="none" w:color="000000" w:sz="4" w:space="0"/>
         </w:tcBorders>
       </w:tcPr>
     </w:tblStylePr>
@@ -26037,12 +26037,12 @@
         <w:tblBorders/>
       </w:tblPr>
       <w:tcPr>
-        <w:shd w:color="ffffff"/>
+        <w:shd w:val="clear" w:color="ffffff"/>
         <w:tcBorders>
-          <w:top w:val="none"/>
+          <w:top w:val="none" w:color="000000" w:sz="4" w:space="0"/>
           <w:left w:val="single" w:color="000000" w:themeColor="accent4" w:themeTint="9A" w:sz="4" w:space="0"/>
-          <w:bottom w:val="none"/>
-          <w:right w:val="none"/>
+          <w:bottom w:val="none" w:color="000000" w:sz="4" w:space="0"/>
+          <w:right w:val="none" w:color="000000" w:sz="4" w:space="0"/>
         </w:tcBorders>
       </w:tcPr>
     </w:tblStylePr>
@@ -26065,9 +26065,9 @@
         <w:shd w:val="clear" w:color="ffffff" w:themeColor="light1" w:fill="ffffff" w:themeFill="light1"/>
         <w:tcBorders>
           <w:top w:val="single" w:color="000000" w:themeColor="accent4" w:themeTint="9A" w:sz="4" w:space="0"/>
-          <w:left w:val="none"/>
-          <w:bottom w:val="none"/>
-          <w:right w:val="none"/>
+          <w:left w:val="none" w:color="000000" w:sz="4" w:space="0"/>
+          <w:bottom w:val="none" w:color="000000" w:sz="4" w:space="0"/>
+          <w:right w:val="none" w:color="000000" w:sz="4" w:space="0"/>
         </w:tcBorders>
       </w:tcPr>
     </w:tblStylePr>
@@ -26142,9 +26142,9 @@
       </w:tcPr>
     </w:tblStylePr>
   </w:style>
-  <w:style w:type="table" w:styleId="115">
+  <w:style w:type="table" w:styleId="808">
     <w:name w:val="List Table 7 Colorful - Accent 5"/>
-    <w:basedOn w:val="665"/>
+    <w:basedOn w:val="891"/>
     <w:uiPriority w:val="99"/>
     <w:pPr>
       <w:pBdr/>
@@ -26243,11 +26243,11 @@
         <w:tblBorders/>
       </w:tblPr>
       <w:tcPr>
-        <w:shd w:color="ffffff"/>
+        <w:shd w:val="clear" w:color="ffffff"/>
         <w:tcBorders>
-          <w:top w:val="none"/>
-          <w:left w:val="none"/>
-          <w:bottom w:val="none"/>
+          <w:top w:val="none" w:color="000000" w:sz="4" w:space="0"/>
+          <w:left w:val="none" w:color="000000" w:sz="4" w:space="0"/>
+          <w:bottom w:val="none" w:color="000000" w:sz="4" w:space="0"/>
           <w:right w:val="single" w:color="000000" w:themeColor="accent5" w:themeTint="9A" w:sz="4" w:space="0"/>
         </w:tcBorders>
       </w:tcPr>
@@ -26270,10 +26270,10 @@
       <w:tcPr>
         <w:shd w:val="clear" w:color="ffffff" w:themeColor="light1" w:fill="ffffff" w:themeFill="light1"/>
         <w:tcBorders>
-          <w:top w:val="none"/>
-          <w:left w:val="none"/>
+          <w:top w:val="none" w:color="000000" w:sz="4" w:space="0"/>
+          <w:left w:val="none" w:color="000000" w:sz="4" w:space="0"/>
           <w:bottom w:val="single" w:color="000000" w:themeColor="accent5" w:themeTint="9A" w:sz="4" w:space="0"/>
-          <w:right w:val="none"/>
+          <w:right w:val="none" w:color="000000" w:sz="4" w:space="0"/>
         </w:tcBorders>
       </w:tcPr>
     </w:tblStylePr>
@@ -26293,12 +26293,12 @@
         <w:tblBorders/>
       </w:tblPr>
       <w:tcPr>
-        <w:shd w:color="ffffff"/>
+        <w:shd w:val="clear" w:color="ffffff"/>
         <w:tcBorders>
-          <w:top w:val="none"/>
+          <w:top w:val="none" w:color="000000" w:sz="4" w:space="0"/>
           <w:left w:val="single" w:color="000000" w:themeColor="accent5" w:themeTint="9A" w:sz="4" w:space="0"/>
-          <w:bottom w:val="none"/>
-          <w:right w:val="none"/>
+          <w:bottom w:val="none" w:color="000000" w:sz="4" w:space="0"/>
+          <w:right w:val="none" w:color="000000" w:sz="4" w:space="0"/>
         </w:tcBorders>
       </w:tcPr>
     </w:tblStylePr>
@@ -26321,9 +26321,9 @@
         <w:shd w:val="clear" w:color="ffffff" w:themeColor="light1" w:fill="ffffff" w:themeFill="light1"/>
         <w:tcBorders>
           <w:top w:val="single" w:color="000000" w:themeColor="accent5" w:themeTint="9A" w:sz="4" w:space="0"/>
-          <w:left w:val="none"/>
-          <w:bottom w:val="none"/>
-          <w:right w:val="none"/>
+          <w:left w:val="none" w:color="000000" w:sz="4" w:space="0"/>
+          <w:bottom w:val="none" w:color="000000" w:sz="4" w:space="0"/>
+          <w:right w:val="none" w:color="000000" w:sz="4" w:space="0"/>
         </w:tcBorders>
       </w:tcPr>
     </w:tblStylePr>
@@ -26398,9 +26398,9 @@
       </w:tcPr>
     </w:tblStylePr>
   </w:style>
-  <w:style w:type="table" w:styleId="116">
+  <w:style w:type="table" w:styleId="809">
     <w:name w:val="List Table 7 Colorful - Accent 6"/>
-    <w:basedOn w:val="665"/>
+    <w:basedOn w:val="891"/>
     <w:uiPriority w:val="99"/>
     <w:pPr>
       <w:pBdr/>
@@ -26499,11 +26499,11 @@
         <w:tblBorders/>
       </w:tblPr>
       <w:tcPr>
-        <w:shd w:color="ffffff"/>
+        <w:shd w:val="clear" w:color="ffffff"/>
         <w:tcBorders>
-          <w:top w:val="none"/>
-          <w:left w:val="none"/>
-          <w:bottom w:val="none"/>
+          <w:top w:val="none" w:color="000000" w:sz="4" w:space="0"/>
+          <w:left w:val="none" w:color="000000" w:sz="4" w:space="0"/>
+          <w:bottom w:val="none" w:color="000000" w:sz="4" w:space="0"/>
           <w:right w:val="single" w:color="000000" w:themeColor="accent6" w:themeTint="98" w:sz="4" w:space="0"/>
         </w:tcBorders>
       </w:tcPr>
@@ -26526,10 +26526,10 @@
       <w:tcPr>
         <w:shd w:val="clear" w:color="ffffff" w:themeColor="light1" w:fill="ffffff" w:themeFill="light1"/>
         <w:tcBorders>
-          <w:top w:val="none"/>
-          <w:left w:val="none"/>
+          <w:top w:val="none" w:color="000000" w:sz="4" w:space="0"/>
+          <w:left w:val="none" w:color="000000" w:sz="4" w:space="0"/>
           <w:bottom w:val="single" w:color="000000" w:themeColor="accent6" w:themeTint="98" w:sz="4" w:space="0"/>
-          <w:right w:val="none"/>
+          <w:right w:val="none" w:color="000000" w:sz="4" w:space="0"/>
         </w:tcBorders>
       </w:tcPr>
     </w:tblStylePr>
@@ -26549,12 +26549,12 @@
         <w:tblBorders/>
       </w:tblPr>
       <w:tcPr>
-        <w:shd w:color="ffffff"/>
+        <w:shd w:val="clear" w:color="ffffff"/>
         <w:tcBorders>
-          <w:top w:val="none"/>
+          <w:top w:val="none" w:color="000000" w:sz="4" w:space="0"/>
           <w:left w:val="single" w:color="000000" w:themeColor="accent6" w:themeTint="98" w:sz="4" w:space="0"/>
-          <w:bottom w:val="none"/>
-          <w:right w:val="none"/>
+          <w:bottom w:val="none" w:color="000000" w:sz="4" w:space="0"/>
+          <w:right w:val="none" w:color="000000" w:sz="4" w:space="0"/>
         </w:tcBorders>
       </w:tcPr>
     </w:tblStylePr>
@@ -26577,9 +26577,9 @@
         <w:shd w:val="clear" w:color="ffffff" w:themeColor="light1" w:fill="ffffff" w:themeFill="light1"/>
         <w:tcBorders>
           <w:top w:val="single" w:color="000000" w:themeColor="accent6" w:themeTint="98" w:sz="4" w:space="0"/>
-          <w:left w:val="none"/>
-          <w:bottom w:val="none"/>
-          <w:right w:val="none"/>
+          <w:left w:val="none" w:color="000000" w:sz="4" w:space="0"/>
+          <w:bottom w:val="none" w:color="000000" w:sz="4" w:space="0"/>
+          <w:right w:val="none" w:color="000000" w:sz="4" w:space="0"/>
         </w:tcBorders>
       </w:tcPr>
     </w:tblStylePr>
@@ -26654,9 +26654,9 @@
       </w:tcPr>
     </w:tblStylePr>
   </w:style>
-  <w:style w:type="table" w:styleId="117">
+  <w:style w:type="table" w:styleId="810">
     <w:name w:val="Lined - Accent"/>
-    <w:basedOn w:val="665"/>
+    <w:basedOn w:val="891"/>
     <w:uiPriority w:val="99"/>
     <w:pPr>
       <w:pBdr/>
@@ -26891,9 +26891,9 @@
       </w:tcPr>
     </w:tblStylePr>
   </w:style>
-  <w:style w:type="table" w:styleId="118">
+  <w:style w:type="table" w:styleId="811">
     <w:name w:val="Lined - Accent 1"/>
-    <w:basedOn w:val="665"/>
+    <w:basedOn w:val="891"/>
     <w:uiPriority w:val="99"/>
     <w:pPr>
       <w:pBdr/>
@@ -27128,9 +27128,9 @@
       </w:tcPr>
     </w:tblStylePr>
   </w:style>
-  <w:style w:type="table" w:styleId="119">
+  <w:style w:type="table" w:styleId="812">
     <w:name w:val="Lined - Accent 2"/>
-    <w:basedOn w:val="665"/>
+    <w:basedOn w:val="891"/>
     <w:uiPriority w:val="99"/>
     <w:pPr>
       <w:pBdr/>
@@ -27365,9 +27365,9 @@
       </w:tcPr>
     </w:tblStylePr>
   </w:style>
-  <w:style w:type="table" w:styleId="120">
+  <w:style w:type="table" w:styleId="813">
     <w:name w:val="Lined - Accent 3"/>
-    <w:basedOn w:val="665"/>
+    <w:basedOn w:val="891"/>
     <w:uiPriority w:val="99"/>
     <w:pPr>
       <w:pBdr/>
@@ -27602,9 +27602,9 @@
       </w:tcPr>
     </w:tblStylePr>
   </w:style>
-  <w:style w:type="table" w:styleId="121">
+  <w:style w:type="table" w:styleId="814">
     <w:name w:val="Lined - Accent 4"/>
-    <w:basedOn w:val="665"/>
+    <w:basedOn w:val="891"/>
     <w:uiPriority w:val="99"/>
     <w:pPr>
       <w:pBdr/>
@@ -27839,9 +27839,9 @@
       </w:tcPr>
     </w:tblStylePr>
   </w:style>
-  <w:style w:type="table" w:styleId="122">
+  <w:style w:type="table" w:styleId="815">
     <w:name w:val="Lined - Accent 5"/>
-    <w:basedOn w:val="665"/>
+    <w:basedOn w:val="891"/>
     <w:uiPriority w:val="99"/>
     <w:pPr>
       <w:pBdr/>
@@ -28076,9 +28076,9 @@
       </w:tcPr>
     </w:tblStylePr>
   </w:style>
-  <w:style w:type="table" w:styleId="123">
+  <w:style w:type="table" w:styleId="816">
     <w:name w:val="Lined - Accent 6"/>
-    <w:basedOn w:val="665"/>
+    <w:basedOn w:val="891"/>
     <w:uiPriority w:val="99"/>
     <w:pPr>
       <w:pBdr/>
@@ -28313,9 +28313,9 @@
       </w:tcPr>
     </w:tblStylePr>
   </w:style>
-  <w:style w:type="table" w:styleId="124">
+  <w:style w:type="table" w:styleId="817">
     <w:name w:val="Bordered &amp; Lined - Accent"/>
-    <w:basedOn w:val="665"/>
+    <w:basedOn w:val="891"/>
     <w:uiPriority w:val="99"/>
     <w:pPr>
       <w:pBdr/>
@@ -28557,9 +28557,9 @@
       </w:tcPr>
     </w:tblStylePr>
   </w:style>
-  <w:style w:type="table" w:styleId="125">
+  <w:style w:type="table" w:styleId="818">
     <w:name w:val="Bordered &amp; Lined - Accent 1"/>
-    <w:basedOn w:val="665"/>
+    <w:basedOn w:val="891"/>
     <w:uiPriority w:val="99"/>
     <w:pPr>
       <w:pBdr/>
@@ -28801,9 +28801,9 @@
       </w:tcPr>
     </w:tblStylePr>
   </w:style>
-  <w:style w:type="table" w:styleId="126">
+  <w:style w:type="table" w:styleId="819">
     <w:name w:val="Bordered &amp; Lined - Accent 2"/>
-    <w:basedOn w:val="665"/>
+    <w:basedOn w:val="891"/>
     <w:uiPriority w:val="99"/>
     <w:pPr>
       <w:pBdr/>
@@ -29045,9 +29045,9 @@
       </w:tcPr>
     </w:tblStylePr>
   </w:style>
-  <w:style w:type="table" w:styleId="127">
+  <w:style w:type="table" w:styleId="820">
     <w:name w:val="Bordered &amp; Lined - Accent 3"/>
-    <w:basedOn w:val="665"/>
+    <w:basedOn w:val="891"/>
     <w:uiPriority w:val="99"/>
     <w:pPr>
       <w:pBdr/>
@@ -29289,9 +29289,9 @@
       </w:tcPr>
     </w:tblStylePr>
   </w:style>
-  <w:style w:type="table" w:styleId="128">
+  <w:style w:type="table" w:styleId="821">
     <w:name w:val="Bordered &amp; Lined - Accent 4"/>
-    <w:basedOn w:val="665"/>
+    <w:basedOn w:val="891"/>
     <w:uiPriority w:val="99"/>
     <w:pPr>
       <w:pBdr/>
@@ -29533,9 +29533,9 @@
       </w:tcPr>
     </w:tblStylePr>
   </w:style>
-  <w:style w:type="table" w:styleId="129">
+  <w:style w:type="table" w:styleId="822">
     <w:name w:val="Bordered &amp; Lined - Accent 5"/>
-    <w:basedOn w:val="665"/>
+    <w:basedOn w:val="891"/>
     <w:uiPriority w:val="99"/>
     <w:pPr>
       <w:pBdr/>
@@ -29777,9 +29777,9 @@
       </w:tcPr>
     </w:tblStylePr>
   </w:style>
-  <w:style w:type="table" w:styleId="130">
+  <w:style w:type="table" w:styleId="823">
     <w:name w:val="Bordered &amp; Lined - Accent 6"/>
-    <w:basedOn w:val="665"/>
+    <w:basedOn w:val="891"/>
     <w:uiPriority w:val="99"/>
     <w:pPr>
       <w:pBdr/>
@@ -30021,9 +30021,9 @@
       </w:tcPr>
     </w:tblStylePr>
   </w:style>
-  <w:style w:type="table" w:styleId="131">
+  <w:style w:type="table" w:styleId="824">
     <w:name w:val="Bordered"/>
-    <w:basedOn w:val="665"/>
+    <w:basedOn w:val="891"/>
     <w:uiPriority w:val="99"/>
     <w:pPr>
       <w:pBdr/>
@@ -30252,9 +30252,9 @@
       </w:tcPr>
     </w:tblStylePr>
   </w:style>
-  <w:style w:type="table" w:styleId="132">
+  <w:style w:type="table" w:styleId="825">
     <w:name w:val="Bordered - Accent 1"/>
-    <w:basedOn w:val="665"/>
+    <w:basedOn w:val="891"/>
     <w:uiPriority w:val="99"/>
     <w:pPr>
       <w:pBdr/>
@@ -30483,9 +30483,9 @@
       </w:tcPr>
     </w:tblStylePr>
   </w:style>
-  <w:style w:type="table" w:styleId="133">
+  <w:style w:type="table" w:styleId="826">
     <w:name w:val="Bordered - Accent 2"/>
-    <w:basedOn w:val="665"/>
+    <w:basedOn w:val="891"/>
     <w:uiPriority w:val="99"/>
     <w:pPr>
       <w:pBdr/>
@@ -30714,9 +30714,9 @@
       </w:tcPr>
     </w:tblStylePr>
   </w:style>
-  <w:style w:type="table" w:styleId="134">
+  <w:style w:type="table" w:styleId="827">
     <w:name w:val="Bordered - Accent 3"/>
-    <w:basedOn w:val="665"/>
+    <w:basedOn w:val="891"/>
     <w:uiPriority w:val="99"/>
     <w:pPr>
       <w:pBdr/>
@@ -30945,9 +30945,9 @@
       </w:tcPr>
     </w:tblStylePr>
   </w:style>
-  <w:style w:type="table" w:styleId="135">
+  <w:style w:type="table" w:styleId="828">
     <w:name w:val="Bordered - Accent 4"/>
-    <w:basedOn w:val="665"/>
+    <w:basedOn w:val="891"/>
     <w:uiPriority w:val="99"/>
     <w:pPr>
       <w:pBdr/>
@@ -31176,9 +31176,9 @@
       </w:tcPr>
     </w:tblStylePr>
   </w:style>
-  <w:style w:type="table" w:styleId="136">
+  <w:style w:type="table" w:styleId="829">
     <w:name w:val="Bordered - Accent 5"/>
-    <w:basedOn w:val="665"/>
+    <w:basedOn w:val="891"/>
     <w:uiPriority w:val="99"/>
     <w:pPr>
       <w:pBdr/>
@@ -31407,9 +31407,9 @@
       </w:tcPr>
     </w:tblStylePr>
   </w:style>
-  <w:style w:type="table" w:styleId="137">
+  <w:style w:type="table" w:styleId="830">
     <w:name w:val="Bordered - Accent 6"/>
-    <w:basedOn w:val="665"/>
+    <w:basedOn w:val="891"/>
     <w:uiPriority w:val="99"/>
     <w:pPr>
       <w:pBdr/>
@@ -31638,11 +31638,11 @@
       </w:tcPr>
     </w:tblStylePr>
   </w:style>
-  <w:style w:type="paragraph" w:styleId="139">
+  <w:style w:type="paragraph" w:styleId="831">
     <w:name w:val="Heading 1"/>
-    <w:basedOn w:val="664"/>
-    <w:next w:val="664"/>
-    <w:link w:val="150"/>
+    <w:basedOn w:val="890"/>
+    <w:next w:val="890"/>
+    <w:link w:val="841"/>
     <w:uiPriority w:val="9"/>
     <w:qFormat/>
     <w:pPr>
@@ -31660,11 +31660,11 @@
       <w:szCs w:val="40"/>
     </w:rPr>
   </w:style>
-  <w:style w:type="paragraph" w:styleId="140">
+  <w:style w:type="paragraph" w:styleId="832">
     <w:name w:val="Heading 2"/>
-    <w:basedOn w:val="664"/>
-    <w:next w:val="664"/>
-    <w:link w:val="151"/>
+    <w:basedOn w:val="890"/>
+    <w:next w:val="890"/>
+    <w:link w:val="842"/>
     <w:uiPriority w:val="9"/>
     <w:unhideWhenUsed/>
     <w:qFormat/>
@@ -31683,11 +31683,11 @@
       <w:szCs w:val="32"/>
     </w:rPr>
   </w:style>
-  <w:style w:type="paragraph" w:styleId="141">
+  <w:style w:type="paragraph" w:styleId="833">
     <w:name w:val="Heading 3"/>
-    <w:basedOn w:val="664"/>
-    <w:next w:val="664"/>
-    <w:link w:val="152"/>
+    <w:basedOn w:val="890"/>
+    <w:next w:val="890"/>
+    <w:link w:val="843"/>
     <w:uiPriority w:val="9"/>
     <w:unhideWhenUsed/>
     <w:qFormat/>
@@ -31706,11 +31706,11 @@
       <w:szCs w:val="28"/>
     </w:rPr>
   </w:style>
-  <w:style w:type="paragraph" w:styleId="142">
+  <w:style w:type="paragraph" w:styleId="834">
     <w:name w:val="Heading 4"/>
-    <w:basedOn w:val="664"/>
-    <w:next w:val="664"/>
-    <w:link w:val="153"/>
+    <w:basedOn w:val="890"/>
+    <w:next w:val="890"/>
+    <w:link w:val="844"/>
     <w:uiPriority w:val="9"/>
     <w:unhideWhenUsed/>
     <w:qFormat/>
@@ -31729,11 +31729,11 @@
       <w:color w:val="0f4761" w:themeColor="accent1" w:themeShade="BF"/>
     </w:rPr>
   </w:style>
-  <w:style w:type="paragraph" w:styleId="143">
+  <w:style w:type="paragraph" w:styleId="835">
     <w:name w:val="Heading 5"/>
-    <w:basedOn w:val="664"/>
-    <w:next w:val="664"/>
-    <w:link w:val="154"/>
+    <w:basedOn w:val="890"/>
+    <w:next w:val="890"/>
+    <w:link w:val="845"/>
     <w:uiPriority w:val="9"/>
     <w:unhideWhenUsed/>
     <w:qFormat/>
@@ -31750,11 +31750,11 @@
       <w:color w:val="0f4761" w:themeColor="accent1" w:themeShade="BF"/>
     </w:rPr>
   </w:style>
-  <w:style w:type="paragraph" w:styleId="144">
+  <w:style w:type="paragraph" w:styleId="836">
     <w:name w:val="Heading 6"/>
-    <w:basedOn w:val="664"/>
-    <w:next w:val="664"/>
-    <w:link w:val="155"/>
+    <w:basedOn w:val="890"/>
+    <w:next w:val="890"/>
+    <w:link w:val="846"/>
     <w:uiPriority w:val="9"/>
     <w:unhideWhenUsed/>
     <w:qFormat/>
@@ -31773,11 +31773,11 @@
       <w:color w:val="595959" w:themeColor="text1" w:themeTint="A6"/>
     </w:rPr>
   </w:style>
-  <w:style w:type="paragraph" w:styleId="145">
+  <w:style w:type="paragraph" w:styleId="837">
     <w:name w:val="Heading 7"/>
-    <w:basedOn w:val="664"/>
-    <w:next w:val="664"/>
-    <w:link w:val="156"/>
+    <w:basedOn w:val="890"/>
+    <w:next w:val="890"/>
+    <w:link w:val="847"/>
     <w:uiPriority w:val="9"/>
     <w:unhideWhenUsed/>
     <w:qFormat/>
@@ -31794,11 +31794,11 @@
       <w:color w:val="595959" w:themeColor="text1" w:themeTint="A6"/>
     </w:rPr>
   </w:style>
-  <w:style w:type="paragraph" w:styleId="146">
+  <w:style w:type="paragraph" w:styleId="838">
     <w:name w:val="Heading 8"/>
-    <w:basedOn w:val="664"/>
-    <w:next w:val="664"/>
-    <w:link w:val="157"/>
+    <w:basedOn w:val="890"/>
+    <w:next w:val="890"/>
+    <w:link w:val="848"/>
     <w:uiPriority w:val="9"/>
     <w:unhideWhenUsed/>
     <w:qFormat/>
@@ -31817,11 +31817,11 @@
       <w:color w:val="272727" w:themeColor="text1" w:themeTint="D8"/>
     </w:rPr>
   </w:style>
-  <w:style w:type="paragraph" w:styleId="147">
+  <w:style w:type="paragraph" w:styleId="839">
     <w:name w:val="Heading 9"/>
-    <w:basedOn w:val="664"/>
-    <w:next w:val="664"/>
-    <w:link w:val="158"/>
+    <w:basedOn w:val="890"/>
+    <w:next w:val="890"/>
+    <w:link w:val="849"/>
     <w:uiPriority w:val="9"/>
     <w:unhideWhenUsed/>
     <w:qFormat/>
@@ -31840,7 +31840,7 @@
       <w:color w:val="272727" w:themeColor="text1" w:themeTint="D8"/>
     </w:rPr>
   </w:style>
-  <w:style w:type="character" w:styleId="148" w:default="1">
+  <w:style w:type="character" w:styleId="840" w:default="1">
     <w:name w:val="Default Paragraph Font"/>
     <w:uiPriority w:val="1"/>
     <w:semiHidden/>
@@ -31851,10 +31851,10 @@
       <w:ind/>
     </w:pPr>
   </w:style>
-  <w:style w:type="character" w:styleId="150">
+  <w:style w:type="character" w:styleId="841">
     <w:name w:val="Heading 1 Char"/>
-    <w:basedOn w:val="148"/>
-    <w:link w:val="139"/>
+    <w:basedOn w:val="840"/>
+    <w:link w:val="831"/>
     <w:uiPriority w:val="9"/>
     <w:pPr>
       <w:pBdr/>
@@ -31868,10 +31868,10 @@
       <w:szCs w:val="40"/>
     </w:rPr>
   </w:style>
-  <w:style w:type="character" w:styleId="151">
+  <w:style w:type="character" w:styleId="842">
     <w:name w:val="Heading 2 Char"/>
-    <w:basedOn w:val="148"/>
-    <w:link w:val="140"/>
+    <w:basedOn w:val="840"/>
+    <w:link w:val="832"/>
     <w:uiPriority w:val="9"/>
     <w:pPr>
       <w:pBdr/>
@@ -31885,10 +31885,10 @@
       <w:szCs w:val="32"/>
     </w:rPr>
   </w:style>
-  <w:style w:type="character" w:styleId="152">
+  <w:style w:type="character" w:styleId="843">
     <w:name w:val="Heading 3 Char"/>
-    <w:basedOn w:val="148"/>
-    <w:link w:val="141"/>
+    <w:basedOn w:val="840"/>
+    <w:link w:val="833"/>
     <w:uiPriority w:val="9"/>
     <w:pPr>
       <w:pBdr/>
@@ -31902,10 +31902,10 @@
       <w:szCs w:val="28"/>
     </w:rPr>
   </w:style>
-  <w:style w:type="character" w:styleId="153">
+  <w:style w:type="character" w:styleId="844">
     <w:name w:val="Heading 4 Char"/>
-    <w:basedOn w:val="148"/>
-    <w:link w:val="142"/>
+    <w:basedOn w:val="840"/>
+    <w:link w:val="834"/>
     <w:uiPriority w:val="9"/>
     <w:pPr>
       <w:pBdr/>
@@ -31919,10 +31919,10 @@
       <w:color w:val="0f4761" w:themeColor="accent1" w:themeShade="BF"/>
     </w:rPr>
   </w:style>
-  <w:style w:type="character" w:styleId="154">
+  <w:style w:type="character" w:styleId="845">
     <w:name w:val="Heading 5 Char"/>
-    <w:basedOn w:val="148"/>
-    <w:link w:val="143"/>
+    <w:basedOn w:val="840"/>
+    <w:link w:val="835"/>
     <w:uiPriority w:val="9"/>
     <w:pPr>
       <w:pBdr/>
@@ -31934,10 +31934,10 @@
       <w:color w:val="0f4761" w:themeColor="accent1" w:themeShade="BF"/>
     </w:rPr>
   </w:style>
-  <w:style w:type="character" w:styleId="155">
+  <w:style w:type="character" w:styleId="846">
     <w:name w:val="Heading 6 Char"/>
-    <w:basedOn w:val="148"/>
-    <w:link w:val="144"/>
+    <w:basedOn w:val="840"/>
+    <w:link w:val="836"/>
     <w:uiPriority w:val="9"/>
     <w:pPr>
       <w:pBdr/>
@@ -31951,10 +31951,10 @@
       <w:color w:val="595959" w:themeColor="text1" w:themeTint="A6"/>
     </w:rPr>
   </w:style>
-  <w:style w:type="character" w:styleId="156">
+  <w:style w:type="character" w:styleId="847">
     <w:name w:val="Heading 7 Char"/>
-    <w:basedOn w:val="148"/>
-    <w:link w:val="145"/>
+    <w:basedOn w:val="840"/>
+    <w:link w:val="837"/>
     <w:uiPriority w:val="9"/>
     <w:pPr>
       <w:pBdr/>
@@ -31966,10 +31966,10 @@
       <w:color w:val="595959" w:themeColor="text1" w:themeTint="A6"/>
     </w:rPr>
   </w:style>
-  <w:style w:type="character" w:styleId="157">
+  <w:style w:type="character" w:styleId="848">
     <w:name w:val="Heading 8 Char"/>
-    <w:basedOn w:val="148"/>
-    <w:link w:val="146"/>
+    <w:basedOn w:val="840"/>
+    <w:link w:val="838"/>
     <w:uiPriority w:val="9"/>
     <w:pPr>
       <w:pBdr/>
@@ -31983,10 +31983,10 @@
       <w:color w:val="272727" w:themeColor="text1" w:themeTint="D8"/>
     </w:rPr>
   </w:style>
-  <w:style w:type="character" w:styleId="158">
+  <w:style w:type="character" w:styleId="849">
     <w:name w:val="Heading 9 Char"/>
-    <w:basedOn w:val="148"/>
-    <w:link w:val="147"/>
+    <w:basedOn w:val="840"/>
+    <w:link w:val="839"/>
     <w:uiPriority w:val="9"/>
     <w:pPr>
       <w:pBdr/>
@@ -32000,11 +32000,11 @@
       <w:color w:val="272727" w:themeColor="text1" w:themeTint="D8"/>
     </w:rPr>
   </w:style>
-  <w:style w:type="paragraph" w:styleId="159">
+  <w:style w:type="paragraph" w:styleId="850">
     <w:name w:val="Title"/>
-    <w:basedOn w:val="664"/>
-    <w:next w:val="664"/>
-    <w:link w:val="160"/>
+    <w:basedOn w:val="890"/>
+    <w:next w:val="890"/>
+    <w:link w:val="851"/>
     <w:uiPriority w:val="10"/>
     <w:qFormat/>
     <w:pPr>
@@ -32020,10 +32020,10 @@
       <w:szCs w:val="56"/>
     </w:rPr>
   </w:style>
-  <w:style w:type="character" w:styleId="160">
+  <w:style w:type="character" w:styleId="851">
     <w:name w:val="Title Char"/>
-    <w:basedOn w:val="148"/>
-    <w:link w:val="159"/>
+    <w:basedOn w:val="840"/>
+    <w:link w:val="850"/>
     <w:uiPriority w:val="10"/>
     <w:pPr>
       <w:pBdr/>
@@ -32037,11 +32037,11 @@
       <w:szCs w:val="56"/>
     </w:rPr>
   </w:style>
-  <w:style w:type="paragraph" w:styleId="161">
+  <w:style w:type="paragraph" w:styleId="852">
     <w:name w:val="Subtitle"/>
-    <w:basedOn w:val="664"/>
-    <w:next w:val="664"/>
-    <w:link w:val="162"/>
+    <w:basedOn w:val="890"/>
+    <w:next w:val="890"/>
+    <w:link w:val="853"/>
     <w:uiPriority w:val="11"/>
     <w:qFormat/>
     <w:pPr>
@@ -32059,10 +32059,10 @@
       <w:szCs w:val="28"/>
     </w:rPr>
   </w:style>
-  <w:style w:type="character" w:styleId="162">
+  <w:style w:type="character" w:styleId="853">
     <w:name w:val="Subtitle Char"/>
-    <w:basedOn w:val="148"/>
-    <w:link w:val="161"/>
+    <w:basedOn w:val="840"/>
+    <w:link w:val="852"/>
     <w:uiPriority w:val="11"/>
     <w:pPr>
       <w:pBdr/>
@@ -32076,11 +32076,11 @@
       <w:szCs w:val="28"/>
     </w:rPr>
   </w:style>
-  <w:style w:type="paragraph" w:styleId="163">
+  <w:style w:type="paragraph" w:styleId="854">
     <w:name w:val="Quote"/>
-    <w:basedOn w:val="664"/>
-    <w:next w:val="664"/>
-    <w:link w:val="164"/>
+    <w:basedOn w:val="890"/>
+    <w:next w:val="890"/>
+    <w:link w:val="855"/>
     <w:uiPriority w:val="29"/>
     <w:qFormat/>
     <w:pPr>
@@ -32095,10 +32095,10 @@
       <w:color w:val="404040" w:themeColor="text1" w:themeTint="BF"/>
     </w:rPr>
   </w:style>
-  <w:style w:type="character" w:styleId="164">
+  <w:style w:type="character" w:styleId="855">
     <w:name w:val="Quote Char"/>
-    <w:basedOn w:val="148"/>
-    <w:link w:val="163"/>
+    <w:basedOn w:val="840"/>
+    <w:link w:val="854"/>
     <w:uiPriority w:val="29"/>
     <w:pPr>
       <w:pBdr/>
@@ -32111,9 +32111,9 @@
       <w:color w:val="404040" w:themeColor="text1" w:themeTint="BF"/>
     </w:rPr>
   </w:style>
-  <w:style w:type="character" w:styleId="166">
+  <w:style w:type="character" w:styleId="856">
     <w:name w:val="Intense Emphasis"/>
-    <w:basedOn w:val="148"/>
+    <w:basedOn w:val="840"/>
     <w:uiPriority w:val="21"/>
     <w:qFormat/>
     <w:pPr>
@@ -32127,11 +32127,11 @@
       <w:color w:val="0f4761" w:themeColor="accent1" w:themeShade="BF"/>
     </w:rPr>
   </w:style>
-  <w:style w:type="paragraph" w:styleId="167">
+  <w:style w:type="paragraph" w:styleId="857">
     <w:name w:val="Intense Quote"/>
-    <w:basedOn w:val="664"/>
-    <w:next w:val="664"/>
-    <w:link w:val="168"/>
+    <w:basedOn w:val="890"/>
+    <w:next w:val="890"/>
+    <w:link w:val="858"/>
     <w:uiPriority w:val="30"/>
     <w:qFormat/>
     <w:pPr>
@@ -32149,10 +32149,10 @@
       <w:color w:val="0f4761" w:themeColor="accent1" w:themeShade="BF"/>
     </w:rPr>
   </w:style>
-  <w:style w:type="character" w:styleId="168">
+  <w:style w:type="character" w:styleId="858">
     <w:name w:val="Intense Quote Char"/>
-    <w:basedOn w:val="148"/>
-    <w:link w:val="167"/>
+    <w:basedOn w:val="840"/>
+    <w:link w:val="857"/>
     <w:uiPriority w:val="30"/>
     <w:pPr>
       <w:pBdr/>
@@ -32165,9 +32165,9 @@
       <w:color w:val="0f4761" w:themeColor="accent1" w:themeShade="BF"/>
     </w:rPr>
   </w:style>
-  <w:style w:type="character" w:styleId="169">
+  <w:style w:type="character" w:styleId="859">
     <w:name w:val="Intense Reference"/>
-    <w:basedOn w:val="148"/>
+    <w:basedOn w:val="840"/>
     <w:uiPriority w:val="32"/>
     <w:qFormat/>
     <w:pPr>
@@ -32183,9 +32183,9 @@
       <w:spacing w:val="5"/>
     </w:rPr>
   </w:style>
-  <w:style w:type="character" w:styleId="171">
+  <w:style w:type="character" w:styleId="860">
     <w:name w:val="Subtle Emphasis"/>
-    <w:basedOn w:val="148"/>
+    <w:basedOn w:val="840"/>
     <w:uiPriority w:val="19"/>
     <w:qFormat/>
     <w:pPr>
@@ -32199,9 +32199,9 @@
       <w:color w:val="404040" w:themeColor="text1" w:themeTint="BF"/>
     </w:rPr>
   </w:style>
-  <w:style w:type="character" w:styleId="172">
+  <w:style w:type="character" w:styleId="861">
     <w:name w:val="Emphasis"/>
-    <w:basedOn w:val="148"/>
+    <w:basedOn w:val="840"/>
     <w:uiPriority w:val="20"/>
     <w:qFormat/>
     <w:pPr>
@@ -32214,9 +32214,9 @@
       <w:iCs/>
     </w:rPr>
   </w:style>
-  <w:style w:type="character" w:styleId="173">
+  <w:style w:type="character" w:styleId="862">
     <w:name w:val="Strong"/>
-    <w:basedOn w:val="148"/>
+    <w:basedOn w:val="840"/>
     <w:uiPriority w:val="22"/>
     <w:qFormat/>
     <w:pPr>
@@ -32229,9 +32229,9 @@
       <w:bCs/>
     </w:rPr>
   </w:style>
-  <w:style w:type="character" w:styleId="174">
+  <w:style w:type="character" w:styleId="863">
     <w:name w:val="Subtle Reference"/>
-    <w:basedOn w:val="148"/>
+    <w:basedOn w:val="840"/>
     <w:uiPriority w:val="31"/>
     <w:qFormat/>
     <w:pPr>
@@ -32244,9 +32244,9 @@
       <w:color w:val="5a5a5a" w:themeColor="text1" w:themeTint="A5"/>
     </w:rPr>
   </w:style>
-  <w:style w:type="character" w:styleId="175">
+  <w:style w:type="character" w:styleId="864">
     <w:name w:val="Book Title"/>
-    <w:basedOn w:val="148"/>
+    <w:basedOn w:val="840"/>
     <w:uiPriority w:val="33"/>
     <w:qFormat/>
     <w:pPr>
@@ -32262,10 +32262,10 @@
       <w:spacing w:val="5"/>
     </w:rPr>
   </w:style>
-  <w:style w:type="paragraph" w:styleId="176">
+  <w:style w:type="paragraph" w:styleId="865">
     <w:name w:val="Header"/>
-    <w:basedOn w:val="664"/>
-    <w:link w:val="177"/>
+    <w:basedOn w:val="890"/>
+    <w:link w:val="866"/>
     <w:uiPriority w:val="99"/>
     <w:unhideWhenUsed/>
     <w:pPr>
@@ -32278,10 +32278,10 @@
       <w:ind/>
     </w:pPr>
   </w:style>
-  <w:style w:type="character" w:styleId="177">
+  <w:style w:type="character" w:styleId="866">
     <w:name w:val="Header Char"/>
-    <w:basedOn w:val="148"/>
-    <w:link w:val="176"/>
+    <w:basedOn w:val="840"/>
+    <w:link w:val="865"/>
     <w:uiPriority w:val="99"/>
     <w:pPr>
       <w:pBdr/>
@@ -32289,10 +32289,10 @@
       <w:ind/>
     </w:pPr>
   </w:style>
-  <w:style w:type="paragraph" w:styleId="178">
+  <w:style w:type="paragraph" w:styleId="867">
     <w:name w:val="Footer"/>
-    <w:basedOn w:val="664"/>
-    <w:link w:val="179"/>
+    <w:basedOn w:val="890"/>
+    <w:link w:val="868"/>
     <w:uiPriority w:val="99"/>
     <w:unhideWhenUsed/>
     <w:pPr>
@@ -32305,10 +32305,10 @@
       <w:ind/>
     </w:pPr>
   </w:style>
-  <w:style w:type="character" w:styleId="179">
+  <w:style w:type="character" w:styleId="868">
     <w:name w:val="Footer Char"/>
-    <w:basedOn w:val="148"/>
-    <w:link w:val="178"/>
+    <w:basedOn w:val="840"/>
+    <w:link w:val="867"/>
     <w:uiPriority w:val="99"/>
     <w:pPr>
       <w:pBdr/>
@@ -32316,10 +32316,10 @@
       <w:ind/>
     </w:pPr>
   </w:style>
-  <w:style w:type="paragraph" w:styleId="180">
+  <w:style w:type="paragraph" w:styleId="869">
     <w:name w:val="Caption"/>
-    <w:basedOn w:val="664"/>
-    <w:next w:val="664"/>
+    <w:basedOn w:val="890"/>
+    <w:next w:val="890"/>
     <w:uiPriority w:val="35"/>
     <w:unhideWhenUsed/>
     <w:qFormat/>
@@ -32336,10 +32336,10 @@
       <w:szCs w:val="18"/>
     </w:rPr>
   </w:style>
-  <w:style w:type="paragraph" w:styleId="181">
+  <w:style w:type="paragraph" w:styleId="870">
     <w:name w:val="footnote text"/>
-    <w:basedOn w:val="664"/>
-    <w:link w:val="182"/>
+    <w:basedOn w:val="890"/>
+    <w:link w:val="871"/>
     <w:uiPriority w:val="99"/>
     <w:semiHidden/>
     <w:unhideWhenUsed/>
@@ -32353,10 +32353,10 @@
       <w:szCs w:val="20"/>
     </w:rPr>
   </w:style>
-  <w:style w:type="character" w:styleId="182">
+  <w:style w:type="character" w:styleId="871">
     <w:name w:val="Footnote Text Char"/>
-    <w:basedOn w:val="148"/>
-    <w:link w:val="181"/>
+    <w:basedOn w:val="840"/>
+    <w:link w:val="870"/>
     <w:uiPriority w:val="99"/>
     <w:semiHidden/>
     <w:pPr>
@@ -32369,9 +32369,9 @@
       <w:szCs w:val="20"/>
     </w:rPr>
   </w:style>
-  <w:style w:type="character" w:styleId="183">
+  <w:style w:type="character" w:styleId="872">
     <w:name w:val="footnote reference"/>
-    <w:basedOn w:val="148"/>
+    <w:basedOn w:val="840"/>
     <w:uiPriority w:val="99"/>
     <w:semiHidden/>
     <w:unhideWhenUsed/>
@@ -32384,10 +32384,10 @@
       <w:vertAlign w:val="superscript"/>
     </w:rPr>
   </w:style>
-  <w:style w:type="paragraph" w:styleId="184">
+  <w:style w:type="paragraph" w:styleId="873">
     <w:name w:val="endnote text"/>
-    <w:basedOn w:val="664"/>
-    <w:link w:val="185"/>
+    <w:basedOn w:val="890"/>
+    <w:link w:val="874"/>
     <w:uiPriority w:val="99"/>
     <w:semiHidden/>
     <w:unhideWhenUsed/>
@@ -32401,10 +32401,10 @@
       <w:szCs w:val="20"/>
     </w:rPr>
   </w:style>
-  <w:style w:type="character" w:styleId="185">
+  <w:style w:type="character" w:styleId="874">
     <w:name w:val="Endnote Text Char"/>
-    <w:basedOn w:val="148"/>
-    <w:link w:val="184"/>
+    <w:basedOn w:val="840"/>
+    <w:link w:val="873"/>
     <w:uiPriority w:val="99"/>
     <w:semiHidden/>
     <w:pPr>
@@ -32417,9 +32417,9 @@
       <w:szCs w:val="20"/>
     </w:rPr>
   </w:style>
-  <w:style w:type="character" w:styleId="186">
+  <w:style w:type="character" w:styleId="875">
     <w:name w:val="endnote reference"/>
-    <w:basedOn w:val="148"/>
+    <w:basedOn w:val="840"/>
     <w:uiPriority w:val="99"/>
     <w:semiHidden/>
     <w:unhideWhenUsed/>
@@ -32432,9 +32432,9 @@
       <w:vertAlign w:val="superscript"/>
     </w:rPr>
   </w:style>
-  <w:style w:type="character" w:styleId="187">
+  <w:style w:type="character" w:styleId="876">
     <w:name w:val="Hyperlink"/>
-    <w:basedOn w:val="148"/>
+    <w:basedOn w:val="840"/>
     <w:uiPriority w:val="99"/>
     <w:unhideWhenUsed/>
     <w:pPr>
@@ -32447,9 +32447,9 @@
       <w:u w:val="single"/>
     </w:rPr>
   </w:style>
-  <w:style w:type="character" w:styleId="188">
+  <w:style w:type="character" w:styleId="877">
     <w:name w:val="FollowedHyperlink"/>
-    <w:basedOn w:val="148"/>
+    <w:basedOn w:val="840"/>
     <w:uiPriority w:val="99"/>
     <w:semiHidden/>
     <w:unhideWhenUsed/>
@@ -32463,10 +32463,10 @@
       <w:u w:val="single"/>
     </w:rPr>
   </w:style>
-  <w:style w:type="paragraph" w:styleId="189">
+  <w:style w:type="paragraph" w:styleId="878">
     <w:name w:val="toc 1"/>
-    <w:basedOn w:val="664"/>
-    <w:next w:val="664"/>
+    <w:basedOn w:val="890"/>
+    <w:next w:val="890"/>
     <w:uiPriority w:val="39"/>
     <w:unhideWhenUsed/>
     <w:pPr>
@@ -32475,10 +32475,10 @@
       <w:ind/>
     </w:pPr>
   </w:style>
-  <w:style w:type="paragraph" w:styleId="190">
+  <w:style w:type="paragraph" w:styleId="879">
     <w:name w:val="toc 2"/>
-    <w:basedOn w:val="664"/>
-    <w:next w:val="664"/>
+    <w:basedOn w:val="890"/>
+    <w:next w:val="890"/>
     <w:uiPriority w:val="39"/>
     <w:unhideWhenUsed/>
     <w:pPr>
@@ -32487,10 +32487,10 @@
       <w:ind w:left="220"/>
     </w:pPr>
   </w:style>
-  <w:style w:type="paragraph" w:styleId="191">
+  <w:style w:type="paragraph" w:styleId="880">
     <w:name w:val="toc 3"/>
-    <w:basedOn w:val="664"/>
-    <w:next w:val="664"/>
+    <w:basedOn w:val="890"/>
+    <w:next w:val="890"/>
     <w:uiPriority w:val="39"/>
     <w:unhideWhenUsed/>
     <w:pPr>
@@ -32499,10 +32499,10 @@
       <w:ind w:left="440"/>
     </w:pPr>
   </w:style>
-  <w:style w:type="paragraph" w:styleId="192">
+  <w:style w:type="paragraph" w:styleId="881">
     <w:name w:val="toc 4"/>
-    <w:basedOn w:val="664"/>
-    <w:next w:val="664"/>
+    <w:basedOn w:val="890"/>
+    <w:next w:val="890"/>
     <w:uiPriority w:val="39"/>
     <w:unhideWhenUsed/>
     <w:pPr>
@@ -32511,10 +32511,10 @@
       <w:ind w:left="660"/>
     </w:pPr>
   </w:style>
-  <w:style w:type="paragraph" w:styleId="193">
+  <w:style w:type="paragraph" w:styleId="882">
     <w:name w:val="toc 5"/>
-    <w:basedOn w:val="664"/>
-    <w:next w:val="664"/>
+    <w:basedOn w:val="890"/>
+    <w:next w:val="890"/>
     <w:uiPriority w:val="39"/>
     <w:unhideWhenUsed/>
     <w:pPr>
@@ -32523,10 +32523,10 @@
       <w:ind w:left="880"/>
     </w:pPr>
   </w:style>
-  <w:style w:type="paragraph" w:styleId="194">
+  <w:style w:type="paragraph" w:styleId="883">
     <w:name w:val="toc 6"/>
-    <w:basedOn w:val="664"/>
-    <w:next w:val="664"/>
+    <w:basedOn w:val="890"/>
+    <w:next w:val="890"/>
     <w:uiPriority w:val="39"/>
     <w:unhideWhenUsed/>
     <w:pPr>
@@ -32535,10 +32535,10 @@
       <w:ind w:left="1100"/>
     </w:pPr>
   </w:style>
-  <w:style w:type="paragraph" w:styleId="195">
+  <w:style w:type="paragraph" w:styleId="884">
     <w:name w:val="toc 7"/>
-    <w:basedOn w:val="664"/>
-    <w:next w:val="664"/>
+    <w:basedOn w:val="890"/>
+    <w:next w:val="890"/>
     <w:uiPriority w:val="39"/>
     <w:unhideWhenUsed/>
     <w:pPr>
@@ -32547,10 +32547,10 @@
       <w:ind w:left="1320"/>
     </w:pPr>
   </w:style>
-  <w:style w:type="paragraph" w:styleId="196">
+  <w:style w:type="paragraph" w:styleId="885">
     <w:name w:val="toc 8"/>
-    <w:basedOn w:val="664"/>
-    <w:next w:val="664"/>
+    <w:basedOn w:val="890"/>
+    <w:next w:val="890"/>
     <w:uiPriority w:val="39"/>
     <w:unhideWhenUsed/>
     <w:pPr>
@@ -32559,10 +32559,10 @@
       <w:ind w:left="1540"/>
     </w:pPr>
   </w:style>
-  <w:style w:type="paragraph" w:styleId="197">
+  <w:style w:type="paragraph" w:styleId="886">
     <w:name w:val="toc 9"/>
-    <w:basedOn w:val="664"/>
-    <w:next w:val="664"/>
+    <w:basedOn w:val="890"/>
+    <w:next w:val="890"/>
     <w:uiPriority w:val="39"/>
     <w:unhideWhenUsed/>
     <w:pPr>
@@ -32571,9 +32571,9 @@
       <w:ind w:left="1760"/>
     </w:pPr>
   </w:style>
-  <w:style w:type="character" w:styleId="198">
+  <w:style w:type="character" w:styleId="887">
     <w:name w:val="Placeholder Text"/>
-    <w:basedOn w:val="148"/>
+    <w:basedOn w:val="840"/>
     <w:uiPriority w:val="99"/>
     <w:semiHidden/>
     <w:pPr>
@@ -32585,7 +32585,7 @@
       <w:color w:val="666666"/>
     </w:rPr>
   </w:style>
-  <w:style w:type="paragraph" w:styleId="208">
+  <w:style w:type="paragraph" w:styleId="888">
     <w:name w:val="TOC Heading"/>
     <w:uiPriority w:val="39"/>
     <w:unhideWhenUsed/>
@@ -32595,10 +32595,10 @@
       <w:ind/>
     </w:pPr>
   </w:style>
-  <w:style w:type="paragraph" w:styleId="209">
+  <w:style w:type="paragraph" w:styleId="889">
     <w:name w:val="table of figures"/>
-    <w:basedOn w:val="664"/>
-    <w:next w:val="664"/>
+    <w:basedOn w:val="890"/>
+    <w:next w:val="890"/>
     <w:uiPriority w:val="99"/>
     <w:unhideWhenUsed/>
     <w:pPr>
@@ -32607,7 +32607,7 @@
       <w:ind/>
     </w:pPr>
   </w:style>
-  <w:style w:type="paragraph" w:styleId="664" w:default="1">
+  <w:style w:type="paragraph" w:styleId="890" w:default="1">
     <w:name w:val="Normal"/>
     <w:qFormat/>
     <w:pPr>
@@ -32616,7 +32616,7 @@
       <w:ind/>
     </w:pPr>
   </w:style>
-  <w:style w:type="table" w:styleId="665" w:default="1">
+  <w:style w:type="table" w:styleId="891" w:default="1">
     <w:name w:val="Normal Table"/>
     <w:uiPriority w:val="99"/>
     <w:semiHidden/>
@@ -32809,7 +32809,7 @@
       </w:tcPr>
     </w:tblStylePr>
   </w:style>
-  <w:style w:type="numbering" w:styleId="666" w:default="1">
+  <w:style w:type="numbering" w:styleId="892" w:default="1">
     <w:name w:val="No List"/>
     <w:uiPriority w:val="99"/>
     <w:semiHidden/>
@@ -32820,9 +32820,9 @@
       <w:ind/>
     </w:pPr>
   </w:style>
-  <w:style w:type="paragraph" w:styleId="667">
+  <w:style w:type="paragraph" w:styleId="893">
     <w:name w:val="No Spacing"/>
-    <w:basedOn w:val="664"/>
+    <w:basedOn w:val="890"/>
     <w:uiPriority w:val="1"/>
     <w:qFormat/>
     <w:pPr>
@@ -32831,9 +32831,9 @@
       <w:ind/>
     </w:pPr>
   </w:style>
-  <w:style w:type="paragraph" w:styleId="668">
+  <w:style w:type="paragraph" w:styleId="894">
     <w:name w:val="List Paragraph"/>
-    <w:basedOn w:val="664"/>
+    <w:basedOn w:val="890"/>
     <w:uiPriority w:val="34"/>
     <w:qFormat/>
     <w:pPr>

</xml_diff>

<commit_message>
Correccion de sintaxis, nombres y esquemas. Tambien se corrigio el Cifrado ya que usaba TDE pero se elimino debido a las limitaciones de SQL Server Express Edition
</commit_message>
<xml_diff>
--- a/Cambios.docx
+++ b/Cambios.docx
@@ -14,477 +14,7 @@
         <w:ind w:right="0" w:firstLine="0" w:left="0"/>
         <w:jc w:val="both"/>
         <w:rPr>
-          <w:rFonts w:ascii="Calibri" w:hAnsi="Calibri" w:eastAsia="Calibri" w:cs="Calibri"/>
-          <w:b w:val="0"/>
-          <w:bCs w:val="0"/>
-          <w:color w:val="000000"/>
-          <w:sz w:val="22"/>
-          <w:szCs w:val="22"/>
-          <w14:ligatures w14:val="none"/>
-        </w:rPr>
-      </w:pPr>
-      <w:r>
-        <w:rPr>
-          <w:rFonts w:ascii="Calibri" w:hAnsi="Calibri" w:eastAsia="Calibri" w:cs="Calibri"/>
-          <w:b w:val="0"/>
-          <w:bCs w:val="0"/>
-          <w:color w:val="000000"/>
-          <w:sz w:val="22"/>
-          <w:szCs w:val="22"/>
-        </w:rPr>
-      </w:r>
-      <w:r>
-        <w:rPr>
-          <w:rFonts w:ascii="Calibri" w:hAnsi="Calibri" w:eastAsia="Calibri" w:cs="Calibri"/>
-          <w:b w:val="0"/>
-          <w:bCs w:val="0"/>
-          <w:color w:val="000000"/>
-          <w:sz w:val="22"/>
-          <w:szCs w:val="22"/>
-          <w:lang w:val="es-AR"/>
-        </w:rPr>
-        <w:t xml:space="preserve">S</w:t>
-      </w:r>
-      <w:r>
-        <w:rPr>
-          <w:rFonts w:ascii="Calibri" w:hAnsi="Calibri" w:eastAsia="Calibri" w:cs="Calibri"/>
-          <w:b w:val="0"/>
-          <w:bCs w:val="0"/>
-          <w:color w:val="000000"/>
-          <w:sz w:val="22"/>
-          <w:szCs w:val="22"/>
-        </w:rPr>
-        <w:t xml:space="preserve">e desarrolló el script maestro OrdenDeCreacion.sql para estructurar y documentar el despliegue de la base de datos desde cero. Al requerir el uso del Modo SQLCMD, este archivo automatiza la ejecución secuencial de los scripts individuales </w:t>
-      </w:r>
-      <w:r>
-        <w:rPr>
-          <w:rFonts w:ascii="Calibri" w:hAnsi="Calibri" w:eastAsia="Calibri" w:cs="Calibri"/>
-          <w:b w:val="0"/>
-          <w:bCs w:val="0"/>
-          <w:color w:val="000000"/>
-          <w:sz w:val="22"/>
-          <w:szCs w:val="22"/>
-        </w:rPr>
-        <w:t xml:space="preserve">respetando la jerarquía de las dependencias </w:t>
-      </w:r>
-      <w:r>
-        <w:rPr>
-          <w:rFonts w:ascii="Calibri" w:hAnsi="Calibri" w:eastAsia="Calibri" w:cs="Calibri"/>
-          <w:b w:val="0"/>
-          <w:bCs w:val="0"/>
-          <w:color w:val="000000"/>
-          <w:sz w:val="22"/>
-          <w:szCs w:val="22"/>
-          <w:lang w:val="es-AR"/>
-        </w:rPr>
-        <w:t xml:space="preserve">debido a </w:t>
-      </w:r>
-      <w:r>
-        <w:rPr>
-          <w:rFonts w:ascii="Calibri" w:hAnsi="Calibri" w:eastAsia="Calibri" w:cs="Calibri"/>
-          <w:b w:val="0"/>
-          <w:bCs w:val="0"/>
-          <w:color w:val="000000"/>
-          <w:sz w:val="22"/>
-          <w:szCs w:val="22"/>
-        </w:rPr>
-        <w:t xml:space="preserve">las claves foráneas. Esta implementación </w:t>
-      </w:r>
-      <w:r>
-        <w:rPr>
-          <w:rFonts w:ascii="Calibri" w:hAnsi="Calibri" w:eastAsia="Calibri" w:cs="Calibri"/>
-          <w:b w:val="0"/>
-          <w:bCs w:val="0"/>
-          <w:color w:val="000000"/>
-          <w:sz w:val="22"/>
-          <w:szCs w:val="22"/>
-          <w:lang w:val="es-AR"/>
-        </w:rPr>
-        <w:t xml:space="preserve">evita</w:t>
-      </w:r>
-      <w:r>
-        <w:rPr>
-          <w:rFonts w:ascii="Calibri" w:hAnsi="Calibri" w:eastAsia="Calibri" w:cs="Calibri"/>
-          <w:b w:val="0"/>
-          <w:bCs w:val="0"/>
-          <w:color w:val="000000"/>
-          <w:sz w:val="22"/>
-          <w:szCs w:val="22"/>
-        </w:rPr>
-        <w:t xml:space="preserve"> errores de referencias cruzadas.</w:t>
-      </w:r>
-      <w:r>
-        <w:rPr>
-          <w:rFonts w:ascii="Calibri" w:hAnsi="Calibri" w:eastAsia="Calibri" w:cs="Calibri"/>
-          <w:b w:val="0"/>
-          <w:bCs w:val="0"/>
-          <w:color w:val="000000"/>
-          <w:sz w:val="22"/>
-          <w:szCs w:val="22"/>
-        </w:rPr>
-      </w:r>
-      <w:r>
-        <w:rPr>
-          <w:rFonts w:ascii="Calibri" w:hAnsi="Calibri" w:eastAsia="Calibri" w:cs="Calibri"/>
-          <w:b w:val="0"/>
-          <w:bCs w:val="0"/>
-          <w:color w:val="000000"/>
-          <w:sz w:val="22"/>
-          <w:szCs w:val="22"/>
-          <w14:ligatures w14:val="none"/>
-        </w:rPr>
-      </w:r>
-    </w:p>
-    <w:p>
-      <w:pPr>
-        <w:pBdr>
-          <w:top w:val="none" w:color="000000" w:sz="4" w:space="0"/>
-          <w:left w:val="none" w:color="000000" w:sz="4" w:space="0"/>
-          <w:bottom w:val="none" w:color="000000" w:sz="4" w:space="0"/>
-          <w:right w:val="none" w:color="000000" w:sz="4" w:space="0"/>
-        </w:pBdr>
-        <w:spacing w:before="0" w:line="276" w:lineRule="auto"/>
-        <w:ind w:right="0" w:firstLine="0" w:left="0"/>
-        <w:jc w:val="both"/>
-        <w:rPr>
-          <w:rFonts w:ascii="Calibri" w:hAnsi="Calibri" w:eastAsia="Calibri" w:cs="Calibri"/>
-          <w:b w:val="0"/>
-          <w:bCs w:val="0"/>
-          <w:color w:val="000000"/>
-          <w:sz w:val="22"/>
-          <w:szCs w:val="22"/>
-          <w14:ligatures w14:val="none"/>
-        </w:rPr>
-      </w:pPr>
-      <w:r>
-        <w:rPr>
-          <w:rFonts w:ascii="Calibri" w:hAnsi="Calibri" w:eastAsia="Calibri" w:cs="Calibri"/>
-          <w:b w:val="0"/>
-          <w:bCs w:val="0"/>
-          <w:color w:val="000000"/>
-          <w:sz w:val="22"/>
-          <w:szCs w:val="22"/>
-        </w:rPr>
-        <w:t xml:space="preserve">Para reflejar fielmente e</w:t>
-      </w:r>
-      <w:r>
-        <w:rPr>
-          <w:rFonts w:ascii="Calibri" w:hAnsi="Calibri" w:eastAsia="Calibri" w:cs="Calibri"/>
-          <w:b w:val="0"/>
-          <w:bCs w:val="0"/>
-          <w:color w:val="000000"/>
-          <w:sz w:val="22"/>
-          <w:szCs w:val="22"/>
-          <w:lang w:val="es-AR"/>
-        </w:rPr>
-        <w:t xml:space="preserve">l </w:t>
-      </w:r>
-      <w:r>
-        <w:rPr>
-          <w:rFonts w:ascii="Calibri" w:hAnsi="Calibri" w:eastAsia="Calibri" w:cs="Calibri"/>
-          <w:b w:val="0"/>
-          <w:bCs w:val="0"/>
-          <w:color w:val="000000"/>
-          <w:sz w:val="22"/>
-          <w:szCs w:val="22"/>
-        </w:rPr>
-        <w:t xml:space="preserve">DER, se eliminó la tabla intermedia TieneHistorial. En su lugar, </w:t>
-      </w:r>
-      <w:r>
-        <w:rPr>
-          <w:rFonts w:ascii="Calibri" w:hAnsi="Calibri" w:eastAsia="Calibri" w:cs="Calibri"/>
-          <w:b w:val="0"/>
-          <w:bCs w:val="0"/>
-          <w:color w:val="000000"/>
-          <w:sz w:val="22"/>
-          <w:szCs w:val="22"/>
-          <w:lang w:val="es-AR"/>
-        </w:rPr>
-        <w:t xml:space="preserve">se</w:t>
-      </w:r>
-      <w:r>
-        <w:rPr>
-          <w:rFonts w:ascii="Calibri" w:hAnsi="Calibri" w:eastAsia="Calibri" w:cs="Calibri"/>
-          <w:b w:val="0"/>
-          <w:bCs w:val="0"/>
-          <w:color w:val="000000"/>
-          <w:sz w:val="22"/>
-          <w:szCs w:val="22"/>
-        </w:rPr>
-        <w:t xml:space="preserve"> modifico la tabla Historial, incorporando directamente en ella las claves foráneas correspondientes a Guardaparque y Parque</w:t>
-      </w:r>
-      <w:r>
-        <w:rPr>
-          <w:rFonts w:ascii="Calibri" w:hAnsi="Calibri" w:eastAsia="Calibri" w:cs="Calibri"/>
-          <w:b w:val="0"/>
-          <w:bCs w:val="0"/>
-          <w:color w:val="000000"/>
-          <w:sz w:val="22"/>
-          <w:szCs w:val="22"/>
-        </w:rPr>
-        <w:t xml:space="preserve">.</w:t>
-      </w:r>
-      <w:r>
-        <w:rPr>
-          <w:rFonts w:ascii="Calibri" w:hAnsi="Calibri" w:eastAsia="Calibri" w:cs="Calibri"/>
-          <w:b w:val="0"/>
-          <w:bCs w:val="0"/>
-          <w:color w:val="000000"/>
-          <w:sz w:val="22"/>
-          <w:szCs w:val="22"/>
-        </w:rPr>
-      </w:r>
-      <w:r>
-        <w:rPr>
-          <w:rFonts w:ascii="Calibri" w:hAnsi="Calibri" w:eastAsia="Calibri" w:cs="Calibri"/>
-          <w:b w:val="0"/>
-          <w:bCs w:val="0"/>
-          <w:color w:val="000000"/>
-          <w:sz w:val="22"/>
-          <w:szCs w:val="22"/>
-          <w14:ligatures w14:val="none"/>
-        </w:rPr>
-      </w:r>
-    </w:p>
-    <w:p>
-      <w:pPr>
-        <w:pBdr>
-          <w:top w:val="none" w:color="000000" w:sz="4" w:space="0"/>
-          <w:left w:val="none" w:color="000000" w:sz="4" w:space="0"/>
-          <w:bottom w:val="none" w:color="000000" w:sz="4" w:space="0"/>
-          <w:right w:val="none" w:color="000000" w:sz="4" w:space="0"/>
-        </w:pBdr>
-        <w:spacing w:before="0" w:line="276" w:lineRule="auto"/>
-        <w:ind w:right="0" w:firstLine="0" w:left="0"/>
-        <w:jc w:val="both"/>
-        <w:rPr>
-          <w:rFonts w:ascii="Calibri" w:hAnsi="Calibri" w:eastAsia="Calibri" w:cs="Calibri"/>
-          <w:b w:val="0"/>
-          <w:bCs w:val="0"/>
-          <w:color w:val="000000"/>
-          <w:sz w:val="22"/>
-          <w:szCs w:val="22"/>
-          <w:highlight w:val="none"/>
-        </w:rPr>
-      </w:pPr>
-      <w:r>
-        <w:rPr>
-          <w:rFonts w:ascii="Calibri" w:hAnsi="Calibri" w:eastAsia="Calibri" w:cs="Calibri"/>
-          <w:b w:val="0"/>
-          <w:bCs w:val="0"/>
-          <w:color w:val="000000"/>
-          <w:sz w:val="22"/>
-          <w:szCs w:val="22"/>
-        </w:rPr>
-      </w:r>
-      <w:r>
-        <w:rPr>
-          <w:rFonts w:ascii="Calibri" w:hAnsi="Calibri" w:eastAsia="Calibri" w:cs="Calibri"/>
-          <w:b w:val="0"/>
-          <w:bCs w:val="0"/>
-          <w:color w:val="000000"/>
-          <w:sz w:val="22"/>
-          <w:szCs w:val="22"/>
-        </w:rPr>
-        <w:t xml:space="preserve">Se agregó el campo HoraInicio a la clave primaria, quedando PRIMARY KEY(Actividad,</w:t>
-      </w:r>
-      <w:r>
-        <w:rPr>
-          <w:rFonts w:ascii="Calibri" w:hAnsi="Calibri" w:eastAsia="Calibri" w:cs="Calibri"/>
-          <w:b w:val="0"/>
-          <w:bCs w:val="0"/>
-          <w:color w:val="000000"/>
-          <w:sz w:val="22"/>
-          <w:szCs w:val="22"/>
-        </w:rPr>
-        <w:t xml:space="preserve"> FechaActividad, HoraInicio).</w:t>
-      </w:r>
-      <w:r>
-        <w:rPr>
-          <w:rFonts w:ascii="Calibri" w:hAnsi="Calibri" w:eastAsia="Calibri" w:cs="Calibri"/>
-          <w:b w:val="0"/>
-          <w:bCs w:val="0"/>
-          <w:color w:val="000000"/>
-          <w:sz w:val="22"/>
-          <w:szCs w:val="22"/>
-          <w:lang w:val="es-AR"/>
-        </w:rPr>
-        <w:t xml:space="preserve"> </w:t>
-      </w:r>
-      <w:r>
-        <w:rPr>
-          <w:rFonts w:ascii="Calibri" w:hAnsi="Calibri" w:eastAsia="Calibri" w:cs="Calibri"/>
-          <w:b w:val="0"/>
-          <w:bCs w:val="0"/>
-          <w:color w:val="000000"/>
-          <w:sz w:val="22"/>
-          <w:szCs w:val="22"/>
-        </w:rPr>
-        <w:t xml:space="preserve">Para permitir que una misma actividad (por ejemplo, una excursión) pueda dictarse en distintos horarios durante un mismo día. Con la clave anterior,</w:t>
-      </w:r>
-      <w:r>
-        <w:rPr>
-          <w:rFonts w:ascii="Calibri" w:hAnsi="Calibri" w:eastAsia="Calibri" w:cs="Calibri"/>
-          <w:b w:val="0"/>
-          <w:bCs w:val="0"/>
-          <w:color w:val="000000"/>
-          <w:sz w:val="22"/>
-          <w:szCs w:val="22"/>
-          <w:lang w:val="es-AR"/>
-        </w:rPr>
-        <w:t xml:space="preserve"> </w:t>
-      </w:r>
-      <w:r>
-        <w:rPr>
-          <w:rFonts w:ascii="Calibri" w:hAnsi="Calibri" w:eastAsia="Calibri" w:cs="Calibri"/>
-          <w:b w:val="0"/>
-          <w:bCs w:val="0"/>
-          <w:color w:val="000000"/>
-          <w:sz w:val="22"/>
-          <w:szCs w:val="22"/>
-          <w:lang w:val="es-AR"/>
-        </w:rPr>
-        <w:t xml:space="preserve">se</w:t>
-      </w:r>
-      <w:r>
-        <w:rPr>
-          <w:rFonts w:ascii="Calibri" w:hAnsi="Calibri" w:eastAsia="Calibri" w:cs="Calibri"/>
-          <w:b w:val="0"/>
-          <w:bCs w:val="0"/>
-          <w:color w:val="000000"/>
-          <w:sz w:val="22"/>
-          <w:szCs w:val="22"/>
-        </w:rPr>
-        <w:t xml:space="preserve"> bloquea</w:t>
-      </w:r>
-      <w:r>
-        <w:rPr>
-          <w:rFonts w:ascii="Calibri" w:hAnsi="Calibri" w:eastAsia="Calibri" w:cs="Calibri"/>
-          <w:b w:val="0"/>
-          <w:bCs w:val="0"/>
-          <w:color w:val="000000"/>
-          <w:sz w:val="22"/>
-          <w:szCs w:val="22"/>
-          <w:lang w:val="es-AR"/>
-        </w:rPr>
-        <w:t xml:space="preserve">ba</w:t>
-      </w:r>
-      <w:r>
-        <w:rPr>
-          <w:rFonts w:ascii="Calibri" w:hAnsi="Calibri" w:eastAsia="Calibri" w:cs="Calibri"/>
-          <w:b w:val="0"/>
-          <w:bCs w:val="0"/>
-          <w:color w:val="000000"/>
-          <w:sz w:val="22"/>
-          <w:szCs w:val="22"/>
-        </w:rPr>
-        <w:t xml:space="preserve"> la inserción de un segundo turno en la misma fecha</w:t>
-      </w:r>
-      <w:r>
-        <w:rPr>
-          <w:rFonts w:ascii="Calibri" w:hAnsi="Calibri" w:eastAsia="Calibri" w:cs="Calibri"/>
-          <w:b w:val="0"/>
-          <w:bCs w:val="0"/>
-          <w:color w:val="000000"/>
-          <w:sz w:val="22"/>
-          <w:szCs w:val="22"/>
-        </w:rPr>
-        <w:t xml:space="preserve">.</w:t>
-      </w:r>
-      <w:r>
-        <w:rPr>
-          <w:rFonts w:ascii="Calibri" w:hAnsi="Calibri" w:eastAsia="Calibri" w:cs="Calibri"/>
-          <w:b w:val="0"/>
-          <w:bCs w:val="0"/>
-          <w:color w:val="000000"/>
-          <w:sz w:val="22"/>
-          <w:szCs w:val="22"/>
-        </w:rPr>
-      </w:r>
-      <w:r>
-        <w:rPr>
-          <w:rFonts w:ascii="Calibri" w:hAnsi="Calibri" w:eastAsia="Calibri" w:cs="Calibri"/>
-          <w:b w:val="0"/>
-          <w:bCs w:val="0"/>
-          <w:color w:val="000000"/>
-          <w:sz w:val="22"/>
-          <w:szCs w:val="22"/>
-          <w:highlight w:val="none"/>
-        </w:rPr>
-      </w:r>
-    </w:p>
-    <w:p>
-      <w:pPr>
-        <w:pBdr>
-          <w:top w:val="none" w:color="000000" w:sz="4" w:space="0"/>
-          <w:left w:val="none" w:color="000000" w:sz="4" w:space="0"/>
-          <w:bottom w:val="none" w:color="000000" w:sz="4" w:space="0"/>
-          <w:right w:val="none" w:color="000000" w:sz="4" w:space="0"/>
-        </w:pBdr>
-        <w:spacing w:before="0" w:line="276" w:lineRule="auto"/>
-        <w:ind w:right="0" w:firstLine="0" w:left="0"/>
-        <w:jc w:val="both"/>
-        <w:rPr>
-          <w:rFonts w:ascii="Calibri" w:hAnsi="Calibri" w:cs="Calibri"/>
-          <w:b w:val="0"/>
-          <w:bCs w:val="0"/>
-          <w:sz w:val="22"/>
-          <w:szCs w:val="22"/>
-        </w:rPr>
-      </w:pPr>
-      <w:r>
-        <w:rPr>
-          <w:rFonts w:ascii="Calibri" w:hAnsi="Calibri" w:eastAsia="Calibri" w:cs="Calibri"/>
-          <w:b w:val="0"/>
-          <w:bCs w:val="0"/>
-          <w:color w:val="000000"/>
-          <w:sz w:val="22"/>
-          <w:szCs w:val="22"/>
-        </w:rPr>
-      </w:r>
-      <w:r>
-        <w:rPr>
-          <w:rFonts w:ascii="Calibri" w:hAnsi="Calibri" w:eastAsia="Calibri" w:cs="Calibri"/>
-          <w:b w:val="0"/>
-          <w:bCs w:val="0"/>
-          <w:color w:val="000000"/>
-          <w:sz w:val="22"/>
-          <w:szCs w:val="22"/>
-        </w:rPr>
-        <w:t xml:space="preserve">Se cambiaron los campos de texto de longitud variable (como DescripcionAct, Titulo, RazonEgreso) de CHAR a VARCHAR.</w:t>
-      </w:r>
-      <w:r>
-        <w:rPr>
-          <w:rFonts w:ascii="Calibri" w:hAnsi="Calibri" w:eastAsia="Calibri" w:cs="Calibri"/>
-          <w:b w:val="0"/>
-          <w:bCs w:val="0"/>
-          <w:sz w:val="22"/>
-          <w:szCs w:val="22"/>
-        </w:rPr>
-      </w:r>
-      <w:r>
-        <w:rPr>
-          <w:rFonts w:ascii="Calibri" w:hAnsi="Calibri" w:cs="Calibri"/>
-          <w:b w:val="0"/>
-          <w:bCs w:val="0"/>
-          <w:sz w:val="22"/>
-          <w:szCs w:val="22"/>
-        </w:rPr>
-      </w:r>
-    </w:p>
-    <w:p>
-      <w:pPr>
-        <w:pBdr>
-          <w:top w:val="none" w:color="000000" w:sz="4" w:space="0"/>
-          <w:left w:val="none" w:color="000000" w:sz="4" w:space="0"/>
-          <w:bottom w:val="none" w:color="000000" w:sz="4" w:space="0"/>
-          <w:right w:val="none" w:color="000000" w:sz="4" w:space="0"/>
-        </w:pBdr>
-        <w:spacing w:before="0" w:line="276" w:lineRule="auto"/>
-        <w:ind w:right="0" w:firstLine="0" w:left="0"/>
-        <w:jc w:val="both"/>
-        <w:rPr>
-          <w:rFonts w:ascii="Calibri" w:hAnsi="Calibri" w:eastAsia="Calibri" w:cs="Calibri"/>
+          <w:rFonts w:ascii="Arial" w:hAnsi="Arial" w:cs="Arial"/>
           <w:b w:val="0"/>
           <w:bCs w:val="0"/>
           <w:sz w:val="22"/>
@@ -494,183 +24,15 @@
       </w:pPr>
       <w:r>
         <w:rPr>
-          <w:rFonts w:ascii="Calibri" w:hAnsi="Calibri" w:eastAsia="Calibri" w:cs="Calibri"/>
-          <w:b w:val="0"/>
-          <w:bCs w:val="0"/>
-          <w:color w:val="000000"/>
-          <w:sz w:val="22"/>
-          <w:szCs w:val="22"/>
+          <w:rFonts w:ascii="Arial" w:hAnsi="Arial" w:eastAsia="Arial" w:cs="Arial"/>
+          <w:highlight w:val="none"/>
+          <w:lang w:val="es-AR" w:bidi="es-AR"/>
         </w:rPr>
-        <w:t xml:space="preserve">Se aumentó la capacidad del campo NombreParque (VARCHAR(</w:t>
+        <w:t xml:space="preserve">Correciones menores, de sintaxis y logica.</w:t>
       </w:r>
       <w:r>
         <w:rPr>
-          <w:rFonts w:ascii="Calibri" w:hAnsi="Calibri" w:eastAsia="Calibri" w:cs="Calibri"/>
-          <w:b w:val="0"/>
-          <w:bCs w:val="0"/>
-          <w:color w:val="000000"/>
-          <w:sz w:val="22"/>
-          <w:szCs w:val="22"/>
-          <w:lang w:val="es-AR"/>
-        </w:rPr>
-        <w:t xml:space="preserve">10</w:t>
-      </w:r>
-      <w:r>
-        <w:rPr>
-          <w:rFonts w:ascii="Calibri" w:hAnsi="Calibri" w:eastAsia="Calibri" w:cs="Calibri"/>
-          <w:b w:val="0"/>
-          <w:bCs w:val="0"/>
-          <w:color w:val="000000"/>
-          <w:sz w:val="22"/>
-          <w:szCs w:val="22"/>
-        </w:rPr>
-        <w:t xml:space="preserve">0))</w:t>
-      </w:r>
-      <w:r>
-        <w:rPr>
-          <w:rFonts w:ascii="Calibri" w:hAnsi="Calibri" w:eastAsia="Calibri" w:cs="Calibri"/>
-          <w:b w:val="0"/>
-          <w:bCs w:val="0"/>
-          <w:color w:val="000000"/>
-          <w:sz w:val="22"/>
-          <w:szCs w:val="22"/>
-        </w:rPr>
-        <w:t xml:space="preserve">. Existen parques nacionales reales con nombres extensos, los cuales habrían hecho fallar los procesos de inserción si el límite se mantení</w:t>
-      </w:r>
-      <w:r>
-        <w:rPr>
-          <w:rFonts w:ascii="Calibri" w:hAnsi="Calibri" w:eastAsia="Calibri" w:cs="Calibri"/>
-          <w:b w:val="0"/>
-          <w:bCs w:val="0"/>
-          <w:color w:val="000000"/>
-          <w:sz w:val="22"/>
-          <w:szCs w:val="22"/>
-        </w:rPr>
-        <w:t xml:space="preserve">a en 30 caracteres.</w:t>
-      </w:r>
-      <w:r>
-        <w:rPr>
-          <w:rFonts w:ascii="Calibri" w:hAnsi="Calibri" w:eastAsia="Calibri" w:cs="Calibri"/>
-          <w:b w:val="0"/>
-          <w:bCs w:val="0"/>
-          <w:sz w:val="22"/>
-          <w:szCs w:val="22"/>
-          <w:highlight w:val="none"/>
-        </w:rPr>
-      </w:r>
-      <w:r>
-        <w:rPr>
-          <w:rFonts w:ascii="Calibri" w:hAnsi="Calibri" w:eastAsia="Calibri" w:cs="Calibri"/>
-          <w:b w:val="0"/>
-          <w:bCs w:val="0"/>
-          <w:sz w:val="22"/>
-          <w:szCs w:val="22"/>
-          <w:highlight w:val="none"/>
-        </w:rPr>
-      </w:r>
-    </w:p>
-    <w:p>
-      <w:pPr>
-        <w:pBdr>
-          <w:top w:val="none" w:color="000000" w:sz="4" w:space="0"/>
-          <w:left w:val="none" w:color="000000" w:sz="4" w:space="0"/>
-          <w:bottom w:val="none" w:color="000000" w:sz="4" w:space="0"/>
-          <w:right w:val="none" w:color="000000" w:sz="4" w:space="0"/>
-        </w:pBdr>
-        <w:spacing w:before="0" w:line="276" w:lineRule="auto"/>
-        <w:ind w:right="0" w:firstLine="0" w:left="0"/>
-        <w:jc w:val="both"/>
-        <w:rPr>
-          <w:highlight w:val="none"/>
-        </w:rPr>
-      </w:pPr>
-      <w:r>
-        <w:rPr>
-          <w:rFonts w:ascii="Calibri" w:hAnsi="Calibri" w:eastAsia="Calibri" w:cs="Calibri"/>
-          <w:b w:val="0"/>
-          <w:bCs w:val="0"/>
-          <w:sz w:val="22"/>
-          <w:szCs w:val="22"/>
-          <w:highlight w:val="none"/>
-          <w:lang w:val="es-AR"/>
-        </w:rPr>
-        <w:t xml:space="preserve">Se agrego el esquema </w:t>
-      </w:r>
-      <w:r>
-        <w:rPr>
-          <w:rFonts w:ascii="Calibri" w:hAnsi="Calibri" w:eastAsia="Calibri" w:cs="Calibri"/>
-          <w:b w:val="0"/>
-          <w:bCs w:val="0"/>
-          <w:sz w:val="22"/>
-          <w:szCs w:val="22"/>
-          <w:highlight w:val="none"/>
-          <w:lang w:val="es-AR"/>
-        </w:rPr>
-        <w:t xml:space="preserve">PnSPabm</w:t>
-      </w:r>
-      <w:r>
-        <w:rPr>
-          <w:rFonts w:ascii="Calibri" w:hAnsi="Calibri" w:eastAsia="Calibri" w:cs="Calibri"/>
-          <w:b w:val="0"/>
-          <w:bCs w:val="0"/>
-          <w:sz w:val="22"/>
-          <w:szCs w:val="22"/>
-          <w:highlight w:val="none"/>
-          <w:lang w:val="es-AR"/>
-        </w:rPr>
-        <w:t xml:space="preserve"> a </w:t>
-      </w:r>
-      <w:r>
-        <w:rPr>
-          <w:rFonts w:ascii="Calibri" w:hAnsi="Calibri" w:eastAsia="Calibri" w:cs="Calibri"/>
-          <w:b w:val="0"/>
-          <w:bCs w:val="0"/>
-          <w:sz w:val="22"/>
-          <w:szCs w:val="22"/>
-          <w:highlight w:val="none"/>
-          <w:lang w:val="es-AR"/>
-        </w:rPr>
-        <w:t xml:space="preserve">asignarEspecialidad, </w:t>
-      </w:r>
-      <w:r>
-        <w:rPr>
-          <w:rFonts w:ascii="Calibri" w:hAnsi="Calibri" w:eastAsia="Calibri" w:cs="Calibri"/>
-          <w:b w:val="0"/>
-          <w:bCs w:val="0"/>
-          <w:sz w:val="22"/>
-          <w:szCs w:val="22"/>
-          <w:highlight w:val="none"/>
-          <w:lang w:val="es-AR"/>
-        </w:rPr>
-        <w:t xml:space="preserve">desasignarEspecialidad, </w:t>
-      </w:r>
-      <w:r>
-        <w:rPr>
-          <w:rFonts w:ascii="Calibri" w:hAnsi="Calibri" w:eastAsia="Calibri" w:cs="Calibri"/>
-          <w:b w:val="0"/>
-          <w:bCs w:val="0"/>
-          <w:sz w:val="22"/>
-          <w:szCs w:val="22"/>
-          <w:highlight w:val="none"/>
-          <w:lang w:val="es-AR"/>
-        </w:rPr>
-        <w:t xml:space="preserve">desasignarEspecialidades y </w:t>
-      </w:r>
-      <w:r>
-        <w:rPr>
-          <w:rFonts w:ascii="Calibri" w:hAnsi="Calibri" w:eastAsia="Calibri" w:cs="Calibri"/>
-          <w:b w:val="0"/>
-          <w:bCs w:val="0"/>
-          <w:sz w:val="22"/>
-          <w:szCs w:val="22"/>
-          <w:highlight w:val="none"/>
-          <w:lang w:val="es-AR"/>
-        </w:rPr>
-        <w:t xml:space="preserve">reasignarEspecialidad.</w:t>
-      </w:r>
-      <w:r>
-        <w:rPr>
-          <w:rFonts w:ascii="Calibri" w:hAnsi="Calibri" w:eastAsia="Calibri" w:cs="Calibri"/>
+          <w:rFonts w:ascii="Arial" w:hAnsi="Arial" w:eastAsia="Arial" w:cs="Arial"/>
           <w:b w:val="0"/>
           <w:bCs w:val="0"/>
           <w:sz w:val="22"/>
@@ -681,268 +43,7 @@
       </w:r>
       <w:r>
         <w:rPr>
-          <w:highlight w:val="none"/>
-        </w:rPr>
-      </w:r>
-    </w:p>
-    <w:p>
-      <w:pPr>
-        <w:pBdr>
-          <w:top w:val="none" w:color="000000" w:sz="4" w:space="0"/>
-          <w:left w:val="none" w:color="000000" w:sz="4" w:space="0"/>
-          <w:bottom w:val="none" w:color="000000" w:sz="4" w:space="0"/>
-          <w:right w:val="none" w:color="000000" w:sz="4" w:space="0"/>
-        </w:pBdr>
-        <w:spacing w:before="0" w:line="276" w:lineRule="auto"/>
-        <w:ind w:right="0" w:firstLine="0" w:left="0"/>
-        <w:jc w:val="both"/>
-        <w:rPr>
-          <w:highlight w:val="none"/>
-          <w:lang w:val="es-AR" w:bidi="es-AR"/>
-        </w:rPr>
-      </w:pPr>
-      <w:r>
-        <w:rPr>
-          <w:highlight w:val="none"/>
-          <w:lang w:val="es-AR" w:bidi="es-AR"/>
-        </w:rPr>
-        <w:t xml:space="preserve">Correcion de “</w:t>
-      </w:r>
-      <w:r>
-        <w:rPr>
-          <w:highlight w:val="none"/>
-          <w:lang w:val="es-AR" w:bidi="es-AR"/>
-        </w:rPr>
-        <w:t xml:space="preserve">IF( (@temporada != 'Verano') OR (@temporada != 'Invierno') OR (@temporada != 'Otoño') OR (@temporada != 'Primavera'))</w:t>
-      </w:r>
-      <w:r>
-        <w:rPr>
-          <w:highlight w:val="none"/>
-          <w:lang w:val="es-AR" w:bidi="es-AR"/>
-        </w:rPr>
-        <w:t xml:space="preserve">” por </w:t>
-      </w:r>
-      <w:r>
-        <w:rPr>
-          <w:highlight w:val="none"/>
-          <w:lang w:val="es-AR" w:bidi="es-AR"/>
-        </w:rPr>
-        <w:t xml:space="preserve"> “</w:t>
-      </w:r>
-      <w:r>
-        <w:rPr>
-          <w:rFonts w:ascii="Cascadia Mono" w:hAnsi="Cascadia Mono" w:eastAsia="Cascadia Mono" w:cs="Cascadia Mono"/>
-          <w:color w:val="0000ff"/>
-          <w:sz w:val="18"/>
-        </w:rPr>
-        <w:t xml:space="preserve">IF </w:t>
-      </w:r>
-      <w:r>
-        <w:rPr>
-          <w:rFonts w:ascii="Cascadia Mono" w:hAnsi="Cascadia Mono" w:eastAsia="Cascadia Mono" w:cs="Cascadia Mono"/>
-          <w:color w:val="808080"/>
-          <w:sz w:val="18"/>
-        </w:rPr>
-        <w:t xml:space="preserve">(</w:t>
-      </w:r>
-      <w:r>
-        <w:rPr>
-          <w:rFonts w:ascii="Cascadia Mono" w:hAnsi="Cascadia Mono" w:eastAsia="Cascadia Mono" w:cs="Cascadia Mono"/>
-          <w:color w:val="000000"/>
-          <w:sz w:val="18"/>
-        </w:rPr>
-        <w:t xml:space="preserve">@temporada </w:t>
-      </w:r>
-      <w:r>
-        <w:rPr>
-          <w:rFonts w:ascii="Cascadia Mono" w:hAnsi="Cascadia Mono" w:eastAsia="Cascadia Mono" w:cs="Cascadia Mono"/>
-          <w:color w:val="808080"/>
-          <w:sz w:val="18"/>
-        </w:rPr>
-        <w:t xml:space="preserve">NOT</w:t>
-      </w:r>
-      <w:r>
-        <w:rPr>
-          <w:rFonts w:ascii="Cascadia Mono" w:hAnsi="Cascadia Mono" w:eastAsia="Cascadia Mono" w:cs="Cascadia Mono"/>
-          <w:color w:val="000000"/>
-          <w:sz w:val="18"/>
-        </w:rPr>
-        <w:t xml:space="preserve"> </w:t>
-      </w:r>
-      <w:r>
-        <w:rPr>
-          <w:rFonts w:ascii="Cascadia Mono" w:hAnsi="Cascadia Mono" w:eastAsia="Cascadia Mono" w:cs="Cascadia Mono"/>
-          <w:color w:val="808080"/>
-          <w:sz w:val="18"/>
-        </w:rPr>
-        <w:t xml:space="preserve">IN</w:t>
-      </w:r>
-      <w:r>
-        <w:rPr>
-          <w:rFonts w:ascii="Cascadia Mono" w:hAnsi="Cascadia Mono" w:eastAsia="Cascadia Mono" w:cs="Cascadia Mono"/>
-          <w:color w:val="0000ff"/>
-          <w:sz w:val="18"/>
-        </w:rPr>
-        <w:t xml:space="preserve"> </w:t>
-      </w:r>
-      <w:r>
-        <w:rPr>
-          <w:rFonts w:ascii="Cascadia Mono" w:hAnsi="Cascadia Mono" w:eastAsia="Cascadia Mono" w:cs="Cascadia Mono"/>
-          <w:color w:val="808080"/>
-          <w:sz w:val="18"/>
-        </w:rPr>
-        <w:t xml:space="preserve">(</w:t>
-      </w:r>
-      <w:r>
-        <w:rPr>
-          <w:rFonts w:ascii="Cascadia Mono" w:hAnsi="Cascadia Mono" w:eastAsia="Cascadia Mono" w:cs="Cascadia Mono"/>
-          <w:color w:val="ff0000"/>
-          <w:sz w:val="18"/>
-        </w:rPr>
-        <w:t xml:space="preserve">'Verano'</w:t>
-      </w:r>
-      <w:r>
-        <w:rPr>
-          <w:rFonts w:ascii="Cascadia Mono" w:hAnsi="Cascadia Mono" w:eastAsia="Cascadia Mono" w:cs="Cascadia Mono"/>
-          <w:color w:val="808080"/>
-          <w:sz w:val="18"/>
-        </w:rPr>
-        <w:t xml:space="preserve">,</w:t>
-      </w:r>
-      <w:r>
-        <w:rPr>
-          <w:rFonts w:ascii="Cascadia Mono" w:hAnsi="Cascadia Mono" w:eastAsia="Cascadia Mono" w:cs="Cascadia Mono"/>
-          <w:color w:val="000000"/>
-          <w:sz w:val="18"/>
-        </w:rPr>
-        <w:t xml:space="preserve"> </w:t>
-      </w:r>
-      <w:r>
-        <w:rPr>
-          <w:rFonts w:ascii="Cascadia Mono" w:hAnsi="Cascadia Mono" w:eastAsia="Cascadia Mono" w:cs="Cascadia Mono"/>
-          <w:color w:val="ff0000"/>
-          <w:sz w:val="18"/>
-        </w:rPr>
-        <w:t xml:space="preserve">'Invierno'</w:t>
-      </w:r>
-      <w:r>
-        <w:rPr>
-          <w:rFonts w:ascii="Cascadia Mono" w:hAnsi="Cascadia Mono" w:eastAsia="Cascadia Mono" w:cs="Cascadia Mono"/>
-          <w:color w:val="808080"/>
-          <w:sz w:val="18"/>
-        </w:rPr>
-        <w:t xml:space="preserve">,</w:t>
-      </w:r>
-      <w:r>
-        <w:rPr>
-          <w:rFonts w:ascii="Cascadia Mono" w:hAnsi="Cascadia Mono" w:eastAsia="Cascadia Mono" w:cs="Cascadia Mono"/>
-          <w:color w:val="000000"/>
-          <w:sz w:val="18"/>
-        </w:rPr>
-        <w:t xml:space="preserve"> </w:t>
-      </w:r>
-      <w:r>
-        <w:rPr>
-          <w:rFonts w:ascii="Cascadia Mono" w:hAnsi="Cascadia Mono" w:eastAsia="Cascadia Mono" w:cs="Cascadia Mono"/>
-          <w:color w:val="ff0000"/>
-          <w:sz w:val="18"/>
-        </w:rPr>
-        <w:t xml:space="preserve">'Otoño'</w:t>
-      </w:r>
-      <w:r>
-        <w:rPr>
-          <w:rFonts w:ascii="Cascadia Mono" w:hAnsi="Cascadia Mono" w:eastAsia="Cascadia Mono" w:cs="Cascadia Mono"/>
-          <w:color w:val="808080"/>
-          <w:sz w:val="18"/>
-        </w:rPr>
-        <w:t xml:space="preserve">,</w:t>
-      </w:r>
-      <w:r>
-        <w:rPr>
-          <w:rFonts w:ascii="Cascadia Mono" w:hAnsi="Cascadia Mono" w:eastAsia="Cascadia Mono" w:cs="Cascadia Mono"/>
-          <w:color w:val="000000"/>
-          <w:sz w:val="18"/>
-        </w:rPr>
-        <w:t xml:space="preserve"> </w:t>
-      </w:r>
-      <w:r>
-        <w:rPr>
-          <w:rFonts w:ascii="Cascadia Mono" w:hAnsi="Cascadia Mono" w:eastAsia="Cascadia Mono" w:cs="Cascadia Mono"/>
-          <w:color w:val="ff0000"/>
-          <w:sz w:val="18"/>
-        </w:rPr>
-        <w:t xml:space="preserve">'Primavera'</w:t>
-      </w:r>
-      <w:r>
-        <w:rPr>
-          <w:rFonts w:ascii="Cascadia Mono" w:hAnsi="Cascadia Mono" w:eastAsia="Cascadia Mono" w:cs="Cascadia Mono"/>
-          <w:color w:val="808080"/>
-          <w:sz w:val="18"/>
-        </w:rPr>
-        <w:t xml:space="preserve">))</w:t>
-      </w:r>
-      <w:r>
-        <w:rPr>
-          <w:highlight w:val="none"/>
-          <w:lang w:val="es-AR" w:bidi="es-AR"/>
-        </w:rPr>
-        <w:t xml:space="preserve">” en altahorario.</w:t>
-      </w:r>
-      <w:r>
-        <w:rPr>
-          <w:rFonts w:ascii="Calibri" w:hAnsi="Calibri" w:eastAsia="Calibri" w:cs="Calibri"/>
-          <w:b w:val="0"/>
-          <w:bCs w:val="0"/>
-          <w:sz w:val="22"/>
-          <w:szCs w:val="22"/>
-          <w:highlight w:val="none"/>
-          <w:lang w:val="es-AR"/>
-        </w:rPr>
-      </w:r>
-      <w:r>
-        <w:rPr>
-          <w:highlight w:val="none"/>
-          <w:lang w:val="es-AR" w:bidi="es-AR"/>
-        </w:rPr>
-      </w:r>
-    </w:p>
-    <w:p>
-      <w:pPr>
-        <w:pBdr>
-          <w:top w:val="none" w:color="000000" w:sz="4" w:space="0"/>
-          <w:left w:val="none" w:color="000000" w:sz="4" w:space="0"/>
-          <w:bottom w:val="none" w:color="000000" w:sz="4" w:space="0"/>
-          <w:right w:val="none" w:color="000000" w:sz="4" w:space="0"/>
-        </w:pBdr>
-        <w:spacing w:before="0" w:line="276" w:lineRule="auto"/>
-        <w:ind w:right="0" w:firstLine="0" w:left="0"/>
-        <w:jc w:val="both"/>
-        <w:rPr>
-          <w:rFonts w:ascii="Calibri" w:hAnsi="Calibri" w:eastAsia="Calibri" w:cs="Calibri"/>
-          <w:b w:val="0"/>
-          <w:bCs w:val="0"/>
-          <w:sz w:val="22"/>
-          <w:szCs w:val="22"/>
-          <w:highlight w:val="none"/>
-          <w:lang w:val="es-AR"/>
-        </w:rPr>
-      </w:pPr>
-      <w:r>
-        <w:rPr>
-          <w:highlight w:val="none"/>
-          <w:lang w:val="es-AR" w:bidi="es-AR"/>
-        </w:rPr>
-        <w:t xml:space="preserve">Correciones menores y de sintaxis.</w:t>
-      </w:r>
-      <w:r>
-        <w:rPr>
-          <w:highlight w:val="none"/>
-          <w:lang w:val="es-AR" w:bidi="es-AR"/>
-        </w:rPr>
-      </w:r>
-      <w:r>
-        <w:rPr>
-          <w:rFonts w:ascii="Calibri" w:hAnsi="Calibri" w:eastAsia="Calibri" w:cs="Calibri"/>
+          <w:rFonts w:ascii="Arial" w:hAnsi="Arial" w:eastAsia="Arial" w:cs="Arial"/>
           <w:b w:val="0"/>
           <w:bCs w:val="0"/>
           <w:sz w:val="22"/>
@@ -954,65 +55,13 @@
     </w:p>
     <w:p>
       <w:pPr>
-        <w:pStyle w:val="833"/>
-        <w:pBdr>
-          <w:top w:val="none" w:color="000000" w:sz="4" w:space="0"/>
-          <w:left w:val="none" w:color="000000" w:sz="4" w:space="0"/>
-          <w:bottom w:val="none" w:color="000000" w:sz="4" w:space="0"/>
-          <w:right w:val="none" w:color="000000" w:sz="4" w:space="0"/>
-        </w:pBdr>
-        <w:spacing w:before="0" w:line="276" w:lineRule="auto"/>
-        <w:ind w:right="0" w:firstLine="0" w:left="0"/>
+        <w:pBdr/>
+        <w:shd w:val="nil" w:color="000000"/>
+        <w:spacing/>
+        <w:ind w:firstLine="0"/>
+        <w:jc w:val="both"/>
         <w:rPr>
-          <w:rFonts w:ascii="Calibri" w:hAnsi="Calibri" w:cs="Calibri"/>
-          <w:b/>
-          <w:bCs/>
-          <w:sz w:val="24"/>
-          <w:szCs w:val="24"/>
-        </w:rPr>
-      </w:pPr>
-      <w:r>
-        <w:rPr>
-          <w:rFonts w:ascii="Calibri" w:hAnsi="Calibri" w:eastAsia="Calibri" w:cs="Calibri"/>
-          <w:b/>
-          <w:bCs/>
-          <w:color w:val="000000"/>
-          <w:sz w:val="24"/>
-          <w:szCs w:val="24"/>
-        </w:rPr>
-        <w:t xml:space="preserve">Observaciones (Posibles cambios)</w:t>
-      </w:r>
-      <w:r>
-        <w:rPr>
-          <w:rFonts w:ascii="Calibri" w:hAnsi="Calibri" w:eastAsia="Calibri" w:cs="Calibri"/>
-          <w:b/>
-          <w:bCs/>
-          <w:sz w:val="24"/>
-          <w:szCs w:val="24"/>
-        </w:rPr>
-      </w:r>
-      <w:r>
-        <w:rPr>
-          <w:rFonts w:ascii="Calibri" w:hAnsi="Calibri" w:cs="Calibri"/>
-          <w:b/>
-          <w:bCs/>
-          <w:sz w:val="24"/>
-          <w:szCs w:val="24"/>
-        </w:rPr>
-      </w:r>
-    </w:p>
-    <w:p>
-      <w:pPr>
-        <w:pBdr>
-          <w:top w:val="none" w:color="000000" w:sz="4" w:space="0"/>
-          <w:left w:val="none" w:color="000000" w:sz="4" w:space="0"/>
-          <w:bottom w:val="none" w:color="000000" w:sz="4" w:space="0"/>
-          <w:right w:val="none" w:color="000000" w:sz="4" w:space="0"/>
-        </w:pBdr>
-        <w:spacing w:before="0" w:line="276" w:lineRule="auto"/>
-        <w:ind w:right="0" w:firstLine="0" w:left="0"/>
-        <w:rPr>
-          <w:rFonts w:ascii="Calibri" w:hAnsi="Calibri" w:cs="Calibri"/>
+          <w:rFonts w:ascii="Arial" w:hAnsi="Arial" w:cs="Arial"/>
           <w:b w:val="0"/>
           <w:bCs w:val="0"/>
           <w:sz w:val="22"/>
@@ -1021,633 +70,7 @@
       </w:pPr>
       <w:r>
         <w:rPr>
-          <w:rFonts w:ascii="Calibri" w:hAnsi="Calibri" w:eastAsia="Calibri" w:cs="Calibri"/>
-          <w:b w:val="0"/>
-          <w:bCs w:val="0"/>
-          <w:color w:val="000000"/>
-          <w:sz w:val="22"/>
-          <w:szCs w:val="22"/>
-        </w:rPr>
-        <w:t xml:space="preserve">Asignación de </w:t>
-      </w:r>
-      <w:r>
-        <w:rPr>
-          <w:rFonts w:ascii="Calibri" w:hAnsi="Calibri" w:eastAsia="Calibri" w:cs="Calibri"/>
-          <w:b w:val="0"/>
-          <w:bCs w:val="0"/>
-          <w:color w:val="000000"/>
-          <w:sz w:val="22"/>
-          <w:szCs w:val="22"/>
-          <w:lang w:val="es-AR"/>
-        </w:rPr>
-        <w:t xml:space="preserve">g</w:t>
-      </w:r>
-      <w:r>
-        <w:rPr>
-          <w:rFonts w:ascii="Calibri" w:hAnsi="Calibri" w:eastAsia="Calibri" w:cs="Calibri"/>
-          <w:b w:val="0"/>
-          <w:bCs w:val="0"/>
-          <w:color w:val="000000"/>
-          <w:sz w:val="22"/>
-          <w:szCs w:val="22"/>
-        </w:rPr>
-        <w:t xml:space="preserve">uías en la tabla Actividad:</w:t>
-      </w:r>
-      <w:r>
-        <w:rPr>
-          <w:rFonts w:ascii="Calibri" w:hAnsi="Calibri" w:eastAsia="Calibri" w:cs="Calibri"/>
-          <w:b w:val="0"/>
-          <w:bCs w:val="0"/>
-          <w:sz w:val="22"/>
-          <w:szCs w:val="22"/>
-        </w:rPr>
-      </w:r>
-      <w:r>
-        <w:rPr>
-          <w:rFonts w:ascii="Calibri" w:hAnsi="Calibri" w:cs="Calibri"/>
-          <w:b w:val="0"/>
-          <w:bCs w:val="0"/>
-          <w:sz w:val="22"/>
-          <w:szCs w:val="22"/>
-        </w:rPr>
-      </w:r>
-    </w:p>
-    <w:p>
-      <w:pPr>
-        <w:pStyle w:val="894"/>
-        <w:numPr>
-          <w:ilvl w:val="0"/>
-          <w:numId w:val="2"/>
-        </w:numPr>
-        <w:pBdr>
-          <w:top w:val="none" w:color="000000" w:sz="4" w:space="0"/>
-          <w:left w:val="none" w:color="000000" w:sz="4" w:space="0"/>
-          <w:bottom w:val="none" w:color="000000" w:sz="4" w:space="0"/>
-          <w:right w:val="none" w:color="000000" w:sz="4" w:space="0"/>
-        </w:pBdr>
-        <w:spacing w:before="0" w:line="276" w:lineRule="auto"/>
-        <w:ind w:right="0"/>
-        <w:rPr>
-          <w:rFonts w:ascii="Calibri" w:hAnsi="Calibri" w:cs="Calibri"/>
-          <w:b w:val="0"/>
-          <w:bCs w:val="0"/>
-          <w:sz w:val="22"/>
-          <w:szCs w:val="22"/>
-        </w:rPr>
-      </w:pPr>
-      <w:r>
-        <w:rPr>
-          <w:rFonts w:ascii="Calibri" w:hAnsi="Calibri" w:eastAsia="Calibri" w:cs="Calibri"/>
-          <w:b w:val="0"/>
-          <w:bCs w:val="0"/>
-          <w:color w:val="000000"/>
-          <w:sz w:val="22"/>
-          <w:szCs w:val="22"/>
-        </w:rPr>
-        <w:t xml:space="preserve">Actualmente, el campo </w:t>
-      </w:r>
-      <w:r>
-        <w:rPr>
-          <w:rFonts w:ascii="Calibri" w:hAnsi="Calibri" w:eastAsia="Calibri" w:cs="Calibri"/>
-          <w:b w:val="0"/>
-          <w:bCs w:val="0"/>
-          <w:color w:val="000000"/>
-          <w:sz w:val="22"/>
-          <w:szCs w:val="22"/>
-          <w:lang w:val="es-AR"/>
-        </w:rPr>
-        <w:t xml:space="preserve">g</w:t>
-      </w:r>
-      <w:r>
-        <w:rPr>
-          <w:rFonts w:ascii="Calibri" w:hAnsi="Calibri" w:eastAsia="Calibri" w:cs="Calibri"/>
-          <w:b w:val="0"/>
-          <w:bCs w:val="0"/>
-          <w:color w:val="000000"/>
-          <w:sz w:val="22"/>
-          <w:szCs w:val="22"/>
-        </w:rPr>
-        <w:t xml:space="preserve">uia es una clave foránea en la tabla Actividad. </w:t>
-      </w:r>
-      <w:r>
-        <w:rPr>
-          <w:rFonts w:ascii="Calibri" w:hAnsi="Calibri" w:eastAsia="Calibri" w:cs="Calibri"/>
-          <w:b w:val="0"/>
-          <w:bCs w:val="0"/>
-          <w:color w:val="000000"/>
-          <w:sz w:val="22"/>
-          <w:szCs w:val="22"/>
-          <w:lang w:val="es-AR"/>
-        </w:rPr>
-        <w:t xml:space="preserve">Se</w:t>
-      </w:r>
-      <w:r>
-        <w:rPr>
-          <w:rFonts w:ascii="Calibri" w:hAnsi="Calibri" w:eastAsia="Calibri" w:cs="Calibri"/>
-          <w:b w:val="0"/>
-          <w:bCs w:val="0"/>
-          <w:color w:val="000000"/>
-          <w:sz w:val="22"/>
-          <w:szCs w:val="22"/>
-          <w:lang w:val="es-AR"/>
-        </w:rPr>
-        <w:t xml:space="preserve"> </w:t>
-      </w:r>
-      <w:r>
-        <w:rPr>
-          <w:rFonts w:ascii="Calibri" w:hAnsi="Calibri" w:eastAsia="Calibri" w:cs="Calibri"/>
-          <w:b w:val="0"/>
-          <w:bCs w:val="0"/>
-          <w:color w:val="000000"/>
-          <w:sz w:val="22"/>
-          <w:szCs w:val="22"/>
-        </w:rPr>
-        <w:t xml:space="preserve">asume que una actividad genérica le pertenece a un único guía de forma estática.</w:t>
-      </w:r>
-      <w:r>
-        <w:rPr>
-          <w:rFonts w:ascii="Calibri" w:hAnsi="Calibri" w:eastAsia="Calibri" w:cs="Calibri"/>
-          <w:b w:val="0"/>
-          <w:bCs w:val="0"/>
-          <w:color w:val="000000"/>
-          <w:sz w:val="22"/>
-          <w:szCs w:val="22"/>
-          <w:lang w:val="es-AR"/>
-        </w:rPr>
-        <w:t xml:space="preserve"> </w:t>
-      </w:r>
-      <w:r>
-        <w:rPr>
-          <w:rFonts w:ascii="Calibri" w:hAnsi="Calibri" w:eastAsia="Calibri" w:cs="Calibri"/>
-          <w:b w:val="0"/>
-          <w:bCs w:val="0"/>
-          <w:color w:val="000000"/>
-          <w:sz w:val="22"/>
-          <w:szCs w:val="22"/>
-          <w:lang w:val="es-AR"/>
-        </w:rPr>
-        <w:t xml:space="preserve">Probablemente se debería</w:t>
-      </w:r>
-      <w:r>
-        <w:rPr>
-          <w:rFonts w:ascii="Calibri" w:hAnsi="Calibri" w:eastAsia="Calibri" w:cs="Calibri"/>
-          <w:b w:val="0"/>
-          <w:bCs w:val="0"/>
-          <w:color w:val="000000"/>
-          <w:sz w:val="22"/>
-          <w:szCs w:val="22"/>
-        </w:rPr>
-        <w:t xml:space="preserve"> registrar qué guía participa en cada tour, mover esta asignación a la tabla HorarioActividad</w:t>
-      </w:r>
-      <w:r>
-        <w:rPr>
-          <w:rFonts w:ascii="Calibri" w:hAnsi="Calibri" w:eastAsia="Calibri" w:cs="Calibri"/>
-          <w:b w:val="0"/>
-          <w:bCs w:val="0"/>
-          <w:color w:val="000000"/>
-          <w:sz w:val="22"/>
-          <w:szCs w:val="22"/>
-          <w:lang w:val="es-AR"/>
-        </w:rPr>
-        <w:t xml:space="preserve">, </w:t>
-      </w:r>
-      <w:r>
-        <w:rPr>
-          <w:rFonts w:ascii="Calibri" w:hAnsi="Calibri" w:eastAsia="Calibri" w:cs="Calibri"/>
-          <w:b w:val="0"/>
-          <w:bCs w:val="0"/>
-          <w:color w:val="000000"/>
-          <w:sz w:val="22"/>
-          <w:szCs w:val="22"/>
-        </w:rPr>
-        <w:t xml:space="preserve">la instancia específica del tour. Esto permitiría que distintos guías tomen diferentes turno</w:t>
-      </w:r>
-      <w:r>
-        <w:rPr>
-          <w:rFonts w:ascii="Calibri" w:hAnsi="Calibri" w:eastAsia="Calibri" w:cs="Calibri"/>
-          <w:b w:val="0"/>
-          <w:bCs w:val="0"/>
-          <w:color w:val="000000"/>
-          <w:sz w:val="22"/>
-          <w:szCs w:val="22"/>
-        </w:rPr>
-        <w:t xml:space="preserve">s de la misma actividad. </w:t>
-      </w:r>
-      <w:r>
-        <w:rPr>
-          <w:rFonts w:ascii="Calibri" w:hAnsi="Calibri" w:cs="Calibri"/>
-          <w:b w:val="0"/>
-          <w:bCs w:val="0"/>
-          <w:sz w:val="22"/>
-          <w:szCs w:val="22"/>
-        </w:rPr>
-      </w:r>
-      <w:r>
-        <w:rPr>
-          <w:rFonts w:ascii="Calibri" w:hAnsi="Calibri" w:cs="Calibri"/>
-          <w:b w:val="0"/>
-          <w:bCs w:val="0"/>
-          <w:sz w:val="22"/>
-          <w:szCs w:val="22"/>
-        </w:rPr>
-      </w:r>
-    </w:p>
-    <w:p>
-      <w:pPr>
-        <w:pBdr>
-          <w:top w:val="none" w:color="000000" w:sz="4" w:space="0"/>
-          <w:left w:val="none" w:color="000000" w:sz="4" w:space="0"/>
-          <w:bottom w:val="none" w:color="000000" w:sz="4" w:space="0"/>
-          <w:right w:val="none" w:color="000000" w:sz="4" w:space="0"/>
-        </w:pBdr>
-        <w:spacing w:before="0" w:line="276" w:lineRule="auto"/>
-        <w:ind w:right="0" w:firstLine="0" w:left="0"/>
-        <w:rPr>
-          <w:rFonts w:ascii="Calibri" w:hAnsi="Calibri" w:eastAsia="Calibri" w:cs="Calibri"/>
-          <w:b/>
-          <w:bCs/>
-          <w:color w:val="000000"/>
-          <w:sz w:val="22"/>
-          <w:szCs w:val="22"/>
-          <w:highlight w:val="none"/>
-        </w:rPr>
-      </w:pPr>
-      <w:r>
-        <w:rPr>
-          <w:rFonts w:ascii="Calibri" w:hAnsi="Calibri" w:eastAsia="Calibri" w:cs="Calibri"/>
-          <w:b/>
-          <w:bCs/>
-          <w:color w:val="000000"/>
-          <w:sz w:val="22"/>
-          <w:szCs w:val="22"/>
-        </w:rPr>
-        <w:t xml:space="preserve">Consideraciones sobre el Cifrado de Datos (Entrega 8):</w:t>
-      </w:r>
-      <w:r>
-        <w:rPr>
-          <w:rFonts w:ascii="Calibri" w:hAnsi="Calibri" w:eastAsia="Calibri" w:cs="Calibri"/>
-          <w:b/>
-          <w:bCs/>
-          <w:sz w:val="22"/>
-          <w:szCs w:val="22"/>
-        </w:rPr>
-      </w:r>
-      <w:r>
-        <w:rPr>
-          <w:rFonts w:ascii="Calibri" w:hAnsi="Calibri" w:eastAsia="Calibri" w:cs="Calibri"/>
-          <w:b/>
-          <w:bCs/>
-          <w:color w:val="000000"/>
-          <w:sz w:val="22"/>
-          <w:szCs w:val="22"/>
-          <w:highlight w:val="none"/>
-        </w:rPr>
-      </w:r>
-    </w:p>
-    <w:p>
-      <w:pPr>
-        <w:pStyle w:val="894"/>
-        <w:numPr>
-          <w:ilvl w:val="0"/>
-          <w:numId w:val="2"/>
-        </w:numPr>
-        <w:pBdr>
-          <w:top w:val="none" w:color="000000" w:sz="4" w:space="0"/>
-          <w:left w:val="none" w:color="000000" w:sz="4" w:space="0"/>
-          <w:bottom w:val="none" w:color="000000" w:sz="4" w:space="0"/>
-          <w:right w:val="none" w:color="000000" w:sz="4" w:space="0"/>
-        </w:pBdr>
-        <w:spacing w:before="0" w:line="276" w:lineRule="auto"/>
-        <w:ind w:right="0"/>
-        <w:rPr>
-          <w:rFonts w:ascii="Calibri" w:hAnsi="Calibri" w:cs="Calibri"/>
-          <w:b w:val="0"/>
-          <w:bCs w:val="0"/>
-          <w:sz w:val="22"/>
-          <w:szCs w:val="22"/>
-        </w:rPr>
-      </w:pPr>
-      <w:r>
-        <w:rPr>
-          <w:rFonts w:ascii="Calibri" w:hAnsi="Calibri" w:eastAsia="Calibri" w:cs="Calibri"/>
-          <w:b w:val="0"/>
-          <w:bCs w:val="0"/>
-          <w:color w:val="000000"/>
-          <w:sz w:val="22"/>
-          <w:szCs w:val="22"/>
-        </w:rPr>
-        <w:t xml:space="preserve">El proyecto exige aplicar cifrado a los datos sensibles</w:t>
-      </w:r>
-      <w:r>
-        <w:rPr>
-          <w:rFonts w:ascii="Calibri" w:hAnsi="Calibri" w:eastAsia="Calibri" w:cs="Calibri"/>
-          <w:b w:val="0"/>
-          <w:bCs w:val="0"/>
-          <w:color w:val="000000"/>
-          <w:sz w:val="22"/>
-          <w:szCs w:val="22"/>
-          <w:lang w:val="es-AR"/>
-        </w:rPr>
-        <w:t xml:space="preserve">,</w:t>
-      </w:r>
-      <w:r>
-        <w:rPr>
-          <w:rFonts w:ascii="Calibri" w:hAnsi="Calibri" w:eastAsia="Calibri" w:cs="Calibri"/>
-          <w:b w:val="0"/>
-          <w:bCs w:val="0"/>
-          <w:color w:val="000000"/>
-          <w:sz w:val="22"/>
-          <w:szCs w:val="22"/>
-        </w:rPr>
-        <w:t xml:space="preserve"> El campo DNI en la tabla Persona </w:t>
-      </w:r>
-      <w:r>
-        <w:rPr>
-          <w:rFonts w:ascii="Calibri" w:hAnsi="Calibri" w:eastAsia="Calibri" w:cs="Calibri"/>
-          <w:b w:val="0"/>
-          <w:bCs w:val="0"/>
-          <w:color w:val="000000"/>
-          <w:sz w:val="22"/>
-          <w:szCs w:val="22"/>
-          <w:lang w:val="es-AR"/>
-        </w:rPr>
-        <w:t xml:space="preserve">seria el candidato </w:t>
-      </w:r>
-      <w:r>
-        <w:rPr>
-          <w:rFonts w:ascii="Calibri" w:hAnsi="Calibri" w:eastAsia="Calibri" w:cs="Calibri"/>
-          <w:b w:val="0"/>
-          <w:bCs w:val="0"/>
-          <w:color w:val="000000"/>
-          <w:sz w:val="22"/>
-          <w:szCs w:val="22"/>
-        </w:rPr>
-        <w:t xml:space="preserve">para esto. </w:t>
-      </w:r>
-      <w:r>
-        <w:rPr>
-          <w:rFonts w:ascii="Calibri" w:hAnsi="Calibri" w:eastAsia="Calibri" w:cs="Calibri"/>
-          <w:b w:val="0"/>
-          <w:bCs w:val="0"/>
-          <w:color w:val="000000"/>
-          <w:sz w:val="22"/>
-          <w:szCs w:val="22"/>
-        </w:rPr>
-        <w:t xml:space="preserve">Actualmente, DNI está definido como INT NOT NULL UNIQUE. Si más se cifra esta columna (lo que requier</w:t>
-      </w:r>
-      <w:r>
-        <w:rPr>
-          <w:rFonts w:ascii="Calibri" w:hAnsi="Calibri" w:eastAsia="Calibri" w:cs="Calibri"/>
-          <w:b w:val="0"/>
-          <w:bCs w:val="0"/>
-          <w:color w:val="000000"/>
-          <w:sz w:val="22"/>
-          <w:szCs w:val="22"/>
-          <w:lang w:val="es-AR"/>
-        </w:rPr>
-        <w:t xml:space="preserve">iria</w:t>
-      </w:r>
-      <w:r>
-        <w:rPr>
-          <w:rFonts w:ascii="Calibri" w:hAnsi="Calibri" w:eastAsia="Calibri" w:cs="Calibri"/>
-          <w:b w:val="0"/>
-          <w:bCs w:val="0"/>
-          <w:color w:val="000000"/>
-          <w:sz w:val="22"/>
-          <w:szCs w:val="22"/>
-        </w:rPr>
-        <w:t xml:space="preserve"> cambiar el tipo de dato a VARBINARY), hay que tener en cuenta que las funciones de cifrado de SQL Server pueden generar resu</w:t>
-      </w:r>
-      <w:r>
-        <w:rPr>
-          <w:rFonts w:ascii="Calibri" w:hAnsi="Calibri" w:eastAsia="Calibri" w:cs="Calibri"/>
-          <w:b w:val="0"/>
-          <w:bCs w:val="0"/>
-          <w:color w:val="000000"/>
-          <w:sz w:val="22"/>
-          <w:szCs w:val="22"/>
-        </w:rPr>
-        <w:t xml:space="preserve">ltados diferentes para un mismo valor de entrada. Esto romper</w:t>
-      </w:r>
-      <w:r>
-        <w:rPr>
-          <w:rFonts w:ascii="Calibri" w:hAnsi="Calibri" w:eastAsia="Calibri" w:cs="Calibri"/>
-          <w:b w:val="0"/>
-          <w:bCs w:val="0"/>
-          <w:color w:val="000000"/>
-          <w:sz w:val="22"/>
-          <w:szCs w:val="22"/>
-          <w:lang w:val="es-AR"/>
-        </w:rPr>
-        <w:t xml:space="preserve">i</w:t>
-      </w:r>
-      <w:r>
-        <w:rPr>
-          <w:rFonts w:ascii="Calibri" w:hAnsi="Calibri" w:eastAsia="Calibri" w:cs="Calibri"/>
-          <w:b w:val="0"/>
-          <w:bCs w:val="0"/>
-          <w:color w:val="000000"/>
-          <w:sz w:val="22"/>
-          <w:szCs w:val="22"/>
-        </w:rPr>
-        <w:t xml:space="preserve">a la validación del constraint UNIQUE nativo, por lo que la validación de duplicados deberá manejarse con una estrategia distinta (por ejemplo, mediante una columna de hash complementaria o dire</w:t>
-      </w:r>
-      <w:r>
-        <w:rPr>
-          <w:rFonts w:ascii="Calibri" w:hAnsi="Calibri" w:eastAsia="Calibri" w:cs="Calibri"/>
-          <w:b w:val="0"/>
-          <w:bCs w:val="0"/>
-          <w:color w:val="000000"/>
-          <w:sz w:val="22"/>
-          <w:szCs w:val="22"/>
-        </w:rPr>
-        <w:t xml:space="preserve">ctamente en la lógica del procedimiento almacenado).</w:t>
-      </w:r>
-      <w:r>
-        <w:rPr>
-          <w:rFonts w:ascii="Calibri" w:hAnsi="Calibri" w:cs="Calibri"/>
-          <w:b w:val="0"/>
-          <w:bCs w:val="0"/>
-          <w:sz w:val="22"/>
-          <w:szCs w:val="22"/>
-        </w:rPr>
-      </w:r>
-      <w:r>
-        <w:rPr>
-          <w:rFonts w:ascii="Calibri" w:hAnsi="Calibri" w:cs="Calibri"/>
-          <w:b w:val="0"/>
-          <w:bCs w:val="0"/>
-          <w:sz w:val="22"/>
-          <w:szCs w:val="22"/>
-        </w:rPr>
-      </w:r>
-    </w:p>
-    <w:p>
-      <w:pPr>
-        <w:pBdr/>
-        <w:shd w:val="nil" w:color="000000"/>
-        <w:spacing/>
-        <w:ind/>
-        <w:rPr>
-          <w:rFonts w:ascii="Calibri" w:hAnsi="Calibri" w:cs="Calibri"/>
-          <w:b w:val="0"/>
-          <w:bCs w:val="0"/>
-          <w:sz w:val="22"/>
-          <w:szCs w:val="22"/>
-        </w:rPr>
-      </w:pPr>
-      <w:r>
-        <w:rPr>
-          <w:rFonts w:ascii="Calibri" w:hAnsi="Calibri" w:cs="Calibri"/>
-          <w:b w:val="0"/>
-          <w:bCs w:val="0"/>
-          <w:sz w:val="22"/>
-          <w:szCs w:val="22"/>
-        </w:rPr>
-      </w:r>
-      <w:r>
-        <w:rPr>
-          <w:rFonts w:ascii="Calibri" w:hAnsi="Calibri" w:cs="Calibri"/>
-          <w:b w:val="0"/>
-          <w:bCs w:val="0"/>
-          <w:sz w:val="22"/>
-          <w:szCs w:val="22"/>
-        </w:rPr>
-      </w:r>
-      <w:r>
-        <w:rPr>
-          <w:rFonts w:ascii="Calibri" w:hAnsi="Calibri" w:cs="Calibri"/>
-          <w:b w:val="0"/>
-          <w:bCs w:val="0"/>
-          <w:sz w:val="22"/>
-          <w:szCs w:val="22"/>
-        </w:rPr>
-      </w:r>
-    </w:p>
-    <w:p>
-      <w:pPr>
-        <w:pBdr/>
-        <w:shd w:val="nil"/>
-        <w:spacing/>
-        <w:ind/>
-        <w:rPr>
-          <w:rFonts w:ascii="Calibri" w:hAnsi="Calibri" w:cs="Calibri"/>
-          <w:b w:val="0"/>
-          <w:bCs w:val="0"/>
-          <w:sz w:val="22"/>
-          <w:szCs w:val="22"/>
-          <w:lang w:val="es-AR"/>
-        </w:rPr>
-      </w:pPr>
-      <w:r>
-        <w:rPr>
-          <w:rFonts w:ascii="Calibri" w:hAnsi="Calibri" w:cs="Calibri"/>
-          <w:b w:val="0"/>
-          <w:bCs w:val="0"/>
-          <w:sz w:val="22"/>
-          <w:szCs w:val="22"/>
-          <w:lang w:val="es-AR"/>
-        </w:rPr>
-        <w:t xml:space="preserve">Modificacion 22/06/2026: </w:t>
-      </w:r>
-      <w:r>
-        <w:rPr>
-          <w:rFonts w:ascii="Calibri" w:hAnsi="Calibri" w:cs="Calibri"/>
-          <w:b w:val="0"/>
-          <w:bCs w:val="0"/>
-          <w:sz w:val="22"/>
-          <w:szCs w:val="22"/>
-        </w:rPr>
-      </w:r>
-    </w:p>
-    <w:p>
-      <w:pPr>
-        <w:pBdr/>
-        <w:shd w:val="nil" w:color="000000"/>
-        <w:spacing/>
-        <w:ind w:firstLine="0"/>
-        <w:rPr>
-          <w:rFonts w:ascii="Calibri" w:hAnsi="Calibri" w:cs="Calibri"/>
-          <w:b w:val="0"/>
-          <w:bCs w:val="0"/>
-          <w:sz w:val="22"/>
-          <w:szCs w:val="22"/>
-        </w:rPr>
-      </w:pPr>
-      <w:r>
-        <w:rPr>
-          <w:rFonts w:ascii="Calibri" w:hAnsi="Calibri" w:cs="Calibri"/>
-          <w:b w:val="0"/>
-          <w:bCs w:val="0"/>
-          <w:sz w:val="22"/>
-          <w:szCs w:val="22"/>
-          <w:lang w:val="es-AR"/>
-        </w:rPr>
-        <w:t xml:space="preserve">Implementacion del cifrado, roles y politica de seguridad. Imlementacion de </w:t>
-      </w:r>
-      <w:r>
-        <w:rPr>
-          <w:rFonts w:ascii="Cascadia Mono" w:hAnsi="Cascadia Mono" w:eastAsia="Cascadia Mono" w:cs="Cascadia Mono"/>
-          <w:color w:val="0000ff"/>
-          <w:sz w:val="18"/>
-        </w:rPr>
-        <w:t xml:space="preserve">constraint</w:t>
-      </w:r>
-      <w:r>
-        <w:rPr>
-          <w:rFonts w:ascii="Cascadia Mono" w:hAnsi="Cascadia Mono" w:eastAsia="Cascadia Mono" w:cs="Cascadia Mono"/>
-          <w:color w:val="000000"/>
-          <w:sz w:val="18"/>
-        </w:rPr>
-        <w:t xml:space="preserve"> UQ_Persona_DNI</w:t>
-      </w:r>
-      <w:r>
-        <w:rPr>
-          <w:rFonts w:ascii="Calibri" w:hAnsi="Calibri" w:cs="Calibri"/>
-          <w:b w:val="0"/>
-          <w:bCs w:val="0"/>
-          <w:sz w:val="22"/>
-          <w:szCs w:val="22"/>
-          <w:lang w:val="es-AR"/>
-        </w:rPr>
-        <w:t xml:space="preserve"> en tabla persona para que los </w:t>
-      </w:r>
-      <w:r>
-        <w:rPr>
-          <w:rFonts w:ascii="Calibri" w:hAnsi="Calibri" w:cs="Calibri"/>
-          <w:b w:val="0"/>
-          <w:bCs w:val="0"/>
-          <w:sz w:val="22"/>
-          <w:szCs w:val="22"/>
-          <w:lang w:val="es-AR"/>
-        </w:rPr>
-        <w:t xml:space="preserve">scripts de migración funcionen correctamente</w:t>
-      </w:r>
-      <w:r>
-        <w:rPr>
-          <w:rFonts w:ascii="Calibri" w:hAnsi="Calibri" w:cs="Calibri"/>
-          <w:b w:val="0"/>
-          <w:bCs w:val="0"/>
-          <w:sz w:val="22"/>
-          <w:szCs w:val="22"/>
-          <w:lang w:val="es-AR"/>
-        </w:rPr>
-        <w:t xml:space="preserve">, sin esto SQL Server genera uno aleatorio cada que se corre el create y </w:t>
-      </w:r>
-      <w:r>
-        <w:rPr>
-          <w:rFonts w:ascii="Calibri" w:hAnsi="Calibri" w:cs="Calibri"/>
-          <w:b w:val="0"/>
-          <w:bCs w:val="0"/>
-          <w:sz w:val="22"/>
-          <w:szCs w:val="22"/>
-          <w:lang w:val="es-AR"/>
-        </w:rPr>
-        <w:t xml:space="preserve">el script de cifrado fallaria al intentar buscar una restricción que ya no se llama igual.</w:t>
-      </w:r>
-      <w:r>
-        <w:rPr>
-          <w:rFonts w:ascii="Calibri" w:hAnsi="Calibri" w:cs="Calibri"/>
+          <w:rFonts w:ascii="Arial" w:hAnsi="Arial" w:eastAsia="Arial" w:cs="Arial"/>
           <w:b w:val="0"/>
           <w:bCs w:val="0"/>
           <w:sz w:val="22"/>
@@ -1655,7 +78,58 @@
           <w:lang w:val="es-AR"/>
         </w:rPr>
       </w:r>
-      <w:r/>
+      <w:r>
+        <w:rPr>
+          <w:rFonts w:ascii="Arial" w:hAnsi="Arial" w:eastAsia="Arial" w:cs="Arial"/>
+          <w:b w:val="0"/>
+          <w:bCs w:val="0"/>
+          <w:sz w:val="22"/>
+          <w:szCs w:val="22"/>
+          <w:lang w:val="es-AR"/>
+        </w:rPr>
+        <w:t xml:space="preserve">Tuve que cambiar unicamente al cifrado simétrico a nivel de columna (usando AES_256) porque el TDE no va para la versión Express de SQL Server. Y sobre el SQL dinámico, como el script tiene que borrar columnas y migra</w:t>
+      </w:r>
+      <w:r>
+        <w:rPr>
+          <w:rFonts w:ascii="Arial" w:hAnsi="Arial" w:eastAsia="Arial" w:cs="Arial"/>
+          <w:b w:val="0"/>
+          <w:bCs w:val="0"/>
+          <w:sz w:val="22"/>
+          <w:szCs w:val="22"/>
+          <w:lang w:val="es-AR"/>
+        </w:rPr>
+        <w:t xml:space="preserve">r datos al mismo tiempo, el motor de SQL me da problemas con la validación previa y tiraba error, por lo que es necesario en esta parte</w:t>
+      </w:r>
+      <w:r>
+        <w:rPr>
+          <w:rFonts w:ascii="Arial" w:hAnsi="Arial" w:eastAsia="Arial" w:cs="Arial"/>
+          <w:b w:val="0"/>
+          <w:bCs w:val="0"/>
+          <w:sz w:val="22"/>
+          <w:szCs w:val="22"/>
+          <w:lang w:val="es-AR"/>
+        </w:rPr>
+        <w:t xml:space="preserve">.</w:t>
+      </w:r>
+      <w:r>
+        <w:rPr>
+          <w:rFonts w:ascii="Arial" w:hAnsi="Arial" w:eastAsia="Arial" w:cs="Arial"/>
+          <w:b w:val="0"/>
+          <w:bCs w:val="0"/>
+          <w:sz w:val="22"/>
+          <w:szCs w:val="22"/>
+          <w:lang w:val="es-AR"/>
+        </w:rPr>
+      </w:r>
+      <w:r>
+        <w:rPr>
+          <w:rFonts w:ascii="Arial" w:hAnsi="Arial" w:eastAsia="Arial" w:cs="Arial"/>
+          <w:b w:val="0"/>
+          <w:bCs w:val="0"/>
+          <w:sz w:val="22"/>
+          <w:szCs w:val="22"/>
+        </w:rPr>
+      </w:r>
     </w:p>
     <w:p>
       <w:pPr>

</xml_diff>